<commit_message>
Deploying to gh-pages from @ Morrison-Lab/sds@2002a2d970ac483d744dd72aceb8d6fbfc8c5d25 🚀
</commit_message>
<xml_diff>
--- a/correlation-regression-handout.docx
+++ b/correlation-regression-handout.docx
@@ -15,7 +15,7 @@
         <w:pStyle w:val="Date"/>
       </w:pPr>
       <w:r>
-        <w:t xml:space="preserve">Last modified: 2026-09-28 05:16:55 (PDT)</w:t>
+        <w:t xml:space="preserve">Last modified: 2026-09-28 15:11:30 (PDT)</w:t>
       </w:r>
     </w:p>
     <w:p>
@@ -3392,7 +3392,7 @@
     <w:bookmarkEnd w:id="25"/>
     <w:bookmarkEnd w:id="26"/>
     <w:bookmarkEnd w:id="27"/>
-    <w:bookmarkStart w:id="48" w:name="sec-simple-linear-regression"/>
+    <w:bookmarkStart w:id="53" w:name="sec-simple-linear-regression"/>
     <w:p>
       <w:pPr>
         <w:pStyle w:val="Heading2"/>
@@ -4031,7 +4031,7 @@
     </w:p>
     <w:bookmarkEnd w:id="28"/>
     <w:bookmarkEnd w:id="29"/>
-    <w:bookmarkStart w:id="36" w:name="sec-ols"/>
+    <w:bookmarkStart w:id="41" w:name="sec-ols"/>
     <w:p>
       <w:pPr>
         <w:pStyle w:val="Heading3"/>
@@ -9226,8 +9226,182 @@
         </m:oMath>
       </m:oMathPara>
     </w:p>
-    <w:bookmarkEnd w:id="36"/>
-    <w:bookmarkStart w:id="38" w:name="sec-slr-R"/>
+    <w:tbl>
+      <w:tblPr>
+        <w:tblStyle w:val="Table"/>
+        <w:tblLook w:firstRow="0" w:lastRow="0" w:firstColumn="0" w:lastColumn="0" w:noHBand="0" w:noVBand="0" w:val="0000"/>
+        <w:tblBorders>
+          <w:top w:val="single" w:sz="4" w:space="0" w:color="00A047"/>
+          <w:left w:val="single" w:sz="24" w:space="0" w:color="00A047"/>
+          <w:bottom w:val="single" w:sz="4" w:space="0" w:color="00A047"/>
+          <w:right w:val="single" w:sz="4" w:space="0" w:color="00A047"/>
+        </w:tblBorders>
+        <w:tblCellMar>
+          <w:left w:w="144" w:type="dxa"/>
+          <w:right w:w="144" w:type="dxa"/>
+        </w:tblCellMar>
+        <w:tblLook w:firstRow="0" w:lastRow="0" w:firstColumn="0" w:lastColumn="0" w:noHBand="0" w:noVBand="0" w:val="0000"/>
+      </w:tblPr>
+      <w:tr>
+        <w:trPr>
+          <w:cantSplit/>
+        </w:trPr>
+        <w:tc>
+          <w:tcPr>
+            <w:shd w:color="auto" w:fill="ccf1e3" w:val="clear"/>
+            <w:tcMar>
+              <w:top w:w="92" w:type="dxa"/>
+              <w:bottom w:w="92" w:type="dxa"/>
+            </w:tcMar>
+          </w:tcPr>
+          <w:p>
+            <w:pPr>
+              <w:pStyle w:val="FirstParagraph"/>
+            </w:pPr>
+            <w:pPr>
+              <w:spacing w:before="0" w:after="0"/>
+              <w:textAlignment w:val="center"/>
+            </w:pPr>
+            <w:r>
+              <w:drawing>
+                <wp:inline>
+                  <wp:extent cx="152400" cy="152400"/>
+                  <wp:effectExtent b="0" l="0" r="0" t="0"/>
+                  <wp:docPr descr="" title="" id="37" name="Picture"/>
+                  <a:graphic>
+                    <a:graphicData uri="http://schemas.openxmlformats.org/drawingml/2006/picture">
+                      <pic:pic>
+                        <pic:nvPicPr>
+                          <pic:cNvPr descr="/opt/quarto/share/formats/docx/tip.png" id="38" name="Picture"/>
+                          <pic:cNvPicPr>
+                            <a:picLocks noChangeArrowheads="1" noChangeAspect="1"/>
+                          </pic:cNvPicPr>
+                        </pic:nvPicPr>
+                        <pic:blipFill>
+                          <a:blip r:embed="rId36"/>
+                          <a:stretch>
+                            <a:fillRect/>
+                          </a:stretch>
+                        </pic:blipFill>
+                        <pic:spPr bwMode="auto">
+                          <a:xfrm>
+                            <a:off x="0" y="0"/>
+                            <a:ext cx="152400" cy="152400"/>
+                          </a:xfrm>
+                          <a:prstGeom prst="rect">
+                            <a:avLst/>
+                          </a:prstGeom>
+                          <a:noFill/>
+                          <a:ln w="9525">
+                            <a:noFill/>
+                            <a:headEnd/>
+                            <a:tailEnd/>
+                          </a:ln>
+                        </pic:spPr>
+                      </pic:pic>
+                    </a:graphicData>
+                  </a:graphic>
+                </wp:inline>
+              </w:drawing>
+            </w:r>
+            <w:r>
+              <w:t xml:space="preserve"> </w:t>
+            </w:r>
+            <w:r>
+              <w:t xml:space="preserve"> </w:t>
+            </w:r>
+            <w:r>
+              <w:t xml:space="preserve">Video lecture</w:t>
+            </w:r>
+          </w:p>
+        </w:tc>
+      </w:tr>
+      <w:tr>
+        <w:trPr>
+          <w:cantSplit/>
+        </w:trPr>
+        <w:tc>
+          <w:tcPr>
+            <w:tcMar>
+              <w:top w:w="108" w:type="dxa"/>
+              <w:bottom w:w="108" w:type="dxa"/>
+            </w:tcMar>
+          </w:tcPr>
+          <w:p>
+            <w:pPr>
+              <w:pStyle w:val="BodyText"/>
+            </w:pPr>
+            <w:pPr>
+              <w:spacing w:before="16" w:after="16"/>
+            </w:pPr>
+            <w:r>
+              <w:t xml:space="preserve">Hutchinson’s</w:t>
+            </w:r>
+            <w:r>
+              <w:t xml:space="preserve"> </w:t>
+            </w:r>
+            <w:hyperlink r:id="rId39">
+              <w:r>
+                <w:rPr>
+                  <w:rStyle w:val="Hyperlink"/>
+                </w:rPr>
+                <w:t xml:space="preserve">Linear Regression (pt1)</w:t>
+              </w:r>
+            </w:hyperlink>
+            <w:r>
+              <w:t xml:space="preserve"> </w:t>
+            </w:r>
+            <w:r>
+              <w:t xml:space="preserve">(17 min)</w:t>
+            </w:r>
+            <w:r>
+              <w:t xml:space="preserve"> </w:t>
+            </w:r>
+            <w:r>
+              <w:t xml:space="preserve">covers fitting a linear regression by least squares,</w:t>
+            </w:r>
+            <w:r>
+              <w:t xml:space="preserve"> </w:t>
+            </w:r>
+            <w:r>
+              <w:t xml:space="preserve">framed as machine learning</w:t>
+            </w:r>
+            <w:r>
+              <w:t xml:space="preserve"> </w:t>
+            </w:r>
+            <w:r>
+              <w:t xml:space="preserve">(Hutchinson, n.d.)</w:t>
+            </w:r>
+            <w:r>
+              <w:t xml:space="preserve">.</w:t>
+            </w:r>
+            <w:r>
+              <w:t xml:space="preserve"> </w:t>
+            </w:r>
+            <w:r>
+              <w:t xml:space="preserve">The login for the video site is posted</w:t>
+            </w:r>
+            <w:r>
+              <w:t xml:space="preserve"> </w:t>
+            </w:r>
+            <w:hyperlink r:id="rId40">
+              <w:r>
+                <w:rPr>
+                  <w:rStyle w:val="Hyperlink"/>
+                </w:rPr>
+                <w:t xml:space="preserve">on Canvas</w:t>
+              </w:r>
+            </w:hyperlink>
+            <w:r>
+              <w:t xml:space="preserve">.</w:t>
+            </w:r>
+          </w:p>
+          <w:p/>
+        </w:tc>
+      </w:tr>
+    </w:tbl>
+    <w:bookmarkEnd w:id="41"/>
+    <w:bookmarkStart w:id="43" w:name="sec-slr-R"/>
     <w:p>
       <w:pPr>
         <w:pStyle w:val="Heading3"/>
@@ -9236,7 +9410,7 @@
         <w:t xml:space="preserve">3.3 Fitting a simple linear regression in R</w:t>
       </w:r>
     </w:p>
-    <w:bookmarkStart w:id="37" w:name="exm-hers-slr"/>
+    <w:bookmarkStart w:id="42" w:name="exm-hers-slr"/>
     <w:p>
       <w:pPr>
         <w:pStyle w:val="FirstParagraph"/>
@@ -10172,9 +10346,9 @@
         <w:t xml:space="preserve">.</w:t>
       </w:r>
     </w:p>
-    <w:bookmarkEnd w:id="37"/>
-    <w:bookmarkEnd w:id="38"/>
-    <w:bookmarkStart w:id="45" w:name="sec-r-squared"/>
+    <w:bookmarkEnd w:id="42"/>
+    <w:bookmarkEnd w:id="43"/>
+    <w:bookmarkStart w:id="50" w:name="sec-r-squared"/>
     <w:p>
       <w:pPr>
         <w:pStyle w:val="Heading3"/>
@@ -10183,7 +10357,7 @@
         <w:t xml:space="preserve">3.4 The coefficient of determination</w:t>
       </w:r>
     </w:p>
-    <w:bookmarkStart w:id="39" w:name="def-tss"/>
+    <w:bookmarkStart w:id="44" w:name="def-tss"/>
     <w:p>
       <w:pPr>
         <w:pStyle w:val="FirstParagraph"/>
@@ -10393,8 +10567,8 @@
         </m:oMath>
       </m:oMathPara>
     </w:p>
-    <w:bookmarkEnd w:id="39"/>
-    <w:bookmarkStart w:id="40" w:name="exm-tss"/>
+    <w:bookmarkEnd w:id="44"/>
+    <w:bookmarkStart w:id="45" w:name="exm-tss"/>
     <w:p>
       <w:pPr>
         <w:pStyle w:val="FirstParagraph"/>
@@ -10738,8 +10912,8 @@
         </m:oMath>
       </m:oMathPara>
     </w:p>
-    <w:bookmarkEnd w:id="40"/>
-    <w:bookmarkStart w:id="41" w:name="def-r-squared"/>
+    <w:bookmarkEnd w:id="45"/>
+    <w:bookmarkStart w:id="46" w:name="def-r-squared"/>
     <w:p>
       <w:pPr>
         <w:pStyle w:val="FirstParagraph"/>
@@ -11107,7 +11281,7 @@
         <w:t xml:space="preserve">.</w:t>
       </w:r>
     </w:p>
-    <w:bookmarkEnd w:id="41"/>
+    <w:bookmarkEnd w:id="46"/>
     <w:p>
       <w:pPr>
         <w:pStyle w:val="BodyText"/>
@@ -11158,7 +11332,7 @@
         <w:t xml:space="preserve">.</w:t>
       </w:r>
     </w:p>
-    <w:bookmarkStart w:id="42" w:name="thm-r-squared-slr"/>
+    <w:bookmarkStart w:id="47" w:name="thm-r-squared-slr"/>
     <w:p>
       <w:pPr>
         <w:pStyle w:val="BodyText"/>
@@ -11440,7 +11614,7 @@
         <w:t xml:space="preserve">.</w:t>
       </w:r>
     </w:p>
-    <w:bookmarkEnd w:id="42"/>
+    <w:bookmarkEnd w:id="47"/>
     <w:p>
       <w:pPr>
         <w:pStyle w:val="BodyText"/>
@@ -13256,7 +13430,7 @@
       <w:r>
         <w:t xml:space="preserve">(</w:t>
       </w:r>
-      <w:hyperlink r:id="rId43">
+      <w:hyperlink r:id="rId48">
         <w:r>
           <w:rPr>
             <w:rStyle w:val="Hyperlink"/>
@@ -13306,7 +13480,7 @@
         <w:t xml:space="preserve">.</w:t>
       </w:r>
     </w:p>
-    <w:bookmarkStart w:id="44" w:name="exm-hers-r-squared"/>
+    <w:bookmarkStart w:id="49" w:name="exm-hers-r-squared"/>
     <w:p>
       <w:pPr>
         <w:pStyle w:val="BodyText"/>
@@ -13861,9 +14035,9 @@
         <w:t xml:space="preserve">variation in baseline fasting glucose.</w:t>
       </w:r>
     </w:p>
-    <w:bookmarkEnd w:id="44"/>
-    <w:bookmarkEnd w:id="45"/>
-    <w:bookmarkStart w:id="47" w:name="further-reading"/>
+    <w:bookmarkEnd w:id="49"/>
+    <w:bookmarkEnd w:id="50"/>
+    <w:bookmarkStart w:id="52" w:name="further-reading"/>
     <w:p>
       <w:pPr>
         <w:pStyle w:val="Heading3"/>
@@ -13876,7 +14050,7 @@
       <w:pPr>
         <w:pStyle w:val="FirstParagraph"/>
       </w:pPr>
-      <w:hyperlink r:id="rId46">
+      <w:hyperlink r:id="rId51">
         <w:r>
           <w:rPr>
             <w:rStyle w:val="Hyperlink"/>
@@ -13909,9 +14083,9 @@
         <w:t xml:space="preserve">cover linear regression in Chapter 4.</w:t>
       </w:r>
     </w:p>
-    <w:bookmarkEnd w:id="47"/>
-    <w:bookmarkEnd w:id="48"/>
-    <w:bookmarkStart w:id="53" w:name="references"/>
+    <w:bookmarkEnd w:id="52"/>
+    <w:bookmarkEnd w:id="53"/>
+    <w:bookmarkStart w:id="60" w:name="references"/>
     <w:p>
       <w:pPr>
         <w:pStyle w:val="Heading2"/>
@@ -13920,8 +14094,8 @@
         <w:t xml:space="preserve">References</w:t>
       </w:r>
     </w:p>
-    <w:bookmarkStart w:id="52" w:name="refs"/>
-    <w:bookmarkStart w:id="49" w:name="ref-hoggtanis2015"/>
+    <w:bookmarkStart w:id="59" w:name="refs"/>
+    <w:bookmarkStart w:id="54" w:name="ref-hoggtanis2015"/>
     <w:p>
       <w:pPr>
         <w:pStyle w:val="Bibliography"/>
@@ -13943,14 +14117,14 @@
         <w:t xml:space="preserve">. Tenth edition. Pearson.</w:t>
       </w:r>
     </w:p>
-    <w:bookmarkEnd w:id="49"/>
-    <w:bookmarkStart w:id="51" w:name="ref-vittinghoff2e"/>
+    <w:bookmarkEnd w:id="54"/>
+    <w:bookmarkStart w:id="56" w:name="ref-hutchinson_wwu_ml_videos"/>
     <w:p>
       <w:pPr>
         <w:pStyle w:val="Bibliography"/>
       </w:pPr>
       <w:r>
-        <w:t xml:space="preserve">Vittinghoff, Eric, David V Glidden, Stephen C Shiboski, and Charles E McCulloch. 2012.</w:t>
+        <w:t xml:space="preserve">Hutchinson, Brian. n.d.</w:t>
       </w:r>
       <w:r>
         <w:t xml:space="preserve"> </w:t>
@@ -13960,6 +14134,85 @@
           <w:i/>
           <w:iCs/>
         </w:rPr>
+        <w:t xml:space="preserve">DATA</w:t>
+      </w:r>
+      <w:r>
+        <w:rPr>
+          <w:i/>
+          <w:iCs/>
+        </w:rPr>
+        <w:t xml:space="preserve"> </w:t>
+      </w:r>
+      <w:r>
+        <w:rPr>
+          <w:i/>
+          <w:iCs/>
+        </w:rPr>
+        <w:t xml:space="preserve">471/571 (Machine Learning) and</w:t>
+      </w:r>
+      <w:r>
+        <w:rPr>
+          <w:i/>
+          <w:iCs/>
+        </w:rPr>
+        <w:t xml:space="preserve"> </w:t>
+      </w:r>
+      <w:r>
+        <w:rPr>
+          <w:i/>
+          <w:iCs/>
+        </w:rPr>
+        <w:t xml:space="preserve">CSCI</w:t>
+      </w:r>
+      <w:r>
+        <w:rPr>
+          <w:i/>
+          <w:iCs/>
+        </w:rPr>
+        <w:t xml:space="preserve"> </w:t>
+      </w:r>
+      <w:r>
+        <w:rPr>
+          <w:i/>
+          <w:iCs/>
+        </w:rPr>
+        <w:t xml:space="preserve">481/581 (Deep Learning) Video Lectures</w:t>
+      </w:r>
+      <w:r>
+        <w:t xml:space="preserve">. Western Washington University. Accessed September 28, 2026.</w:t>
+      </w:r>
+      <w:r>
+        <w:t xml:space="preserve"> </w:t>
+      </w:r>
+      <w:hyperlink r:id="rId55">
+        <w:r>
+          <w:rPr>
+            <w:rStyle w:val="Hyperlink"/>
+          </w:rPr>
+          <w:t xml:space="preserve">https://facultyweb.cs.wwu.edu/~hutchib2/video_lectures/data371/</w:t>
+        </w:r>
+      </w:hyperlink>
+      <w:r>
+        <w:t xml:space="preserve">.</w:t>
+      </w:r>
+    </w:p>
+    <w:bookmarkEnd w:id="56"/>
+    <w:bookmarkStart w:id="58" w:name="ref-vittinghoff2e"/>
+    <w:p>
+      <w:pPr>
+        <w:pStyle w:val="Bibliography"/>
+      </w:pPr>
+      <w:r>
+        <w:t xml:space="preserve">Vittinghoff, Eric, David V Glidden, Stephen C Shiboski, and Charles E McCulloch. 2012.</w:t>
+      </w:r>
+      <w:r>
+        <w:t xml:space="preserve"> </w:t>
+      </w:r>
+      <w:r>
+        <w:rPr>
+          <w:i/>
+          <w:iCs/>
+        </w:rPr>
         <w:t xml:space="preserve">Regression Methods in Biostatistics: Linear, Logistic, Survival, and Repeated Measures Models</w:t>
       </w:r>
       <w:r>
@@ -13968,7 +14221,7 @@
       <w:r>
         <w:t xml:space="preserve"> </w:t>
       </w:r>
-      <w:hyperlink r:id="rId50">
+      <w:hyperlink r:id="rId57">
         <w:r>
           <w:rPr>
             <w:rStyle w:val="Hyperlink"/>
@@ -13980,9 +14233,9 @@
         <w:t xml:space="preserve">.</w:t>
       </w:r>
     </w:p>
-    <w:bookmarkEnd w:id="51"/>
-    <w:bookmarkEnd w:id="52"/>
-    <w:bookmarkEnd w:id="53"/>
+    <w:bookmarkEnd w:id="58"/>
+    <w:bookmarkEnd w:id="59"/>
+    <w:bookmarkEnd w:id="60"/>
     <w:sectPr>
       <w:footnotePr>
         <w:numRestart w:val="eachSect"/>

</xml_diff>

<commit_message>
Deploying to gh-pages from @ Morrison-Lab/sds@eb27fae5022a6047d2f15caf4f8b9ee68d7dcf24 🚀
</commit_message>
<xml_diff>
--- a/correlation-regression-handout.docx
+++ b/correlation-regression-handout.docx
@@ -15,7 +15,7 @@
         <w:pStyle w:val="Date"/>
       </w:pPr>
       <w:r>
-        <w:t xml:space="preserve">Last modified: 2026-10-14 22:39:48 (PDT)</w:t>
+        <w:t xml:space="preserve">Last modified: 2026-10-14 23:57:22 (PDT)</w:t>
       </w:r>
     </w:p>
     <w:p>
@@ -15049,7 +15049,7 @@
               <m:sSubSup>
                 <m:e>
                   <m:r>
-                    <m:t>e</m:t>
+                    <m:t>ε</m:t>
                   </m:r>
                 </m:e>
                 <m:sub>
@@ -15800,7 +15800,7 @@
                   <m:sSubSup>
                     <m:e>
                       <m:r>
-                        <m:t>e</m:t>
+                        <m:t>ε</m:t>
                       </m:r>
                     </m:e>
                     <m:sub>
@@ -15943,7 +15943,7 @@
               <m:sSubSup>
                 <m:e>
                   <m:r>
-                    <m:t>e</m:t>
+                    <m:t>ε</m:t>
                   </m:r>
                 </m:e>
                 <m:sub>

</xml_diff>

<commit_message>
Deploying to gh-pages from @ Morrison-Lab/sds@3aaa38f0f24fed04ed2f00dc559980dfac4c036f 🚀
</commit_message>
<xml_diff>
--- a/correlation-regression-handout.docx
+++ b/correlation-regression-handout.docx
@@ -15,7 +15,7 @@
         <w:pStyle w:val="Date"/>
       </w:pPr>
       <w:r>
-        <w:t xml:space="preserve">Last modified: 2026-10-22 22:33:09 (PDT)</w:t>
+        <w:t xml:space="preserve">Last modified: 2026-10-23 00:09:24 (PDT)</w:t>
       </w:r>
     </w:p>
     <w:p>
@@ -17495,7 +17495,7 @@
                   <m:nor/>
                   <m:sty m:val="p"/>
                 </m:rPr>
-                <m:t>(split the sum)</m:t>
+                <m:t>(distribute the sum over the terms)</m:t>
               </m:r>
             </m:e>
             <m:e>
@@ -18779,7 +18779,7 @@
                   <m:nor/>
                   <m:sty m:val="p"/>
                 </m:rPr>
-                <m:t>(split the sum)</m:t>
+                <m:t>(distribute the sum over the terms)</m:t>
               </m:r>
             </m:e>
             <m:e>
@@ -21816,7 +21816,7 @@
                   <m:nor/>
                   <m:sty m:val="p"/>
                 </m:rPr>
-                <m:t>(split the sum)</m:t>
+                <m:t>(distribute the sum over the terms)</m:t>
               </m:r>
             </m:e>
             <m:e>
@@ -27529,7 +27529,7 @@
                   <m:nor/>
                   <m:sty m:val="p"/>
                 </m:rPr>
-                <m:t>(split the sum)</m:t>
+                <m:t>(distribute the sum over the terms)</m:t>
               </m:r>
             </m:e>
             <m:e>
@@ -29128,7 +29128,7 @@
                   <m:nor/>
                   <m:sty m:val="p"/>
                 </m:rPr>
-                <m:t>(split the sum)</m:t>
+                <m:t>(distribute the sum over the terms)</m:t>
               </m:r>
             </m:e>
             <m:e>

</xml_diff>

<commit_message>
Deploying to gh-pages from @ Morrison-Lab/sds@ba2f54015e7d8a480ef20be0cc97a110b7ea117e 🚀
</commit_message>
<xml_diff>
--- a/correlation-regression-handout.docx
+++ b/correlation-regression-handout.docx
@@ -15,7 +15,7 @@
         <w:pStyle w:val="Date"/>
       </w:pPr>
       <w:r>
-        <w:t xml:space="preserve">Last modified: 2026-10-26 23:56:39 (PDT)</w:t>
+        <w:t xml:space="preserve">Last modified: 2026-10-27 10:45:41 (PDT)</w:t>
       </w:r>
     </w:p>
     <w:p>
@@ -4515,7 +4515,11 @@
         <m:sSub>
           <m:e>
             <m:r>
-              <m:t>δ</m:t>
+              <m:rPr>
+                <m:scr m:val="double-struck"/>
+                <m:sty m:val="p"/>
+              </m:rPr>
+              <m:t>d</m:t>
             </m:r>
           </m:e>
           <m:sub>
@@ -4625,7 +4629,11 @@
           <m:sSub>
             <m:e>
               <m:r>
-                <m:t>δ</m:t>
+                <m:rPr>
+                  <m:scr m:val="double-struck"/>
+                  <m:sty m:val="p"/>
+                </m:rPr>
+                <m:t>d</m:t>
               </m:r>
             </m:e>
             <m:sub>
@@ -4796,7 +4804,11 @@
         <m:sSub>
           <m:e>
             <m:r>
-              <m:t>δ</m:t>
+              <m:rPr>
+                <m:scr m:val="double-struck"/>
+                <m:sty m:val="p"/>
+              </m:rPr>
+              <m:t>d</m:t>
             </m:r>
           </m:e>
           <m:sub>
@@ -4886,7 +4898,11 @@
         <m:sSub>
           <m:e>
             <m:r>
-              <m:t>δ</m:t>
+              <m:rPr>
+                <m:scr m:val="double-struck"/>
+                <m:sty m:val="p"/>
+              </m:rPr>
+              <m:t>d</m:t>
             </m:r>
           </m:e>
           <m:sub>
@@ -4932,7 +4948,11 @@
               <m:sSub>
                 <m:e>
                   <m:r>
-                    <m:t>δ</m:t>
+                    <m:rPr>
+                      <m:scr m:val="double-struck"/>
+                      <m:sty m:val="p"/>
+                    </m:rPr>
+                    <m:t>d</m:t>
                   </m:r>
                 </m:e>
                 <m:sub>
@@ -4986,7 +5006,11 @@
               <m:sSub>
                 <m:e>
                   <m:r>
-                    <m:t>δ</m:t>
+                    <m:rPr>
+                      <m:scr m:val="double-struck"/>
+                      <m:sty m:val="p"/>
+                    </m:rPr>
+                    <m:t>d</m:t>
                   </m:r>
                 </m:e>
                 <m:sub>
@@ -5148,7 +5172,11 @@
               <m:sSub>
                 <m:e>
                   <m:r>
-                    <m:t>δ</m:t>
+                    <m:rPr>
+                      <m:scr m:val="double-struck"/>
+                      <m:sty m:val="p"/>
+                    </m:rPr>
+                    <m:t>d</m:t>
                   </m:r>
                 </m:e>
                 <m:sub>
@@ -5678,7 +5706,11 @@
         <m:sSub>
           <m:e>
             <m:r>
-              <m:t>δ</m:t>
+              <m:rPr>
+                <m:scr m:val="double-struck"/>
+                <m:sty m:val="p"/>
+              </m:rPr>
+              <m:t>d</m:t>
             </m:r>
           </m:e>
           <m:sub>
@@ -5706,7 +5738,11 @@
         <m:sSub>
           <m:e>
             <m:r>
-              <m:t>δ</m:t>
+              <m:rPr>
+                <m:scr m:val="double-struck"/>
+                <m:sty m:val="p"/>
+              </m:rPr>
+              <m:t>d</m:t>
             </m:r>
           </m:e>
           <m:sub>
@@ -5757,7 +5793,11 @@
               <m:sSub>
                 <m:e>
                   <m:r>
-                    <m:t>δ</m:t>
+                    <m:rPr>
+                      <m:scr m:val="double-struck"/>
+                      <m:sty m:val="p"/>
+                    </m:rPr>
+                    <m:t>d</m:t>
                   </m:r>
                 </m:e>
                 <m:sub>
@@ -5836,7 +5876,11 @@
               <m:sSub>
                 <m:e>
                   <m:r>
-                    <m:t>δ</m:t>
+                    <m:rPr>
+                      <m:scr m:val="double-struck"/>
+                      <m:sty m:val="p"/>
+                    </m:rPr>
+                    <m:t>d</m:t>
                   </m:r>
                 </m:e>
                 <m:sub>
@@ -5857,7 +5901,11 @@
               <m:sSub>
                 <m:e>
                   <m:r>
-                    <m:t>δ</m:t>
+                    <m:rPr>
+                      <m:scr m:val="double-struck"/>
+                      <m:sty m:val="p"/>
+                    </m:rPr>
+                    <m:t>d</m:t>
                   </m:r>
                 </m:e>
                 <m:sub>
@@ -6038,7 +6086,11 @@
               <m:sSub>
                 <m:e>
                   <m:r>
-                    <m:t>δ</m:t>
+                    <m:rPr>
+                      <m:scr m:val="double-struck"/>
+                      <m:sty m:val="p"/>
+                    </m:rPr>
+                    <m:t>d</m:t>
                   </m:r>
                 </m:e>
                 <m:sub>
@@ -6207,7 +6259,11 @@
               <m:sSub>
                 <m:e>
                   <m:r>
-                    <m:t>δ</m:t>
+                    <m:rPr>
+                      <m:scr m:val="double-struck"/>
+                      <m:sty m:val="p"/>
+                    </m:rPr>
+                    <m:t>d</m:t>
                   </m:r>
                 </m:e>
                 <m:sub>
@@ -6376,7 +6432,11 @@
               <m:sSub>
                 <m:e>
                   <m:r>
-                    <m:t>δ</m:t>
+                    <m:rPr>
+                      <m:scr m:val="double-struck"/>
+                      <m:sty m:val="p"/>
+                    </m:rPr>
+                    <m:t>d</m:t>
                   </m:r>
                 </m:e>
                 <m:sub>
@@ -6500,7 +6560,11 @@
               <m:sSub>
                 <m:e>
                   <m:r>
-                    <m:t>δ</m:t>
+                    <m:rPr>
+                      <m:scr m:val="double-struck"/>
+                      <m:sty m:val="p"/>
+                    </m:rPr>
+                    <m:t>d</m:t>
                   </m:r>
                 </m:e>
                 <m:sub>
@@ -6630,7 +6694,11 @@
               <m:sSub>
                 <m:e>
                   <m:r>
-                    <m:t>δ</m:t>
+                    <m:rPr>
+                      <m:scr m:val="double-struck"/>
+                      <m:sty m:val="p"/>
+                    </m:rPr>
+                    <m:t>d</m:t>
                   </m:r>
                 </m:e>
                 <m:sub>
@@ -6744,7 +6812,11 @@
               <m:sSub>
                 <m:e>
                   <m:r>
-                    <m:t>δ</m:t>
+                    <m:rPr>
+                      <m:scr m:val="double-struck"/>
+                      <m:sty m:val="p"/>
+                    </m:rPr>
+                    <m:t>d</m:t>
                   </m:r>
                 </m:e>
                 <m:sub>
@@ -6810,7 +6882,11 @@
               <m:sSub>
                 <m:e>
                   <m:r>
-                    <m:t>δ</m:t>
+                    <m:rPr>
+                      <m:scr m:val="double-struck"/>
+                      <m:sty m:val="p"/>
+                    </m:rPr>
+                    <m:t>d</m:t>
                   </m:r>
                 </m:e>
                 <m:sub>
@@ -6952,7 +7028,11 @@
           <m:sSub>
             <m:e>
               <m:r>
-                <m:t>δ</m:t>
+                <m:rPr>
+                  <m:scr m:val="double-struck"/>
+                  <m:sty m:val="p"/>
+                </m:rPr>
+                <m:t>d</m:t>
               </m:r>
             </m:e>
             <m:sub>
@@ -7154,7 +7234,11 @@
           </m:e>
           <m:sub>
             <m:r>
-              <m:t>δ</m:t>
+              <m:rPr>
+                <m:scr m:val="double-struck"/>
+                <m:sty m:val="p"/>
+              </m:rPr>
+              <m:t>d</m:t>
             </m:r>
           </m:sub>
         </m:sSub>
@@ -7177,7 +7261,11 @@
           </m:e>
           <m:sub>
             <m:r>
-              <m:t>δ</m:t>
+              <m:rPr>
+                <m:scr m:val="double-struck"/>
+                <m:sty m:val="p"/>
+              </m:rPr>
+              <m:t>d</m:t>
             </m:r>
           </m:sub>
         </m:sSub>
@@ -7195,7 +7283,11 @@
         <m:sSub>
           <m:e>
             <m:r>
-              <m:t>δ</m:t>
+              <m:rPr>
+                <m:scr m:val="double-struck"/>
+                <m:sty m:val="p"/>
+              </m:rPr>
+              <m:t>d</m:t>
             </m:r>
           </m:e>
           <m:sub>
@@ -7295,7 +7387,11 @@
         <m:sSub>
           <m:e>
             <m:r>
-              <m:t>δ</m:t>
+              <m:rPr>
+                <m:scr m:val="double-struck"/>
+                <m:sty m:val="p"/>
+              </m:rPr>
+              <m:t>d</m:t>
             </m:r>
           </m:e>
           <m:sub>
@@ -7328,7 +7424,11 @@
                 </m:e>
                 <m:sub>
                   <m:r>
-                    <m:t>δ</m:t>
+                    <m:rPr>
+                      <m:scr m:val="double-struck"/>
+                      <m:sty m:val="p"/>
+                    </m:rPr>
+                    <m:t>d</m:t>
                   </m:r>
                 </m:sub>
               </m:sSub>
@@ -7376,7 +7476,11 @@
                   <m:sSub>
                     <m:e>
                       <m:r>
-                        <m:t>δ</m:t>
+                        <m:rPr>
+                          <m:scr m:val="double-struck"/>
+                          <m:sty m:val="p"/>
+                        </m:rPr>
+                        <m:t>d</m:t>
                       </m:r>
                     </m:e>
                     <m:sub>
@@ -7515,7 +7619,11 @@
               <m:sSub>
                 <m:e>
                   <m:r>
-                    <m:t>δ</m:t>
+                    <m:rPr>
+                      <m:scr m:val="double-struck"/>
+                      <m:sty m:val="p"/>
+                    </m:rPr>
+                    <m:t>d</m:t>
                   </m:r>
                 </m:e>
                 <m:sub>
@@ -7840,7 +7948,11 @@
                 </m:e>
                 <m:sub>
                   <m:r>
-                    <m:t>δ</m:t>
+                    <m:rPr>
+                      <m:scr m:val="double-struck"/>
+                      <m:sty m:val="p"/>
+                    </m:rPr>
+                    <m:t>d</m:t>
                   </m:r>
                 </m:sub>
               </m:sSub>
@@ -7900,7 +8012,11 @@
                 </m:e>
                 <m:sub>
                   <m:r>
-                    <m:t>δ</m:t>
+                    <m:rPr>
+                      <m:scr m:val="double-struck"/>
+                      <m:sty m:val="p"/>
+                    </m:rPr>
+                    <m:t>d</m:t>
                   </m:r>
                 </m:sub>
               </m:sSub>
@@ -8028,7 +8144,11 @@
               <m:sSub>
                 <m:e>
                   <m:r>
-                    <m:t>δ</m:t>
+                    <m:rPr>
+                      <m:scr m:val="double-struck"/>
+                      <m:sty m:val="p"/>
+                    </m:rPr>
+                    <m:t>d</m:t>
                   </m:r>
                 </m:e>
                 <m:sub>
@@ -8604,7 +8724,11 @@
                 </m:e>
                 <m:sub>
                   <m:r>
-                    <m:t>δ</m:t>
+                    <m:rPr>
+                      <m:scr m:val="double-struck"/>
+                      <m:sty m:val="p"/>
+                    </m:rPr>
+                    <m:t>d</m:t>
                   </m:r>
                 </m:sub>
               </m:sSub>
@@ -9176,7 +9300,11 @@
         <m:sSub>
           <m:e>
             <m:r>
-              <m:t>δ</m:t>
+              <m:rPr>
+                <m:scr m:val="double-struck"/>
+                <m:sty m:val="p"/>
+              </m:rPr>
+              <m:t>d</m:t>
             </m:r>
           </m:e>
           <m:sub>
@@ -9294,7 +9422,11 @@
         <m:sSub>
           <m:e>
             <m:r>
-              <m:t>δ</m:t>
+              <m:rPr>
+                <m:scr m:val="double-struck"/>
+                <m:sty m:val="p"/>
+              </m:rPr>
+              <m:t>d</m:t>
             </m:r>
           </m:e>
           <m:sub>
@@ -9324,7 +9456,11 @@
         <m:sSub>
           <m:e>
             <m:r>
-              <m:t>δ</m:t>
+              <m:rPr>
+                <m:scr m:val="double-struck"/>
+                <m:sty m:val="p"/>
+              </m:rPr>
+              <m:t>d</m:t>
             </m:r>
           </m:e>
           <m:sub>
@@ -9423,7 +9559,11 @@
                   <m:sSub>
                     <m:e>
                       <m:r>
-                        <m:t>δ</m:t>
+                        <m:rPr>
+                          <m:scr m:val="double-struck"/>
+                          <m:sty m:val="p"/>
+                        </m:rPr>
+                        <m:t>d</m:t>
                       </m:r>
                     </m:e>
                     <m:sub>
@@ -9471,7 +9611,11 @@
                   <m:sSub>
                     <m:e>
                       <m:r>
-                        <m:t>δ</m:t>
+                        <m:rPr>
+                          <m:scr m:val="double-struck"/>
+                          <m:sty m:val="p"/>
+                        </m:rPr>
+                        <m:t>d</m:t>
                       </m:r>
                     </m:e>
                     <m:sub>
@@ -9880,7 +10024,11 @@
                       <m:sSub>
                         <m:e>
                           <m:r>
-                            <m:t>δ</m:t>
+                            <m:rPr>
+                              <m:scr m:val="double-struck"/>
+                              <m:sty m:val="p"/>
+                            </m:rPr>
+                            <m:t>d</m:t>
                           </m:r>
                         </m:e>
                         <m:sub>
@@ -9971,7 +10119,11 @@
         <m:sSub>
           <m:e>
             <m:r>
-              <m:t>δ</m:t>
+              <m:rPr>
+                <m:scr m:val="double-struck"/>
+                <m:sty m:val="p"/>
+              </m:rPr>
+              <m:t>d</m:t>
             </m:r>
           </m:e>
           <m:sub>
@@ -10001,7 +10153,11 @@
         <m:sSub>
           <m:e>
             <m:r>
-              <m:t>δ</m:t>
+              <m:rPr>
+                <m:scr m:val="double-struck"/>
+                <m:sty m:val="p"/>
+              </m:rPr>
+              <m:t>d</m:t>
             </m:r>
           </m:e>
           <m:sub>
@@ -10042,7 +10198,11 @@
         <m:sSub>
           <m:e>
             <m:r>
-              <m:t>δ</m:t>
+              <m:rPr>
+                <m:scr m:val="double-struck"/>
+                <m:sty m:val="p"/>
+              </m:rPr>
+              <m:t>d</m:t>
             </m:r>
           </m:e>
           <m:sub>
@@ -10276,7 +10436,11 @@
           <m:sSub>
             <m:e>
               <m:r>
-                <m:t>δ</m:t>
+                <m:rPr>
+                  <m:scr m:val="double-struck"/>
+                  <m:sty m:val="p"/>
+                </m:rPr>
+                <m:t>d</m:t>
               </m:r>
             </m:e>
             <m:sub>
@@ -10693,7 +10857,11 @@
           <m:sSub>
             <m:e>
               <m:r>
-                <m:t>δ</m:t>
+                <m:rPr>
+                  <m:scr m:val="double-struck"/>
+                  <m:sty m:val="p"/>
+                </m:rPr>
+                <m:t>d</m:t>
               </m:r>
             </m:e>
             <m:sub>
@@ -10868,7 +11036,11 @@
         <m:sSub>
           <m:e>
             <m:r>
-              <m:t>δ</m:t>
+              <m:rPr>
+                <m:scr m:val="double-struck"/>
+                <m:sty m:val="p"/>
+              </m:rPr>
+              <m:t>d</m:t>
             </m:r>
           </m:e>
           <m:sub>

</xml_diff>

<commit_message>
Deploying to gh-pages from @ Morrison-Lab/sds@cefdc78cef27958c8c64481b6ea6a1732f784b70 🚀
</commit_message>
<xml_diff>
--- a/correlation-regression-handout.docx
+++ b/correlation-regression-handout.docx
@@ -15,7 +15,7 @@
         <w:pStyle w:val="Date"/>
       </w:pPr>
       <w:r>
-        <w:t xml:space="preserve">Last modified: 2026-10-27 11:13:53 (PDT)</w:t>
+        <w:t xml:space="preserve">Last modified: 2026-10-27 16:11:29 (PDT)</w:t>
       </w:r>
     </w:p>
     <w:p>
@@ -3944,7 +3944,7 @@
     <w:bookmarkEnd w:id="29"/>
     <w:bookmarkEnd w:id="30"/>
     <w:bookmarkEnd w:id="31"/>
-    <w:bookmarkStart w:id="161" w:name="sec-simple-linear-regression"/>
+    <w:bookmarkStart w:id="169" w:name="sec-simple-linear-regression"/>
     <w:p>
       <w:pPr>
         <w:pStyle w:val="Heading2"/>
@@ -12175,7 +12175,7 @@
     </w:p>
     <w:bookmarkEnd w:id="49"/>
     <w:bookmarkEnd w:id="50"/>
-    <w:bookmarkStart w:id="122" w:name="sec-ols"/>
+    <w:bookmarkStart w:id="130" w:name="sec-ols"/>
     <w:p>
       <w:pPr>
         <w:pStyle w:val="Heading3"/>
@@ -20007,7 +20007,7 @@
         <w:t xml:space="preserve">.</w:t>
       </w:r>
     </w:p>
-    <w:bookmarkStart w:id="81" w:name="exr-rss-deriv-intercept"/>
+    <w:bookmarkStart w:id="83" w:name="exr-rss-deriv-intercept"/>
     <w:p>
       <w:pPr>
         <w:pStyle w:val="BodyText"/>
@@ -20023,8 +20023,19 @@
         <w:t xml:space="preserve"> </w:t>
       </w:r>
       <w:r>
-        <w:t xml:space="preserve">Find the partial derivative of the simple linear regression</w:t>
-      </w:r>
+        <w:t xml:space="preserve">Find the partial derivative of the</w:t>
+      </w:r>
+      <w:r>
+        <w:t xml:space="preserve"> </w:t>
+      </w:r>
+      <w:hyperlink r:id="rId81">
+        <w:r>
+          <w:rPr>
+            <w:rStyle w:val="Hyperlink"/>
+          </w:rPr>
+          <w:t xml:space="preserve">simple linear regression</w:t>
+        </w:r>
+      </w:hyperlink>
       <w:r>
         <w:t xml:space="preserve"> </w:t>
       </w:r>
@@ -20106,7 +20117,21 @@
         <w:t xml:space="preserve"> </w:t>
       </w:r>
       <w:r>
-        <w:t xml:space="preserve">with respect to the intercept,</w:t>
+        <w:t xml:space="preserve">with respect to the</w:t>
+      </w:r>
+      <w:r>
+        <w:t xml:space="preserve"> </w:t>
+      </w:r>
+      <w:hyperlink r:id="rId82">
+        <w:r>
+          <w:rPr>
+            <w:rStyle w:val="Hyperlink"/>
+          </w:rPr>
+          <w:t xml:space="preserve">intercept</w:t>
+        </w:r>
+      </w:hyperlink>
+      <w:r>
+        <w:t xml:space="preserve">,</w:t>
       </w:r>
       <w:r>
         <w:t xml:space="preserve"> </w:t>
@@ -20151,56 +20176,11 @@
         </m:sSub>
       </m:oMath>
       <w:r>
-        <w:t xml:space="preserve">,</w:t>
-      </w:r>
-      <w:r>
-        <w:t xml:space="preserve"> </w:t>
-      </w:r>
-      <w:r>
-        <w:t xml:space="preserve">and write it in terms of</w:t>
-      </w:r>
-      <w:r>
-        <w:t xml:space="preserve"> </w:t>
-      </w:r>
-      <m:oMath>
-        <m:acc>
-          <m:accPr>
-            <m:chr m:val="‾"/>
-          </m:accPr>
-          <m:e>
-            <m:r>
-              <m:t>x</m:t>
-            </m:r>
-          </m:e>
-        </m:acc>
-      </m:oMath>
-      <w:r>
-        <w:t xml:space="preserve"> </w:t>
-      </w:r>
-      <w:r>
-        <w:t xml:space="preserve">and</w:t>
-      </w:r>
-      <w:r>
-        <w:t xml:space="preserve"> </w:t>
-      </w:r>
-      <m:oMath>
-        <m:acc>
-          <m:accPr>
-            <m:chr m:val="‾"/>
-          </m:accPr>
-          <m:e>
-            <m:r>
-              <m:t>y</m:t>
-            </m:r>
-          </m:e>
-        </m:acc>
-      </m:oMath>
-      <w:r>
         <w:t xml:space="preserve">.</w:t>
       </w:r>
     </w:p>
-    <w:bookmarkEnd w:id="81"/>
-    <w:bookmarkStart w:id="82" w:name="sol-rss-deriv-intercept"/>
+    <w:bookmarkEnd w:id="83"/>
+    <w:bookmarkStart w:id="84" w:name="sol-rss-deriv-intercept"/>
     <w:p>
       <w:pPr>
         <w:pStyle w:val="BodyText"/>
@@ -21841,6 +21821,343 @@
                   <m:sty m:val="p"/>
                 </m:rPr>
                 <m:t>(constant factor out of the sum)</m:t>
+              </m:r>
+            </m:e>
+          </m:eqArr>
+        </m:oMath>
+      </m:oMathPara>
+    </w:p>
+    <w:bookmarkEnd w:id="84"/>
+    <w:bookmarkStart w:id="85" w:name="exr-rss-deriv-intercept-in-means"/>
+    <w:p>
+      <w:pPr>
+        <w:pStyle w:val="FirstParagraph"/>
+      </w:pPr>
+      <w:r>
+        <w:rPr>
+          <w:b/>
+          <w:bCs/>
+        </w:rPr>
+        <w:t xml:space="preserve">Exercise 7 (Derivative of RSS in terms of the means)</w:t>
+      </w:r>
+      <w:r>
+        <w:t xml:space="preserve"> </w:t>
+      </w:r>
+      <w:r>
+        <w:t xml:space="preserve">In the setting of</w:t>
+      </w:r>
+      <w:r>
+        <w:t xml:space="preserve"> </w:t>
+      </w:r>
+      <w:hyperlink w:anchor="exr-rss-deriv-intercept">
+        <w:r>
+          <w:rPr>
+            <w:rStyle w:val="Hyperlink"/>
+          </w:rPr>
+          <w:t xml:space="preserve">Exercise 6</w:t>
+        </w:r>
+      </w:hyperlink>
+      <w:r>
+        <w:t xml:space="preserve">, write the partial derivative in terms of</w:t>
+      </w:r>
+      <w:r>
+        <w:t xml:space="preserve"> </w:t>
+      </w:r>
+      <m:oMath>
+        <m:acc>
+          <m:accPr>
+            <m:chr m:val="‾"/>
+          </m:accPr>
+          <m:e>
+            <m:r>
+              <m:t>x</m:t>
+            </m:r>
+          </m:e>
+        </m:acc>
+      </m:oMath>
+      <w:r>
+        <w:t xml:space="preserve"> </w:t>
+      </w:r>
+      <w:r>
+        <w:t xml:space="preserve">and</w:t>
+      </w:r>
+      <w:r>
+        <w:t xml:space="preserve"> </w:t>
+      </w:r>
+      <m:oMath>
+        <m:acc>
+          <m:accPr>
+            <m:chr m:val="‾"/>
+          </m:accPr>
+          <m:e>
+            <m:r>
+              <m:t>y</m:t>
+            </m:r>
+          </m:e>
+        </m:acc>
+      </m:oMath>
+      <w:r>
+        <w:t xml:space="preserve">.</w:t>
+      </w:r>
+    </w:p>
+    <w:bookmarkEnd w:id="85"/>
+    <w:bookmarkStart w:id="86" w:name="sol-rss-deriv-intercept-in-means"/>
+    <w:p>
+      <w:pPr>
+        <w:pStyle w:val="BodyText"/>
+      </w:pPr>
+      <w:r>
+        <w:rPr>
+          <w:i/>
+          <w:iCs/>
+        </w:rPr>
+        <w:t xml:space="preserve">Solution 7</w:t>
+      </w:r>
+      <w:r>
+        <w:t xml:space="preserve">. </w:t>
+      </w:r>
+      <w:r>
+        <w:t xml:space="preserve">Write the derivative from</w:t>
+      </w:r>
+      <w:r>
+        <w:t xml:space="preserve"> </w:t>
+      </w:r>
+      <w:hyperlink w:anchor="exr-rss-deriv-intercept">
+        <w:r>
+          <w:rPr>
+            <w:rStyle w:val="Hyperlink"/>
+          </w:rPr>
+          <w:t xml:space="preserve">Exercise 6</w:t>
+        </w:r>
+      </w:hyperlink>
+      <w:r>
+        <w:t xml:space="preserve"> </w:t>
+      </w:r>
+      <w:r>
+        <w:t xml:space="preserve">in terms of</w:t>
+      </w:r>
+      <w:r>
+        <w:t xml:space="preserve"> </w:t>
+      </w:r>
+      <m:oMath>
+        <m:acc>
+          <m:accPr>
+            <m:chr m:val="‾"/>
+          </m:accPr>
+          <m:e>
+            <m:r>
+              <m:t>x</m:t>
+            </m:r>
+          </m:e>
+        </m:acc>
+      </m:oMath>
+      <w:r>
+        <w:t xml:space="preserve"> </w:t>
+      </w:r>
+      <w:r>
+        <w:t xml:space="preserve">and</w:t>
+      </w:r>
+      <w:r>
+        <w:t xml:space="preserve"> </w:t>
+      </w:r>
+      <m:oMath>
+        <m:acc>
+          <m:accPr>
+            <m:chr m:val="‾"/>
+          </m:accPr>
+          <m:e>
+            <m:r>
+              <m:t>y</m:t>
+            </m:r>
+          </m:e>
+        </m:acc>
+      </m:oMath>
+      <w:r>
+        <w:t xml:space="preserve">:</w:t>
+      </w:r>
+    </w:p>
+    <w:p>
+      <w:pPr>
+        <w:pStyle w:val="BodyText"/>
+      </w:pPr>
+      <m:oMathPara>
+        <m:oMathParaPr>
+          <m:jc m:val="center"/>
+        </m:oMathParaPr>
+        <m:oMath>
+          <m:eqArr>
+            <m:e>
+              <m:f>
+                <m:fPr>
+                  <m:type m:val="bar"/>
+                </m:fPr>
+                <m:num>
+                  <m:r>
+                    <m:rPr>
+                      <m:sty m:val="p"/>
+                    </m:rPr>
+                    <m:t>∂</m:t>
+                  </m:r>
+                  <m:r>
+                    <m:rPr>
+                      <m:nor/>
+                      <m:sty m:val="p"/>
+                    </m:rPr>
+                    <m:t>RSS</m:t>
+                  </m:r>
+                </m:num>
+                <m:den>
+                  <m:r>
+                    <m:rPr>
+                      <m:sty m:val="p"/>
+                    </m:rPr>
+                    <m:t>∂</m:t>
+                  </m:r>
+                  <m:sSub>
+                    <m:e>
+                      <m:r>
+                        <m:t>β</m:t>
+                      </m:r>
+                    </m:e>
+                    <m:sub>
+                      <m:r>
+                        <m:t>0</m:t>
+                      </m:r>
+                    </m:sub>
+                  </m:sSub>
+                </m:den>
+              </m:f>
+              <m:r>
+                <m:t>&amp;</m:t>
+              </m:r>
+              <m:r>
+                <m:rPr>
+                  <m:sty m:val="p"/>
+                </m:rPr>
+                <m:t>=</m:t>
+              </m:r>
+              <m:r>
+                <m:rPr>
+                  <m:sty m:val="p"/>
+                </m:rPr>
+                <m:t>−</m:t>
+              </m:r>
+              <m:r>
+                <m:t>2</m:t>
+              </m:r>
+              <m:nary>
+                <m:naryPr>
+                  <m:chr m:val="∑"/>
+                  <m:limLoc m:val="undOvr"/>
+                  <m:subHide m:val="off"/>
+                  <m:supHide m:val="off"/>
+                </m:naryPr>
+                <m:sub>
+                  <m:r>
+                    <m:t>i</m:t>
+                  </m:r>
+                  <m:r>
+                    <m:rPr>
+                      <m:sty m:val="p"/>
+                    </m:rPr>
+                    <m:t>=</m:t>
+                  </m:r>
+                  <m:r>
+                    <m:t>1</m:t>
+                  </m:r>
+                </m:sub>
+                <m:sup>
+                  <m:r>
+                    <m:t>n</m:t>
+                  </m:r>
+                </m:sup>
+                <m:e>
+                  <m:r>
+                    <m:rPr>
+                      <m:sty m:val="p"/>
+                    </m:rPr>
+                    <m:t>(</m:t>
+                  </m:r>
+                </m:e>
+              </m:nary>
+              <m:sSub>
+                <m:e>
+                  <m:r>
+                    <m:t>y</m:t>
+                  </m:r>
+                </m:e>
+                <m:sub>
+                  <m:r>
+                    <m:t>i</m:t>
+                  </m:r>
+                </m:sub>
+              </m:sSub>
+              <m:r>
+                <m:rPr>
+                  <m:sty m:val="p"/>
+                </m:rPr>
+                <m:t>−</m:t>
+              </m:r>
+              <m:sSub>
+                <m:e>
+                  <m:r>
+                    <m:t>β</m:t>
+                  </m:r>
+                </m:e>
+                <m:sub>
+                  <m:r>
+                    <m:t>0</m:t>
+                  </m:r>
+                </m:sub>
+              </m:sSub>
+              <m:r>
+                <m:rPr>
+                  <m:sty m:val="p"/>
+                </m:rPr>
+                <m:t>−</m:t>
+              </m:r>
+              <m:sSub>
+                <m:e>
+                  <m:r>
+                    <m:t>β</m:t>
+                  </m:r>
+                </m:e>
+                <m:sub>
+                  <m:r>
+                    <m:t>x</m:t>
+                  </m:r>
+                </m:sub>
+              </m:sSub>
+              <m:sSub>
+                <m:e>
+                  <m:r>
+                    <m:t>x</m:t>
+                  </m:r>
+                </m:e>
+                <m:sub>
+                  <m:r>
+                    <m:t>i</m:t>
+                  </m:r>
+                </m:sub>
+              </m:sSub>
+              <m:r>
+                <m:rPr>
+                  <m:sty m:val="p"/>
+                </m:rPr>
+                <m:t>)</m:t>
+              </m:r>
+              <m:r>
+                <m:t>&amp;</m:t>
+              </m:r>
+              <m:r>
+                <m:t>&amp;</m:t>
+              </m:r>
+              <m:r>
+                <m:rPr>
+                  <m:nor/>
+                  <m:sty m:val="p"/>
+                </m:rPr>
+                <m:t>(derivative of the RSS)</m:t>
               </m:r>
             </m:e>
             <m:e>
@@ -22773,8 +23090,8 @@
         </m:oMath>
       </m:oMathPara>
     </w:p>
-    <w:bookmarkEnd w:id="82"/>
-    <w:bookmarkStart w:id="83" w:name="lem-rss-deriv-intercept"/>
+    <w:bookmarkEnd w:id="86"/>
+    <w:bookmarkStart w:id="87" w:name="lem-rss-deriv-intercept"/>
     <w:p>
       <w:pPr>
         <w:pStyle w:val="FirstParagraph"/>
@@ -23146,7 +23463,7 @@
         </m:oMath>
       </m:oMathPara>
     </w:p>
-    <w:bookmarkEnd w:id="83"/>
+    <w:bookmarkEnd w:id="87"/>
     <w:p>
       <w:pPr>
         <w:pStyle w:val="FirstParagraph"/>
@@ -23162,7 +23479,7 @@
         <w:t xml:space="preserve">. </w:t>
       </w:r>
       <w:r>
-        <w:t xml:space="preserve">This is the solution to</w:t>
+        <w:t xml:space="preserve">The derivative in sum form is the solution to</w:t>
       </w:r>
       <w:r>
         <w:t xml:space="preserve"> </w:t>
@@ -23178,8 +23495,28 @@
       <w:r>
         <w:t xml:space="preserve">.</w:t>
       </w:r>
+      <w:r>
+        <w:t xml:space="preserve"> </w:t>
+      </w:r>
+      <w:r>
+        <w:t xml:space="preserve">The form in terms of means is the solution to</w:t>
+      </w:r>
+      <w:r>
+        <w:t xml:space="preserve"> </w:t>
+      </w:r>
+      <w:hyperlink w:anchor="exr-rss-deriv-intercept-in-means">
+        <w:r>
+          <w:rPr>
+            <w:rStyle w:val="Hyperlink"/>
+          </w:rPr>
+          <w:t xml:space="preserve">Exercise 7</w:t>
+        </w:r>
+      </w:hyperlink>
+      <w:r>
+        <w:t xml:space="preserve">.</w:t>
+      </w:r>
     </w:p>
-    <w:bookmarkStart w:id="84" w:name="exr-rss-deriv-slope"/>
+    <w:bookmarkStart w:id="88" w:name="exr-rss-deriv-slope"/>
     <w:p>
       <w:pPr>
         <w:pStyle w:val="BodyText"/>
@@ -23189,7 +23526,7 @@
           <w:b/>
           <w:bCs/>
         </w:rPr>
-        <w:t xml:space="preserve">Exercise 7 (Derivative of RSS with respect to the slope)</w:t>
+        <w:t xml:space="preserve">Exercise 8 (Derivative of RSS with respect to the slope)</w:t>
       </w:r>
       <w:r>
         <w:t xml:space="preserve"> </w:t>
@@ -23326,8 +23663,8 @@
         <w:t xml:space="preserve">.</w:t>
       </w:r>
     </w:p>
-    <w:bookmarkEnd w:id="84"/>
-    <w:bookmarkStart w:id="85" w:name="sol-rss-deriv-slope"/>
+    <w:bookmarkEnd w:id="88"/>
+    <w:bookmarkStart w:id="89" w:name="sol-rss-deriv-slope"/>
     <w:p>
       <w:pPr>
         <w:pStyle w:val="BodyText"/>
@@ -23337,7 +23674,7 @@
           <w:i/>
           <w:iCs/>
         </w:rPr>
-        <w:t xml:space="preserve">Solution 7</w:t>
+        <w:t xml:space="preserve">Solution 8</w:t>
       </w:r>
       <w:r>
         <w:t xml:space="preserve">. </w:t>
@@ -24996,8 +25333,8 @@
         </m:oMath>
       </m:oMathPara>
     </w:p>
-    <w:bookmarkEnd w:id="85"/>
-    <w:bookmarkStart w:id="86" w:name="lem-rss-deriv-slope"/>
+    <w:bookmarkEnd w:id="89"/>
+    <w:bookmarkStart w:id="90" w:name="lem-rss-deriv-slope"/>
     <w:p>
       <w:pPr>
         <w:pStyle w:val="FirstParagraph"/>
@@ -25285,7 +25622,7 @@
         </m:oMath>
       </m:oMathPara>
     </w:p>
-    <w:bookmarkEnd w:id="86"/>
+    <w:bookmarkEnd w:id="90"/>
     <w:p>
       <w:pPr>
         <w:pStyle w:val="FirstParagraph"/>
@@ -25311,14 +25648,14 @@
           <w:rPr>
             <w:rStyle w:val="Hyperlink"/>
           </w:rPr>
-          <w:t xml:space="preserve">Exercise 7</w:t>
+          <w:t xml:space="preserve">Exercise 8</w:t>
         </w:r>
       </w:hyperlink>
       <w:r>
         <w:t xml:space="preserve">.</w:t>
       </w:r>
     </w:p>
-    <w:bookmarkStart w:id="87" w:name="exr-solve-normal-equations"/>
+    <w:bookmarkStart w:id="91" w:name="exr-solve-normal-equations"/>
     <w:p>
       <w:pPr>
         <w:pStyle w:val="BodyText"/>
@@ -25328,7 +25665,7 @@
           <w:b/>
           <w:bCs/>
         </w:rPr>
-        <w:t xml:space="preserve">Exercise 8 (Solving the normal equations)</w:t>
+        <w:t xml:space="preserve">Exercise 9 (Solving the normal equations)</w:t>
       </w:r>
       <w:r>
         <w:t xml:space="preserve"> </w:t>
@@ -25361,7 +25698,7 @@
           <w:rPr>
             <w:rStyle w:val="Hyperlink"/>
           </w:rPr>
-          <w:t xml:space="preserve">Exercise 7</w:t>
+          <w:t xml:space="preserve">Exercise 8</w:t>
         </w:r>
       </w:hyperlink>
       <w:r>
@@ -25486,8 +25823,8 @@
         <w:t xml:space="preserve">).</w:t>
       </w:r>
     </w:p>
-    <w:bookmarkEnd w:id="87"/>
-    <w:bookmarkStart w:id="88" w:name="sol-solve-normal-equations"/>
+    <w:bookmarkEnd w:id="91"/>
+    <w:bookmarkStart w:id="92" w:name="sol-solve-normal-equations"/>
     <w:p>
       <w:pPr>
         <w:pStyle w:val="BodyText"/>
@@ -25497,7 +25834,7 @@
           <w:i/>
           <w:iCs/>
         </w:rPr>
-        <w:t xml:space="preserve">Solution 8</w:t>
+        <w:t xml:space="preserve">Solution 9</w:t>
       </w:r>
       <w:r>
         <w:t xml:space="preserve">. </w:t>
@@ -26009,7 +26346,7 @@
           <w:rPr>
             <w:rStyle w:val="Hyperlink"/>
           </w:rPr>
-          <w:t xml:space="preserve">Exercise 7</w:t>
+          <w:t xml:space="preserve">Exercise 8</w:t>
         </w:r>
       </w:hyperlink>
       <w:r>
@@ -30541,8 +30878,8 @@
         <w:t xml:space="preserve">.</w:t>
       </w:r>
     </w:p>
-    <w:bookmarkEnd w:id="88"/>
-    <w:bookmarkStart w:id="89" w:name="lem-solve-normal-equations"/>
+    <w:bookmarkEnd w:id="92"/>
+    <w:bookmarkStart w:id="93" w:name="lem-solve-normal-equations"/>
     <w:p>
       <w:pPr>
         <w:pStyle w:val="BodyText"/>
@@ -30770,7 +31107,7 @@
         </m:oMath>
       </m:oMathPara>
     </w:p>
-    <w:bookmarkEnd w:id="89"/>
+    <w:bookmarkEnd w:id="93"/>
     <w:p>
       <w:pPr>
         <w:pStyle w:val="FirstParagraph"/>
@@ -30796,14 +31133,14 @@
           <w:rPr>
             <w:rStyle w:val="Hyperlink"/>
           </w:rPr>
-          <w:t xml:space="preserve">Exercise 8</w:t>
+          <w:t xml:space="preserve">Exercise 9</w:t>
         </w:r>
       </w:hyperlink>
       <w:r>
         <w:t xml:space="preserve">.</w:t>
       </w:r>
     </w:p>
-    <w:bookmarkStart w:id="90" w:name="exr-rss-hessian"/>
+    <w:bookmarkStart w:id="94" w:name="exr-rss-hessian"/>
     <w:p>
       <w:pPr>
         <w:pStyle w:val="BodyText"/>
@@ -30813,7 +31150,7 @@
           <w:b/>
           <w:bCs/>
         </w:rPr>
-        <w:t xml:space="preserve">Exercise 9 (Second derivatives of RSS)</w:t>
+        <w:t xml:space="preserve">Exercise 10 (Second derivatives of RSS)</w:t>
       </w:r>
       <w:r>
         <w:t xml:space="preserve"> </w:t>
@@ -30939,63 +31276,11 @@
         </m:sSub>
       </m:oMath>
       <w:r>
-        <w:t xml:space="preserve">,</w:t>
-      </w:r>
-      <w:r>
-        <w:t xml:space="preserve"> </w:t>
-      </w:r>
-      <w:r>
-        <w:t xml:space="preserve">and show that it is positive definite when</w:t>
-      </w:r>
-      <w:r>
-        <w:t xml:space="preserve"> </w:t>
-      </w:r>
-      <m:oMath>
-        <m:sSub>
-          <m:e>
-            <m:r>
-              <m:t>S</m:t>
-            </m:r>
-          </m:e>
-          <m:sub>
-            <m:r>
-              <m:t>x</m:t>
-            </m:r>
-            <m:r>
-              <m:t>x</m:t>
-            </m:r>
-          </m:sub>
-        </m:sSub>
-        <m:r>
-          <m:rPr>
-            <m:sty m:val="p"/>
-          </m:rPr>
-          <m:t>&gt;</m:t>
-        </m:r>
-        <m:r>
-          <m:t>0</m:t>
-        </m:r>
-      </m:oMath>
-      <w:r>
-        <w:t xml:space="preserve"> </w:t>
-      </w:r>
-      <w:r>
-        <w:t xml:space="preserve">(</w:t>
-      </w:r>
-      <w:hyperlink w:anchor="def-centered-sums">
-        <w:r>
-          <w:rPr>
-            <w:rStyle w:val="Hyperlink"/>
-          </w:rPr>
-          <w:t xml:space="preserve">Definition 14</w:t>
-        </w:r>
-      </w:hyperlink>
-      <w:r>
-        <w:t xml:space="preserve">).</w:t>
+        <w:t xml:space="preserve">.</w:t>
       </w:r>
     </w:p>
-    <w:bookmarkEnd w:id="90"/>
-    <w:bookmarkStart w:id="91" w:name="sol-rss-hessian"/>
+    <w:bookmarkEnd w:id="94"/>
+    <w:bookmarkStart w:id="95" w:name="sol-rss-hessian"/>
     <w:p>
       <w:pPr>
         <w:pStyle w:val="BodyText"/>
@@ -31005,7 +31290,7 @@
           <w:i/>
           <w:iCs/>
         </w:rPr>
-        <w:t xml:space="preserve">Solution 9</w:t>
+        <w:t xml:space="preserve">Solution 10</w:t>
       </w:r>
       <w:r>
         <w:t xml:space="preserve">. </w:t>
@@ -32646,7 +32931,7 @@
           <w:rPr>
             <w:rStyle w:val="Hyperlink"/>
           </w:rPr>
-          <w:t xml:space="preserve">Exercise 7</w:t>
+          <w:t xml:space="preserve">Exercise 8</w:t>
         </w:r>
       </w:hyperlink>
       <w:r>
@@ -34111,7 +34396,7 @@
           <w:rPr>
             <w:rStyle w:val="Hyperlink"/>
           </w:rPr>
-          <w:t xml:space="preserve">Exercise 7</w:t>
+          <w:t xml:space="preserve">Exercise 8</w:t>
         </w:r>
       </w:hyperlink>
       <w:r>
@@ -35196,13 +35481,7 @@
         <w:t xml:space="preserve"> </w:t>
       </w:r>
       <w:r>
-        <w:t xml:space="preserve">Collecting the four second derivatives,</w:t>
-      </w:r>
-      <w:r>
-        <w:t xml:space="preserve"> </w:t>
-      </w:r>
-      <w:r>
-        <w:t xml:space="preserve">the matrix of second derivatives is</w:t>
+        <w:t xml:space="preserve">Collecting the four second derivatives gives the matrix of second derivatives:</w:t>
       </w:r>
     </w:p>
     <w:p>
@@ -35352,12 +35631,118 @@
         </m:oMath>
       </m:oMathPara>
     </w:p>
+    <w:bookmarkEnd w:id="95"/>
+    <w:bookmarkStart w:id="96" w:name="exr-rss-hessian-positive-definite"/>
     <w:p>
       <w:pPr>
         <w:pStyle w:val="FirstParagraph"/>
       </w:pPr>
       <w:r>
-        <w:t xml:space="preserve">Its top-left entry,</w:t>
+        <w:rPr>
+          <w:b/>
+          <w:bCs/>
+        </w:rPr>
+        <w:t xml:space="preserve">Exercise 11 (Positive definiteness of the second-derivative matrix of RSS)</w:t>
+      </w:r>
+      <w:r>
+        <w:t xml:space="preserve"> </w:t>
+      </w:r>
+      <w:r>
+        <w:t xml:space="preserve">In the setting of</w:t>
+      </w:r>
+      <w:r>
+        <w:t xml:space="preserve"> </w:t>
+      </w:r>
+      <w:hyperlink w:anchor="exr-rss-hessian">
+        <w:r>
+          <w:rPr>
+            <w:rStyle w:val="Hyperlink"/>
+          </w:rPr>
+          <w:t xml:space="preserve">Exercise 10</w:t>
+        </w:r>
+      </w:hyperlink>
+      <w:r>
+        <w:t xml:space="preserve">, show that the matrix of second derivatives is positive definite when</w:t>
+      </w:r>
+      <w:r>
+        <w:t xml:space="preserve"> </w:t>
+      </w:r>
+      <m:oMath>
+        <m:sSub>
+          <m:e>
+            <m:r>
+              <m:t>S</m:t>
+            </m:r>
+          </m:e>
+          <m:sub>
+            <m:r>
+              <m:t>x</m:t>
+            </m:r>
+            <m:r>
+              <m:t>x</m:t>
+            </m:r>
+          </m:sub>
+        </m:sSub>
+        <m:r>
+          <m:rPr>
+            <m:sty m:val="p"/>
+          </m:rPr>
+          <m:t>&gt;</m:t>
+        </m:r>
+        <m:r>
+          <m:t>0</m:t>
+        </m:r>
+      </m:oMath>
+      <w:r>
+        <w:t xml:space="preserve"> </w:t>
+      </w:r>
+      <w:r>
+        <w:t xml:space="preserve">(</w:t>
+      </w:r>
+      <w:hyperlink w:anchor="def-centered-sums">
+        <w:r>
+          <w:rPr>
+            <w:rStyle w:val="Hyperlink"/>
+          </w:rPr>
+          <w:t xml:space="preserve">Definition 14</w:t>
+        </w:r>
+      </w:hyperlink>
+      <w:r>
+        <w:t xml:space="preserve">).</w:t>
+      </w:r>
+    </w:p>
+    <w:bookmarkEnd w:id="96"/>
+    <w:bookmarkStart w:id="97" w:name="sol-rss-hessian-positive-definite"/>
+    <w:p>
+      <w:pPr>
+        <w:pStyle w:val="BodyText"/>
+      </w:pPr>
+      <w:r>
+        <w:rPr>
+          <w:i/>
+          <w:iCs/>
+        </w:rPr>
+        <w:t xml:space="preserve">Solution 11</w:t>
+      </w:r>
+      <w:r>
+        <w:t xml:space="preserve">. </w:t>
+      </w:r>
+      <w:r>
+        <w:t xml:space="preserve">The top-left entry of the matrix of second derivatives from</w:t>
+      </w:r>
+      <w:r>
+        <w:t xml:space="preserve"> </w:t>
+      </w:r>
+      <w:hyperlink w:anchor="exr-rss-hessian">
+        <w:r>
+          <w:rPr>
+            <w:rStyle w:val="Hyperlink"/>
+          </w:rPr>
+          <w:t xml:space="preserve">Exercise 10</w:t>
+        </w:r>
+      </w:hyperlink>
+      <w:r>
+        <w:t xml:space="preserve">,</w:t>
       </w:r>
       <w:r>
         <w:t xml:space="preserve"> </w:t>
@@ -35377,7 +35762,7 @@
         <w:t xml:space="preserve"> </w:t>
       </w:r>
       <w:r>
-        <w:t xml:space="preserve">Its determinant,</w:t>
+        <w:t xml:space="preserve">The determinant of this matrix,</w:t>
       </w:r>
       <w:r>
         <w:t xml:space="preserve"> </w:t>
@@ -36154,8 +36539,8 @@
         <w:t xml:space="preserve">and a positive determinant is positive definite.</w:t>
       </w:r>
     </w:p>
-    <w:bookmarkEnd w:id="91"/>
-    <w:bookmarkStart w:id="92" w:name="lem-rss-hessian"/>
+    <w:bookmarkEnd w:id="97"/>
+    <w:bookmarkStart w:id="98" w:name="lem-rss-hessian"/>
     <w:p>
       <w:pPr>
         <w:pStyle w:val="BodyText"/>
@@ -36555,7 +36940,7 @@
         </m:oMath>
       </m:oMathPara>
     </w:p>
-    <w:bookmarkEnd w:id="92"/>
+    <w:bookmarkEnd w:id="98"/>
     <w:p>
       <w:pPr>
         <w:pStyle w:val="FirstParagraph"/>
@@ -36571,7 +36956,7 @@
         <w:t xml:space="preserve">. </w:t>
       </w:r>
       <w:r>
-        <w:t xml:space="preserve">This is the solution to</w:t>
+        <w:t xml:space="preserve">The matrix of second derivatives is the solution to</w:t>
       </w:r>
       <w:r>
         <w:t xml:space="preserve"> </w:t>
@@ -36581,14 +36966,34 @@
           <w:rPr>
             <w:rStyle w:val="Hyperlink"/>
           </w:rPr>
-          <w:t xml:space="preserve">Exercise 9</w:t>
+          <w:t xml:space="preserve">Exercise 10</w:t>
         </w:r>
       </w:hyperlink>
       <w:r>
         <w:t xml:space="preserve">.</w:t>
       </w:r>
+      <w:r>
+        <w:t xml:space="preserve"> </w:t>
+      </w:r>
+      <w:r>
+        <w:t xml:space="preserve">The positive definiteness is the solution to</w:t>
+      </w:r>
+      <w:r>
+        <w:t xml:space="preserve"> </w:t>
+      </w:r>
+      <w:hyperlink w:anchor="exr-rss-hessian-positive-definite">
+        <w:r>
+          <w:rPr>
+            <w:rStyle w:val="Hyperlink"/>
+          </w:rPr>
+          <w:t xml:space="preserve">Exercise 11</w:t>
+        </w:r>
+      </w:hyperlink>
+      <w:r>
+        <w:t xml:space="preserve">.</w:t>
+      </w:r>
     </w:p>
-    <w:bookmarkStart w:id="93" w:name="thm-ols-slr"/>
+    <w:bookmarkStart w:id="99" w:name="thm-ols-slr"/>
     <w:p>
       <w:pPr>
         <w:pStyle w:val="BodyText"/>
@@ -36860,7 +37265,7 @@
         </m:oMath>
       </m:oMathPara>
     </w:p>
-    <w:bookmarkEnd w:id="93"/>
+    <w:bookmarkEnd w:id="99"/>
     <w:p>
       <w:pPr>
         <w:pStyle w:val="FirstParagraph"/>
@@ -37225,7 +37630,7 @@
         <w:t xml:space="preserve">instead of differentiating with respect to each component separately.</w:t>
       </w:r>
     </w:p>
-    <w:bookmarkStart w:id="94" w:name="def-slr-covariate-vector"/>
+    <w:bookmarkStart w:id="100" w:name="def-slr-covariate-vector"/>
     <w:p>
       <w:pPr>
         <w:pStyle w:val="BodyText"/>
@@ -37327,8 +37732,8 @@
     $$</w:t>
       </w:r>
     </w:p>
-    <w:bookmarkEnd w:id="94"/>
-    <w:bookmarkStart w:id="95" w:name="exr-slr-mean-dot-product"/>
+    <w:bookmarkEnd w:id="100"/>
+    <w:bookmarkStart w:id="101" w:name="exr-slr-mean-dot-product"/>
     <w:p>
       <w:pPr>
         <w:pStyle w:val="FirstParagraph"/>
@@ -37338,7 +37743,7 @@
           <w:b/>
           <w:bCs/>
         </w:rPr>
-        <w:t xml:space="preserve">Exercise 10 (The conditional mean and the covariate vector)</w:t>
+        <w:t xml:space="preserve">Exercise 12 (The conditional mean and the covariate vector)</w:t>
       </w:r>
       <w:r>
         <w:t xml:space="preserve"> </w:t>
@@ -37460,8 +37865,8 @@
         <w:t xml:space="preserve">).</w:t>
       </w:r>
     </w:p>
-    <w:bookmarkEnd w:id="95"/>
-    <w:bookmarkStart w:id="96" w:name="sol-slr-mean-dot-product"/>
+    <w:bookmarkEnd w:id="101"/>
+    <w:bookmarkStart w:id="102" w:name="sol-slr-mean-dot-product"/>
     <w:p>
       <w:pPr>
         <w:pStyle w:val="BodyText"/>
@@ -37471,7 +37876,7 @@
           <w:i/>
           <w:iCs/>
         </w:rPr>
-        <w:t xml:space="preserve">Solution 10</w:t>
+        <w:t xml:space="preserve">Solution 12</w:t>
       </w:r>
       <w:r>
         <w:t xml:space="preserve">. </w:t>
@@ -37521,8 +37926,8 @@
         <w:t xml:space="preserve">.</w:t>
       </w:r>
     </w:p>
-    <w:bookmarkEnd w:id="96"/>
-    <w:bookmarkStart w:id="97" w:name="lem-slr-mean-dot-product"/>
+    <w:bookmarkEnd w:id="102"/>
+    <w:bookmarkStart w:id="103" w:name="lem-slr-mean-dot-product"/>
     <w:p>
       <w:pPr>
         <w:pStyle w:val="BodyText"/>
@@ -37626,7 +38031,7 @@
         <w:t xml:space="preserve">$$\mu(x_i) = \mathord{\smash[b]{\underset{\raise.3ex\hbox{$\scriptstyle\sim$}}{x}}\vphantom{x}}_i \cdot \mathord{\smash[b]{\underset{\raise.3ex\hbox{$\scriptstyle\sim$}}{\beta}}\vphantom{\beta}}.$$</w:t>
       </w:r>
     </w:p>
-    <w:bookmarkEnd w:id="97"/>
+    <w:bookmarkEnd w:id="103"/>
     <w:p>
       <w:pPr>
         <w:pStyle w:val="FirstParagraph"/>
@@ -37652,14 +38057,14 @@
           <w:rPr>
             <w:rStyle w:val="Hyperlink"/>
           </w:rPr>
-          <w:t xml:space="preserve">Exercise 10</w:t>
+          <w:t xml:space="preserve">Exercise 12</w:t>
         </w:r>
       </w:hyperlink>
       <w:r>
         <w:t xml:space="preserve">.</w:t>
       </w:r>
     </w:p>
-    <w:bookmarkStart w:id="98" w:name="exm-rss-vector"/>
+    <w:bookmarkStart w:id="104" w:name="exm-rss-vector"/>
     <w:p>
       <w:pPr>
         <w:pStyle w:val="BodyText"/>
@@ -37835,8 +38240,8 @@
     $$</w:t>
       </w:r>
     </w:p>
-    <w:bookmarkEnd w:id="98"/>
-    <w:bookmarkStart w:id="99" w:name="exr-rss-gradient-vector"/>
+    <w:bookmarkEnd w:id="104"/>
+    <w:bookmarkStart w:id="105" w:name="exr-rss-gradient-vector"/>
     <w:p>
       <w:pPr>
         <w:pStyle w:val="FirstParagraph"/>
@@ -37846,7 +38251,7 @@
           <w:b/>
           <w:bCs/>
         </w:rPr>
-        <w:t xml:space="preserve">Exercise 11 (Gradient of RSS in vector notation)</w:t>
+        <w:t xml:space="preserve">Exercise 13 (Gradient of RSS in vector notation)</w:t>
       </w:r>
       <w:r>
         <w:t xml:space="preserve"> </w:t>
@@ -37899,8 +38304,8 @@
         <w:t xml:space="preserve">rather than one component at a time.</w:t>
       </w:r>
     </w:p>
-    <w:bookmarkEnd w:id="99"/>
-    <w:bookmarkStart w:id="100" w:name="sol-rss-gradient-vector"/>
+    <w:bookmarkEnd w:id="105"/>
+    <w:bookmarkStart w:id="106" w:name="sol-rss-gradient-vector"/>
     <w:p>
       <w:pPr>
         <w:pStyle w:val="BodyText"/>
@@ -37910,7 +38315,7 @@
           <w:i/>
           <w:iCs/>
         </w:rPr>
-        <w:t xml:space="preserve">Solution 11</w:t>
+        <w:t xml:space="preserve">Solution 13</w:t>
       </w:r>
       <w:r>
         <w:t xml:space="preserve">. </w:t>
@@ -38080,8 +38485,8 @@
     $$</w:t>
       </w:r>
     </w:p>
-    <w:bookmarkEnd w:id="100"/>
-    <w:bookmarkStart w:id="101" w:name="lem-rss-gradient-vector"/>
+    <w:bookmarkEnd w:id="106"/>
+    <w:bookmarkStart w:id="107" w:name="lem-rss-gradient-vector"/>
     <w:p>
       <w:pPr>
         <w:pStyle w:val="FirstParagraph"/>
@@ -38120,7 +38525,7 @@
     = -2 \sum_{i=1}^n\mathord{\smash[b]{\underset{\raise.3ex\hbox{$\scriptstyle\sim$}}{x}}\vphantom{x}}_i\mathopen{}\left(y_i- \mathord{\smash[b]{\underset{\raise.3ex\hbox{$\scriptstyle\sim$}}{x}}\vphantom{x}}_i \cdot \mathord{\smash[b]{\underset{\raise.3ex\hbox{$\scriptstyle\sim$}}{\beta}}\vphantom{\beta}}\right)\mathclose{}.$$</w:t>
       </w:r>
     </w:p>
-    <w:bookmarkEnd w:id="101"/>
+    <w:bookmarkEnd w:id="107"/>
     <w:p>
       <w:pPr>
         <w:pStyle w:val="FirstParagraph"/>
@@ -38146,14 +38551,14 @@
           <w:rPr>
             <w:rStyle w:val="Hyperlink"/>
           </w:rPr>
-          <w:t xml:space="preserve">Exercise 11</w:t>
+          <w:t xml:space="preserve">Exercise 13</w:t>
         </w:r>
       </w:hyperlink>
       <w:r>
         <w:t xml:space="preserve">.</w:t>
       </w:r>
     </w:p>
-    <w:bookmarkStart w:id="102" w:name="exr-normal-equations-vector"/>
+    <w:bookmarkStart w:id="108" w:name="exr-normal-equations-vector"/>
     <w:p>
       <w:pPr>
         <w:pStyle w:val="BodyText"/>
@@ -38163,7 +38568,7 @@
           <w:b/>
           <w:bCs/>
         </w:rPr>
-        <w:t xml:space="preserve">Exercise 12 (Normal equations in vector notation)</w:t>
+        <w:t xml:space="preserve">Exercise 14 (Normal equations in vector notation)</w:t>
       </w:r>
       <w:r>
         <w:t xml:space="preserve"> </w:t>
@@ -38199,7 +38604,7 @@
           <w:rPr>
             <w:rStyle w:val="Hyperlink"/>
           </w:rPr>
-          <w:t xml:space="preserve">Exercise 11</w:t>
+          <w:t xml:space="preserve">Exercise 13</w:t>
         </w:r>
       </w:hyperlink>
       <w:r>
@@ -38238,8 +38643,8 @@
         <w:t xml:space="preserve">.</w:t>
       </w:r>
     </w:p>
-    <w:bookmarkEnd w:id="102"/>
-    <w:bookmarkStart w:id="103" w:name="sol-normal-equations-vector"/>
+    <w:bookmarkEnd w:id="108"/>
+    <w:bookmarkStart w:id="109" w:name="sol-normal-equations-vector"/>
     <w:p>
       <w:pPr>
         <w:pStyle w:val="BodyText"/>
@@ -38249,7 +38654,7 @@
           <w:i/>
           <w:iCs/>
         </w:rPr>
-        <w:t xml:space="preserve">Solution 12</w:t>
+        <w:t xml:space="preserve">Solution 14</w:t>
       </w:r>
       <w:r>
         <w:t xml:space="preserve">. </w:t>
@@ -38265,7 +38670,7 @@
           <w:rPr>
             <w:rStyle w:val="Hyperlink"/>
           </w:rPr>
-          <w:t xml:space="preserve">Exercise 11</w:t>
+          <w:t xml:space="preserve">Exercise 13</w:t>
         </w:r>
       </w:hyperlink>
       <w:r>
@@ -38405,8 +38810,8 @@
     $$</w:t>
       </w:r>
     </w:p>
-    <w:bookmarkEnd w:id="103"/>
-    <w:bookmarkStart w:id="104" w:name="lem-normal-equations-vector"/>
+    <w:bookmarkEnd w:id="109"/>
+    <w:bookmarkStart w:id="110" w:name="lem-normal-equations-vector"/>
     <w:p>
       <w:pPr>
         <w:pStyle w:val="FirstParagraph"/>
@@ -38476,7 +38881,7 @@
         <w:t xml:space="preserve">$$A \mathord{\smash[b]{\underset{\raise.3ex\hbox{$\scriptstyle\sim$}}{\beta}}\vphantom{\beta}}= \mathord{\smash[b]{\underset{\raise.3ex\hbox{$\scriptstyle\sim$}}{c}}\vphantom{c}}.$$</w:t>
       </w:r>
     </w:p>
-    <w:bookmarkEnd w:id="104"/>
+    <w:bookmarkEnd w:id="110"/>
     <w:p>
       <w:pPr>
         <w:pStyle w:val="FirstParagraph"/>
@@ -38502,14 +38907,14 @@
           <w:rPr>
             <w:rStyle w:val="Hyperlink"/>
           </w:rPr>
-          <w:t xml:space="preserve">Exercise 12</w:t>
+          <w:t xml:space="preserve">Exercise 14</w:t>
         </w:r>
       </w:hyperlink>
       <w:r>
         <w:t xml:space="preserve">.</w:t>
       </w:r>
     </w:p>
-    <w:bookmarkStart w:id="105" w:name="exr-solve-normal-equations-vector"/>
+    <w:bookmarkStart w:id="111" w:name="exr-solve-normal-equations-vector"/>
     <w:p>
       <w:pPr>
         <w:pStyle w:val="BodyText"/>
@@ -38519,7 +38924,7 @@
           <w:b/>
           <w:bCs/>
         </w:rPr>
-        <w:t xml:space="preserve">Exercise 13 (Solving the normal equations in vector notation)</w:t>
+        <w:t xml:space="preserve">Exercise 15 (Solving the normal equations in vector notation)</w:t>
       </w:r>
       <w:r>
         <w:t xml:space="preserve"> </w:t>
@@ -38601,7 +39006,7 @@
           <w:rPr>
             <w:rStyle w:val="Hyperlink"/>
           </w:rPr>
-          <w:t xml:space="preserve">Exercise 12</w:t>
+          <w:t xml:space="preserve">Exercise 14</w:t>
         </w:r>
       </w:hyperlink>
       <w:r>
@@ -38651,15 +39056,15 @@
           <w:rPr>
             <w:rStyle w:val="Hyperlink"/>
           </w:rPr>
-          <w:t xml:space="preserve">Exercise 8</w:t>
+          <w:t xml:space="preserve">Exercise 9</w:t>
         </w:r>
       </w:hyperlink>
       <w:r>
         <w:t xml:space="preserve">.</w:t>
       </w:r>
     </w:p>
-    <w:bookmarkEnd w:id="105"/>
-    <w:bookmarkStart w:id="106" w:name="sol-solve-normal-equations-vector"/>
+    <w:bookmarkEnd w:id="111"/>
+    <w:bookmarkStart w:id="112" w:name="sol-solve-normal-equations-vector"/>
     <w:p>
       <w:pPr>
         <w:pStyle w:val="BodyText"/>
@@ -38669,7 +39074,7 @@
           <w:i/>
           <w:iCs/>
         </w:rPr>
-        <w:t xml:space="preserve">Solution 13</w:t>
+        <w:t xml:space="preserve">Solution 15</w:t>
       </w:r>
       <w:r>
         <w:t xml:space="preserve">. </w:t>
@@ -42123,15 +42528,15 @@
           <w:rPr>
             <w:rStyle w:val="Hyperlink"/>
           </w:rPr>
-          <w:t xml:space="preserve">Exercise 8</w:t>
+          <w:t xml:space="preserve">Exercise 9</w:t>
         </w:r>
       </w:hyperlink>
       <w:r>
         <w:t xml:space="preserve">.</w:t>
       </w:r>
     </w:p>
-    <w:bookmarkEnd w:id="106"/>
-    <w:bookmarkStart w:id="107" w:name="lem-solve-normal-equations-vector"/>
+    <w:bookmarkEnd w:id="112"/>
+    <w:bookmarkStart w:id="113" w:name="lem-solve-normal-equations-vector"/>
     <w:p>
       <w:pPr>
         <w:pStyle w:val="BodyText"/>
@@ -42289,7 +42694,7 @@
         <w:t xml:space="preserve">.</w:t>
       </w:r>
     </w:p>
-    <w:bookmarkEnd w:id="107"/>
+    <w:bookmarkEnd w:id="113"/>
     <w:p>
       <w:pPr>
         <w:pStyle w:val="BodyText"/>
@@ -42315,14 +42720,14 @@
           <w:rPr>
             <w:rStyle w:val="Hyperlink"/>
           </w:rPr>
-          <w:t xml:space="preserve">Exercise 13</w:t>
+          <w:t xml:space="preserve">Exercise 15</w:t>
         </w:r>
       </w:hyperlink>
       <w:r>
         <w:t xml:space="preserve">.</w:t>
       </w:r>
     </w:p>
-    <w:bookmarkStart w:id="109" w:name="exr-rss-hessian-vector"/>
+    <w:bookmarkStart w:id="115" w:name="exr-rss-hessian-vector"/>
     <w:p>
       <w:pPr>
         <w:pStyle w:val="BodyText"/>
@@ -42332,7 +42737,7 @@
           <w:b/>
           <w:bCs/>
         </w:rPr>
-        <w:t xml:space="preserve">Exercise 14 (Hessian of RSS in vector notation)</w:t>
+        <w:t xml:space="preserve">Exercise 16 (Hessian of RSS in vector notation)</w:t>
       </w:r>
       <w:r>
         <w:t xml:space="preserve"> </w:t>
@@ -42343,7 +42748,7 @@
       <w:r>
         <w:t xml:space="preserve"> </w:t>
       </w:r>
-      <w:hyperlink r:id="rId108">
+      <w:hyperlink r:id="rId114">
         <w:r>
           <w:rPr>
             <w:rStyle w:val="Hyperlink"/>
@@ -42358,63 +42763,11 @@
         <w:t xml:space="preserve">$\frac{\partial}{\partial \mathord{\smash[b]{\underset{\raise.3ex\hbox{$\scriptstyle\sim$}}{\beta}}\vphantom{\beta}}} \frac{\partial}{\partial {\mathord{\smash[b]{\underset{\raise.3ex\hbox{$\scriptstyle\sim$}}{\beta}}\vphantom{\beta}}}^{\top}} \text{RSS}(\mathord{\smash[b]{\underset{\raise.3ex\hbox{$\scriptstyle\sim$}}{\beta}}\vphantom{\beta}})$</w:t>
       </w:r>
       <w:r>
-        <w:t xml:space="preserve">,</w:t>
-      </w:r>
-      <w:r>
-        <w:t xml:space="preserve"> </w:t>
-      </w:r>
-      <w:r>
-        <w:t xml:space="preserve">and show that it is positive definite when</w:t>
-      </w:r>
-      <w:r>
-        <w:t xml:space="preserve"> </w:t>
-      </w:r>
-      <m:oMath>
-        <m:sSub>
-          <m:e>
-            <m:r>
-              <m:t>S</m:t>
-            </m:r>
-          </m:e>
-          <m:sub>
-            <m:r>
-              <m:t>x</m:t>
-            </m:r>
-            <m:r>
-              <m:t>x</m:t>
-            </m:r>
-          </m:sub>
-        </m:sSub>
-        <m:r>
-          <m:rPr>
-            <m:sty m:val="p"/>
-          </m:rPr>
-          <m:t>&gt;</m:t>
-        </m:r>
-        <m:r>
-          <m:t>0</m:t>
-        </m:r>
-      </m:oMath>
-      <w:r>
-        <w:t xml:space="preserve"> </w:t>
-      </w:r>
-      <w:r>
-        <w:t xml:space="preserve">(</w:t>
-      </w:r>
-      <w:hyperlink w:anchor="def-centered-sums">
-        <w:r>
-          <w:rPr>
-            <w:rStyle w:val="Hyperlink"/>
-          </w:rPr>
-          <w:t xml:space="preserve">Definition 14</w:t>
-        </w:r>
-      </w:hyperlink>
-      <w:r>
-        <w:t xml:space="preserve">).</w:t>
+        <w:t xml:space="preserve">.</w:t>
       </w:r>
     </w:p>
-    <w:bookmarkEnd w:id="109"/>
-    <w:bookmarkStart w:id="110" w:name="sol-rss-hessian-vector"/>
+    <w:bookmarkEnd w:id="115"/>
+    <w:bookmarkStart w:id="116" w:name="sol-rss-hessian-vector"/>
     <w:p>
       <w:pPr>
         <w:pStyle w:val="BodyText"/>
@@ -42424,7 +42777,7 @@
           <w:i/>
           <w:iCs/>
         </w:rPr>
-        <w:t xml:space="preserve">Solution 14</w:t>
+        <w:t xml:space="preserve">Solution 16</w:t>
       </w:r>
       <w:r>
         <w:t xml:space="preserve">. </w:t>
@@ -42452,7 +42805,7 @@
           <w:rPr>
             <w:rStyle w:val="Hyperlink"/>
           </w:rPr>
-          <w:t xml:space="preserve">Exercise 12</w:t>
+          <w:t xml:space="preserve">Exercise 14</w:t>
         </w:r>
       </w:hyperlink>
       <w:r>
@@ -42549,7 +42902,7 @@
           <w:rPr>
             <w:rStyle w:val="Hyperlink"/>
           </w:rPr>
-          <w:t xml:space="preserve">Exercise 11</w:t>
+          <w:t xml:space="preserve">Exercise 13</w:t>
         </w:r>
       </w:hyperlink>
       <w:r>
@@ -42631,12 +42984,190 @@
     $$</w:t>
       </w:r>
     </w:p>
+    <w:bookmarkEnd w:id="116"/>
+    <w:bookmarkStart w:id="117" w:name="exr-rss-hessian-vector-positive-definite"/>
     <w:p>
       <w:pPr>
         <w:pStyle w:val="FirstParagraph"/>
       </w:pPr>
       <w:r>
-        <w:t xml:space="preserve">To show it is positive definite,</w:t>
+        <w:rPr>
+          <w:b/>
+          <w:bCs/>
+        </w:rPr>
+        <w:t xml:space="preserve">Exercise 17 (Positive definiteness of the Hessian of RSS)</w:t>
+      </w:r>
+      <w:r>
+        <w:t xml:space="preserve"> </w:t>
+      </w:r>
+      <w:r>
+        <w:t xml:space="preserve">In the setting of</w:t>
+      </w:r>
+      <w:r>
+        <w:t xml:space="preserve"> </w:t>
+      </w:r>
+      <w:hyperlink w:anchor="exr-rss-hessian-vector">
+        <w:r>
+          <w:rPr>
+            <w:rStyle w:val="Hyperlink"/>
+          </w:rPr>
+          <w:t xml:space="preserve">Exercise 16</w:t>
+        </w:r>
+      </w:hyperlink>
+      <w:r>
+        <w:t xml:space="preserve">, show that the</w:t>
+      </w:r>
+      <w:r>
+        <w:t xml:space="preserve"> </w:t>
+      </w:r>
+      <w:hyperlink r:id="rId114">
+        <w:r>
+          <w:rPr>
+            <w:rStyle w:val="Hyperlink"/>
+          </w:rPr>
+          <w:t xml:space="preserve">Hessian</w:t>
+        </w:r>
+      </w:hyperlink>
+      <w:r>
+        <w:t xml:space="preserve"> </w:t>
+      </w:r>
+      <w:r>
+        <w:t xml:space="preserve">is positive definite when</w:t>
+      </w:r>
+      <w:r>
+        <w:t xml:space="preserve"> </w:t>
+      </w:r>
+      <m:oMath>
+        <m:sSub>
+          <m:e>
+            <m:r>
+              <m:t>S</m:t>
+            </m:r>
+          </m:e>
+          <m:sub>
+            <m:r>
+              <m:t>x</m:t>
+            </m:r>
+            <m:r>
+              <m:t>x</m:t>
+            </m:r>
+          </m:sub>
+        </m:sSub>
+        <m:r>
+          <m:rPr>
+            <m:sty m:val="p"/>
+          </m:rPr>
+          <m:t>&gt;</m:t>
+        </m:r>
+        <m:r>
+          <m:t>0</m:t>
+        </m:r>
+      </m:oMath>
+      <w:r>
+        <w:t xml:space="preserve"> </w:t>
+      </w:r>
+      <w:r>
+        <w:t xml:space="preserve">(</w:t>
+      </w:r>
+      <w:hyperlink w:anchor="def-centered-sums">
+        <w:r>
+          <w:rPr>
+            <w:rStyle w:val="Hyperlink"/>
+          </w:rPr>
+          <w:t xml:space="preserve">Definition 14</w:t>
+        </w:r>
+      </w:hyperlink>
+      <w:r>
+        <w:t xml:space="preserve">).</w:t>
+      </w:r>
+    </w:p>
+    <w:bookmarkEnd w:id="117"/>
+    <w:bookmarkStart w:id="118" w:name="sol-rss-hessian-vector-positive-definite"/>
+    <w:p>
+      <w:pPr>
+        <w:pStyle w:val="BodyText"/>
+      </w:pPr>
+      <w:r>
+        <w:rPr>
+          <w:i/>
+          <w:iCs/>
+        </w:rPr>
+        <w:t xml:space="preserve">Solution 17</w:t>
+      </w:r>
+      <w:r>
+        <w:t xml:space="preserve">. </w:t>
+      </w:r>
+      <w:r>
+        <w:t xml:space="preserve">By</w:t>
+      </w:r>
+      <w:r>
+        <w:t xml:space="preserve"> </w:t>
+      </w:r>
+      <w:hyperlink w:anchor="exr-rss-hessian-vector">
+        <w:r>
+          <w:rPr>
+            <w:rStyle w:val="Hyperlink"/>
+          </w:rPr>
+          <w:t xml:space="preserve">Exercise 16</w:t>
+        </w:r>
+      </w:hyperlink>
+      <w:r>
+        <w:t xml:space="preserve">,</w:t>
+      </w:r>
+      <w:r>
+        <w:t xml:space="preserve"> </w:t>
+      </w:r>
+      <w:r>
+        <w:t xml:space="preserve">the</w:t>
+      </w:r>
+      <w:r>
+        <w:t xml:space="preserve"> </w:t>
+      </w:r>
+      <w:hyperlink r:id="rId114">
+        <w:r>
+          <w:rPr>
+            <w:rStyle w:val="Hyperlink"/>
+          </w:rPr>
+          <w:t xml:space="preserve">Hessian</w:t>
+        </w:r>
+      </w:hyperlink>
+      <w:r>
+        <w:t xml:space="preserve"> </w:t>
+      </w:r>
+      <w:r>
+        <w:t xml:space="preserve">is</w:t>
+      </w:r>
+      <w:r>
+        <w:t xml:space="preserve"> </w:t>
+      </w:r>
+      <m:oMath>
+        <m:r>
+          <m:t>2</m:t>
+        </m:r>
+        <m:r>
+          <m:t>A</m:t>
+        </m:r>
+      </m:oMath>
+      <w:r>
+        <w:t xml:space="preserve"> </w:t>
+      </w:r>
+      <w:r>
+        <w:t xml:space="preserve">with</w:t>
+      </w:r>
+      <w:r>
+        <w:t xml:space="preserve"> </w:t>
+      </w:r>
+      <w:r>
+        <w:t xml:space="preserve">$A = \sum_{i=1}^n\mathord{\smash[b]{\underset{\raise.3ex\hbox{$\scriptstyle\sim$}}{x}}\vphantom{x}}_i {\mathord{\smash[b]{\underset{\raise.3ex\hbox{$\scriptstyle\sim$}}{x}}\vphantom{x}}_i}^{\top}$</w:t>
+      </w:r>
+      <w:r>
+        <w:t xml:space="preserve">.</w:t>
+      </w:r>
+      <w:r>
+        <w:t xml:space="preserve"> </w:t>
+      </w:r>
+      <w:r>
+        <w:t xml:space="preserve">To show that this Hessian is positive definite,</w:t>
       </w:r>
       <w:r>
         <w:t xml:space="preserve"> </w:t>
@@ -42795,7 +43326,7 @@
         </m:r>
       </m:oMath>
       <w:r>
-        <w:t xml:space="preserve">, that would force every</w:t>
+        <w:t xml:space="preserve">, the condition would force every</w:t>
       </w:r>
       <w:r>
         <w:t xml:space="preserve"> </w:t>
@@ -42930,7 +43461,7 @@
         </m:r>
       </m:oMath>
       <w:r>
-        <w:t xml:space="preserve">, it would force</w:t>
+        <w:t xml:space="preserve">, the condition would force</w:t>
       </w:r>
       <w:r>
         <w:t xml:space="preserve"> </w:t>
@@ -42998,8 +43529,8 @@
         <w:t xml:space="preserve">.</w:t>
       </w:r>
     </w:p>
-    <w:bookmarkEnd w:id="110"/>
-    <w:bookmarkStart w:id="111" w:name="lem-rss-hessian-vector"/>
+    <w:bookmarkEnd w:id="118"/>
+    <w:bookmarkStart w:id="119" w:name="lem-rss-hessian-vector"/>
     <w:p>
       <w:pPr>
         <w:pStyle w:val="BodyText"/>
@@ -43020,7 +43551,7 @@
       <w:r>
         <w:t xml:space="preserve"> </w:t>
       </w:r>
-      <w:hyperlink r:id="rId108">
+      <w:hyperlink r:id="rId114">
         <w:r>
           <w:rPr>
             <w:rStyle w:val="Hyperlink"/>
@@ -43112,7 +43643,7 @@
         <w:t xml:space="preserve">).</w:t>
       </w:r>
     </w:p>
-    <w:bookmarkEnd w:id="111"/>
+    <w:bookmarkEnd w:id="119"/>
     <w:p>
       <w:pPr>
         <w:pStyle w:val="BodyText"/>
@@ -43128,7 +43659,24 @@
         <w:t xml:space="preserve">. </w:t>
       </w:r>
       <w:r>
-        <w:t xml:space="preserve">This is the solution to</w:t>
+        <w:t xml:space="preserve">The</w:t>
+      </w:r>
+      <w:r>
+        <w:t xml:space="preserve"> </w:t>
+      </w:r>
+      <w:hyperlink r:id="rId114">
+        <w:r>
+          <w:rPr>
+            <w:rStyle w:val="Hyperlink"/>
+          </w:rPr>
+          <w:t xml:space="preserve">Hessian</w:t>
+        </w:r>
+      </w:hyperlink>
+      <w:r>
+        <w:t xml:space="preserve"> </w:t>
+      </w:r>
+      <w:r>
+        <w:t xml:space="preserve">is the solution to</w:t>
       </w:r>
       <w:r>
         <w:t xml:space="preserve"> </w:t>
@@ -43138,14 +43686,34 @@
           <w:rPr>
             <w:rStyle w:val="Hyperlink"/>
           </w:rPr>
-          <w:t xml:space="preserve">Exercise 14</w:t>
+          <w:t xml:space="preserve">Exercise 16</w:t>
         </w:r>
       </w:hyperlink>
       <w:r>
         <w:t xml:space="preserve">.</w:t>
       </w:r>
+      <w:r>
+        <w:t xml:space="preserve"> </w:t>
+      </w:r>
+      <w:r>
+        <w:t xml:space="preserve">The positive definiteness is the solution to</w:t>
+      </w:r>
+      <w:r>
+        <w:t xml:space="preserve"> </w:t>
+      </w:r>
+      <w:hyperlink w:anchor="exr-rss-hessian-vector-positive-definite">
+        <w:r>
+          <w:rPr>
+            <w:rStyle w:val="Hyperlink"/>
+          </w:rPr>
+          <w:t xml:space="preserve">Exercise 17</w:t>
+        </w:r>
+      </w:hyperlink>
+      <w:r>
+        <w:t xml:space="preserve">.</w:t>
+      </w:r>
     </w:p>
-    <w:bookmarkStart w:id="112" w:name="thm-ols-slr-vector"/>
+    <w:bookmarkStart w:id="120" w:name="thm-ols-slr-vector"/>
     <w:p>
       <w:pPr>
         <w:pStyle w:val="BodyText"/>
@@ -43279,7 +43847,7 @@
         <w:t xml:space="preserve">.</w:t>
       </w:r>
     </w:p>
-    <w:bookmarkEnd w:id="112"/>
+    <w:bookmarkEnd w:id="120"/>
     <w:p>
       <w:pPr>
         <w:pStyle w:val="BodyText"/>
@@ -43529,7 +44097,7 @@
         <w:t xml:space="preserve">is its unique global minimum.</w:t>
       </w:r>
     </w:p>
-    <w:bookmarkStart w:id="114" w:name="exr-ols-slope-r"/>
+    <w:bookmarkStart w:id="122" w:name="exr-ols-slope-r"/>
     <w:p>
       <w:pPr>
         <w:pStyle w:val="BodyText"/>
@@ -43539,7 +44107,7 @@
           <w:b/>
           <w:bCs/>
         </w:rPr>
-        <w:t xml:space="preserve">Exercise 15 (OLS slope and the correlation)</w:t>
+        <w:t xml:space="preserve">Exercise 18 (OLS slope and the correlation)</w:t>
       </w:r>
       <w:r>
         <w:t xml:space="preserve"> </w:t>
@@ -43709,7 +44277,7 @@
       <w:r>
         <w:t xml:space="preserve"> </w:t>
       </w:r>
-      <w:hyperlink r:id="rId113">
+      <w:hyperlink r:id="rId121">
         <w:r>
           <w:rPr>
             <w:rStyle w:val="Hyperlink"/>
@@ -43807,8 +44375,8 @@
         <w:t xml:space="preserve">.</w:t>
       </w:r>
     </w:p>
-    <w:bookmarkEnd w:id="114"/>
-    <w:bookmarkStart w:id="115" w:name="sol-ols-slope-r"/>
+    <w:bookmarkEnd w:id="122"/>
+    <w:bookmarkStart w:id="123" w:name="sol-ols-slope-r"/>
     <w:p>
       <w:pPr>
         <w:pStyle w:val="BodyText"/>
@@ -43818,7 +44386,7 @@
           <w:i/>
           <w:iCs/>
         </w:rPr>
-        <w:t xml:space="preserve">Solution 15</w:t>
+        <w:t xml:space="preserve">Solution 18</w:t>
       </w:r>
       <w:r>
         <w:t xml:space="preserve">. </w:t>
@@ -45447,8 +46015,8 @@
         </m:oMath>
       </m:oMathPara>
     </w:p>
-    <w:bookmarkEnd w:id="115"/>
-    <w:bookmarkStart w:id="116" w:name="cor-ols-slope-r"/>
+    <w:bookmarkEnd w:id="123"/>
+    <w:bookmarkStart w:id="124" w:name="cor-ols-slope-r"/>
     <w:p>
       <w:pPr>
         <w:pStyle w:val="FirstParagraph"/>
@@ -45717,7 +46285,7 @@
       <w:r>
         <w:t xml:space="preserve"> </w:t>
       </w:r>
-      <w:hyperlink r:id="rId113">
+      <w:hyperlink r:id="rId121">
         <w:r>
           <w:rPr>
             <w:rStyle w:val="Hyperlink"/>
@@ -45775,7 +46343,7 @@
         <w:t xml:space="preserve">.</w:t>
       </w:r>
     </w:p>
-    <w:bookmarkEnd w:id="116"/>
+    <w:bookmarkEnd w:id="124"/>
     <w:p>
       <w:pPr>
         <w:pStyle w:val="BodyText"/>
@@ -45801,7 +46369,7 @@
           <w:rPr>
             <w:rStyle w:val="Hyperlink"/>
           </w:rPr>
-          <w:t xml:space="preserve">Exercise 15</w:t>
+          <w:t xml:space="preserve">Exercise 18</w:t>
         </w:r>
       </w:hyperlink>
       <w:r>
@@ -45849,18 +46417,18 @@
                 <wp:inline>
                   <wp:extent cx="152400" cy="152400"/>
                   <wp:effectExtent b="0" l="0" r="0" t="0"/>
-                  <wp:docPr descr="" title="" id="118" name="Picture"/>
+                  <wp:docPr descr="" title="" id="126" name="Picture"/>
                   <a:graphic>
                     <a:graphicData uri="http://schemas.openxmlformats.org/drawingml/2006/picture">
                       <pic:pic>
                         <pic:nvPicPr>
-                          <pic:cNvPr descr="/opt/quarto/share/formats/docx/tip.png" id="119" name="Picture"/>
+                          <pic:cNvPr descr="/opt/quarto/share/formats/docx/tip.png" id="127" name="Picture"/>
                           <pic:cNvPicPr>
                             <a:picLocks noChangeArrowheads="1" noChangeAspect="1"/>
                           </pic:cNvPicPr>
                         </pic:nvPicPr>
                         <pic:blipFill>
-                          <a:blip r:embed="rId117"/>
+                          <a:blip r:embed="rId125"/>
                           <a:stretch>
                             <a:fillRect/>
                           </a:stretch>
@@ -45922,7 +46490,7 @@
             <w:r>
               <w:t xml:space="preserve"> </w:t>
             </w:r>
-            <w:hyperlink r:id="rId120">
+            <w:hyperlink r:id="rId128">
               <w:r>
                 <w:rPr>
                   <w:rStyle w:val="Hyperlink"/>
@@ -45966,7 +46534,7 @@
             <w:r>
               <w:t xml:space="preserve"> </w:t>
             </w:r>
-            <w:hyperlink r:id="rId121">
+            <w:hyperlink r:id="rId129">
               <w:r>
                 <w:rPr>
                   <w:rStyle w:val="Hyperlink"/>
@@ -46036,8 +46604,8 @@
         <w:t xml:space="preserve">covers slope and intercept properties.</w:t>
       </w:r>
     </w:p>
-    <w:bookmarkEnd w:id="122"/>
-    <w:bookmarkStart w:id="128" w:name="sec-slr-R"/>
+    <w:bookmarkEnd w:id="130"/>
+    <w:bookmarkStart w:id="136" w:name="sec-slr-R"/>
     <w:p>
       <w:pPr>
         <w:pStyle w:val="Heading3"/>
@@ -46046,7 +46614,7 @@
         <w:t xml:space="preserve">3.3 Fitting a simple linear regression in R</w:t>
       </w:r>
     </w:p>
-    <w:bookmarkStart w:id="127" w:name="exm-hers-slr"/>
+    <w:bookmarkStart w:id="135" w:name="exm-hers-slr"/>
     <w:p>
       <w:pPr>
         <w:pStyle w:val="FirstParagraph"/>
@@ -47333,7 +47901,7 @@
       <w:tr>
         <w:tc>
           <w:tcPr/>
-          <w:bookmarkStart w:id="126" w:name="fig-hers-slr"/>
+          <w:bookmarkStart w:id="134" w:name="fig-hers-slr"/>
           <w:p>
             <w:pPr>
               <w:pStyle w:val="SourceCode"/>
@@ -47712,18 +48280,18 @@
                 <wp:inline>
                   <wp:extent cx="4620126" cy="3696101"/>
                   <wp:effectExtent b="0" l="0" r="0" t="0"/>
-                  <wp:docPr descr="" title="" id="124" name="Picture"/>
+                  <wp:docPr descr="" title="" id="132" name="Picture"/>
                   <a:graphic>
                     <a:graphicData uri="http://schemas.openxmlformats.org/drawingml/2006/picture">
                       <pic:pic>
                         <pic:nvPicPr>
-                          <pic:cNvPr descr="correlation-regression_files/figure-docx/unnamed-chunk-9-1.png" id="125" name="Picture"/>
+                          <pic:cNvPr descr="correlation-regression_files/figure-docx/unnamed-chunk-9-1.png" id="133" name="Picture"/>
                           <pic:cNvPicPr>
                             <a:picLocks noChangeArrowheads="1" noChangeAspect="1"/>
                           </pic:cNvPicPr>
                         </pic:nvPicPr>
                         <pic:blipFill>
-                          <a:blip r:embed="rId123"/>
+                          <a:blip r:embed="rId131"/>
                           <a:stretch>
                             <a:fillRect/>
                           </a:stretch>
@@ -47763,7 +48331,7 @@
               <w:t xml:space="preserve">Figure 4: Fasting glucose against BMI in HERS, with the OLS line</w:t>
             </w:r>
           </w:p>
-          <w:bookmarkEnd w:id="126"/>
+          <w:bookmarkEnd w:id="134"/>
         </w:tc>
       </w:tr>
     </w:tbl>
@@ -47877,9 +48445,9 @@
         <w:t xml:space="preserve">.</w:t>
       </w:r>
     </w:p>
-    <w:bookmarkEnd w:id="127"/>
-    <w:bookmarkEnd w:id="128"/>
-    <w:bookmarkStart w:id="142" w:name="sec-r-squared"/>
+    <w:bookmarkEnd w:id="135"/>
+    <w:bookmarkEnd w:id="136"/>
+    <w:bookmarkStart w:id="150" w:name="sec-r-squared"/>
     <w:p>
       <w:pPr>
         <w:pStyle w:val="Heading3"/>
@@ -47888,7 +48456,7 @@
         <w:t xml:space="preserve">3.4 The coefficient of determination</w:t>
       </w:r>
     </w:p>
-    <w:bookmarkStart w:id="129" w:name="def-tss"/>
+    <w:bookmarkStart w:id="137" w:name="def-tss"/>
     <w:p>
       <w:pPr>
         <w:pStyle w:val="FirstParagraph"/>
@@ -48115,8 +48683,8 @@
         <w:t xml:space="preserve">.</w:t>
       </w:r>
     </w:p>
-    <w:bookmarkEnd w:id="129"/>
-    <w:bookmarkStart w:id="130" w:name="exm-tss"/>
+    <w:bookmarkEnd w:id="137"/>
+    <w:bookmarkStart w:id="138" w:name="exm-tss"/>
     <w:p>
       <w:pPr>
         <w:pStyle w:val="BodyText"/>
@@ -48460,8 +49028,8 @@
         </m:oMath>
       </m:oMathPara>
     </w:p>
-    <w:bookmarkEnd w:id="130"/>
-    <w:bookmarkStart w:id="131" w:name="def-r-squared"/>
+    <w:bookmarkEnd w:id="138"/>
+    <w:bookmarkStart w:id="139" w:name="def-r-squared"/>
     <w:p>
       <w:pPr>
         <w:pStyle w:val="FirstParagraph"/>
@@ -48579,8 +49147,8 @@
         <w:t xml:space="preserve">.</w:t>
       </w:r>
     </w:p>
-    <w:bookmarkEnd w:id="131"/>
-    <w:bookmarkStart w:id="132" w:name="rem-r-squared-interpretation"/>
+    <w:bookmarkEnd w:id="139"/>
+    <w:bookmarkStart w:id="140" w:name="rem-r-squared-interpretation"/>
     <w:p>
       <w:pPr>
         <w:pStyle w:val="BodyText"/>
@@ -48641,8 +49209,8 @@
         <w:t xml:space="preserve">.</w:t>
       </w:r>
     </w:p>
-    <w:bookmarkEnd w:id="132"/>
-    <w:bookmarkStart w:id="133" w:name="exr-rss-ols-fit"/>
+    <w:bookmarkEnd w:id="140"/>
+    <w:bookmarkStart w:id="141" w:name="exr-rss-ols-fit"/>
     <w:p>
       <w:pPr>
         <w:pStyle w:val="BodyText"/>
@@ -48652,7 +49220,7 @@
           <w:b/>
           <w:bCs/>
         </w:rPr>
-        <w:t xml:space="preserve">Exercise 16 (Residual sum of squares of the OLS fit)</w:t>
+        <w:t xml:space="preserve">Exercise 19 (Residual sum of squares of the OLS fit)</w:t>
       </w:r>
       <w:r>
         <w:t xml:space="preserve"> </w:t>
@@ -48949,8 +49517,8 @@
         <w:t xml:space="preserve">.</w:t>
       </w:r>
     </w:p>
-    <w:bookmarkEnd w:id="133"/>
-    <w:bookmarkStart w:id="135" w:name="sol-rss-ols-fit"/>
+    <w:bookmarkEnd w:id="141"/>
+    <w:bookmarkStart w:id="143" w:name="sol-rss-ols-fit"/>
     <w:p>
       <w:pPr>
         <w:pStyle w:val="BodyText"/>
@@ -48960,7 +49528,7 @@
           <w:i/>
           <w:iCs/>
         </w:rPr>
-        <w:t xml:space="preserve">Solution 16</w:t>
+        <w:t xml:space="preserve">Solution 19</w:t>
       </w:r>
       <w:r>
         <w:t xml:space="preserve">. </w:t>
@@ -48971,7 +49539,7 @@
       <w:r>
         <w:t xml:space="preserve"> </w:t>
       </w:r>
-      <w:hyperlink r:id="rId134">
+      <w:hyperlink r:id="rId142">
         <w:r>
           <w:rPr>
             <w:rStyle w:val="Hyperlink"/>
@@ -53073,8 +53641,8 @@
         </m:oMath>
       </m:oMathPara>
     </w:p>
-    <w:bookmarkEnd w:id="135"/>
-    <w:bookmarkStart w:id="136" w:name="lem-rss-ols-fit"/>
+    <w:bookmarkEnd w:id="143"/>
+    <w:bookmarkStart w:id="144" w:name="lem-rss-ols-fit"/>
     <w:p>
       <w:pPr>
         <w:pStyle w:val="FirstParagraph"/>
@@ -53384,7 +53952,7 @@
         </m:oMath>
       </m:oMathPara>
     </w:p>
-    <w:bookmarkEnd w:id="136"/>
+    <w:bookmarkEnd w:id="144"/>
     <w:p>
       <w:pPr>
         <w:pStyle w:val="FirstParagraph"/>
@@ -53410,14 +53978,14 @@
           <w:rPr>
             <w:rStyle w:val="Hyperlink"/>
           </w:rPr>
-          <w:t xml:space="preserve">Exercise 16</w:t>
+          <w:t xml:space="preserve">Exercise 19</w:t>
         </w:r>
       </w:hyperlink>
       <w:r>
         <w:t xml:space="preserve">.</w:t>
       </w:r>
     </w:p>
-    <w:bookmarkStart w:id="137" w:name="exr-r-squared-slr"/>
+    <w:bookmarkStart w:id="145" w:name="exr-r-squared-slr"/>
     <w:p>
       <w:pPr>
         <w:pStyle w:val="BodyText"/>
@@ -53427,7 +53995,7 @@
           <w:b/>
           <w:bCs/>
         </w:rPr>
-        <w:t xml:space="preserve">Exercise 17 (</w:t>
+        <w:t xml:space="preserve">Exercise 20 (</w:t>
       </w:r>
       <m:oMath>
         <m:sSup>
@@ -53558,7 +54126,7 @@
           <w:rPr>
             <w:rStyle w:val="Hyperlink"/>
           </w:rPr>
-          <w:t xml:space="preserve">Exercise 16</w:t>
+          <w:t xml:space="preserve">Exercise 19</w:t>
         </w:r>
       </w:hyperlink>
       <w:r>
@@ -53674,8 +54242,8 @@
         <w:t xml:space="preserve">.</w:t>
       </w:r>
     </w:p>
-    <w:bookmarkEnd w:id="137"/>
-    <w:bookmarkStart w:id="139" w:name="sol-r-squared-slr"/>
+    <w:bookmarkEnd w:id="145"/>
+    <w:bookmarkStart w:id="147" w:name="sol-r-squared-slr"/>
     <w:p>
       <w:pPr>
         <w:pStyle w:val="BodyText"/>
@@ -53685,7 +54253,7 @@
           <w:i/>
           <w:iCs/>
         </w:rPr>
-        <w:t xml:space="preserve">Solution 17</w:t>
+        <w:t xml:space="preserve">Solution 20</w:t>
       </w:r>
       <w:r>
         <w:t xml:space="preserve">. </w:t>
@@ -53761,7 +54329,7 @@
           <w:rPr>
             <w:rStyle w:val="Hyperlink"/>
           </w:rPr>
-          <w:t xml:space="preserve">Exercise 16</w:t>
+          <w:t xml:space="preserve">Exercise 19</w:t>
         </w:r>
       </w:hyperlink>
       <w:r>
@@ -53850,7 +54418,7 @@
       <w:r>
         <w:t xml:space="preserve">(</w:t>
       </w:r>
-      <w:hyperlink r:id="rId138">
+      <w:hyperlink r:id="rId146">
         <w:r>
           <w:rPr>
             <w:rStyle w:val="Hyperlink"/>
@@ -53900,8 +54468,8 @@
         <w:t xml:space="preserve">.</w:t>
       </w:r>
     </w:p>
-    <w:bookmarkEnd w:id="139"/>
-    <w:bookmarkStart w:id="140" w:name="thm-r-squared-slr"/>
+    <w:bookmarkEnd w:id="147"/>
+    <w:bookmarkStart w:id="148" w:name="thm-r-squared-slr"/>
     <w:p>
       <w:pPr>
         <w:pStyle w:val="BodyText"/>
@@ -54229,7 +54797,7 @@
         </m:oMath>
       </m:oMathPara>
     </w:p>
-    <w:bookmarkEnd w:id="140"/>
+    <w:bookmarkEnd w:id="148"/>
     <w:p>
       <w:pPr>
         <w:pStyle w:val="FirstParagraph"/>
@@ -54255,7 +54823,7 @@
           <w:rPr>
             <w:rStyle w:val="Hyperlink"/>
           </w:rPr>
-          <w:t xml:space="preserve">Exercise 17</w:t>
+          <w:t xml:space="preserve">Exercise 20</w:t>
         </w:r>
       </w:hyperlink>
       <w:r>
@@ -54282,7 +54850,7 @@
         <w:t xml:space="preserve">.</w:t>
       </w:r>
     </w:p>
-    <w:bookmarkStart w:id="141" w:name="exm-hers-r-squared"/>
+    <w:bookmarkStart w:id="149" w:name="exm-hers-r-squared"/>
     <w:p>
       <w:pPr>
         <w:pStyle w:val="BodyText"/>
@@ -54837,7 +55405,7 @@
         <w:t xml:space="preserve">variation in baseline fasting glucose.</w:t>
       </w:r>
     </w:p>
-    <w:bookmarkEnd w:id="141"/>
+    <w:bookmarkEnd w:id="149"/>
     <w:p>
       <w:pPr>
         <w:pStyle w:val="Compact"/>
@@ -54874,8 +55442,8 @@
         <w:t xml:space="preserve">covers assessing the fit of a regression line.</w:t>
       </w:r>
     </w:p>
-    <w:bookmarkEnd w:id="142"/>
-    <w:bookmarkStart w:id="158" w:name="sec-partial-f"/>
+    <w:bookmarkEnd w:id="150"/>
+    <w:bookmarkStart w:id="166" w:name="sec-partial-f"/>
     <w:p>
       <w:pPr>
         <w:pStyle w:val="Heading3"/>
@@ -54884,7 +55452,7 @@
         <w:t xml:space="preserve">3.5 Comparing nested regression models</w:t>
       </w:r>
     </w:p>
-    <w:bookmarkStart w:id="143" w:name="def-nested-regression-models"/>
+    <w:bookmarkStart w:id="151" w:name="def-nested-regression-models"/>
     <w:p>
       <w:pPr>
         <w:pStyle w:val="FirstParagraph"/>
@@ -55111,8 +55679,8 @@
         <w:t xml:space="preserve">.</w:t>
       </w:r>
     </w:p>
-    <w:bookmarkEnd w:id="143"/>
-    <w:bookmarkStart w:id="144" w:name="exm-hers-nested-models"/>
+    <w:bookmarkEnd w:id="151"/>
+    <w:bookmarkStart w:id="152" w:name="exm-hers-nested-models"/>
     <w:p>
       <w:pPr>
         <w:pStyle w:val="BodyText"/>
@@ -55805,8 +56373,8 @@
         <w:t xml:space="preserve">in the larger one.</w:t>
       </w:r>
     </w:p>
-    <w:bookmarkEnd w:id="144"/>
-    <w:bookmarkStart w:id="148" w:name="def-partial-f-test"/>
+    <w:bookmarkEnd w:id="152"/>
+    <w:bookmarkStart w:id="156" w:name="def-partial-f-test"/>
     <w:p>
       <w:pPr>
         <w:pStyle w:val="BodyText"/>
@@ -56124,7 +56692,7 @@
       <w:r>
         <w:t xml:space="preserve"> </w:t>
       </w:r>
-      <w:hyperlink r:id="rId145">
+      <w:hyperlink r:id="rId153">
         <w:r>
           <w:rPr>
             <w:rStyle w:val="Hyperlink"/>
@@ -56306,7 +56874,7 @@
       <w:r>
         <w:t xml:space="preserve"> </w:t>
       </w:r>
-      <w:hyperlink r:id="rId146">
+      <w:hyperlink r:id="rId154">
         <w:r>
           <w:rPr>
             <w:rStyle w:val="Hyperlink"/>
@@ -56455,7 +57023,7 @@
       <w:r>
         <w:t xml:space="preserve">distribution (</w:t>
       </w:r>
-      <w:hyperlink r:id="rId147">
+      <w:hyperlink r:id="rId155">
         <w:r>
           <w:rPr>
             <w:rStyle w:val="Hyperlink"/>
@@ -56496,8 +57064,8 @@
         <w:t xml:space="preserve">.</w:t>
       </w:r>
     </w:p>
-    <w:bookmarkEnd w:id="148"/>
-    <w:bookmarkStart w:id="150" w:name="thm-partial-f-null"/>
+    <w:bookmarkEnd w:id="156"/>
+    <w:bookmarkStart w:id="158" w:name="thm-partial-f-null"/>
     <w:p>
       <w:pPr>
         <w:pStyle w:val="BodyText"/>
@@ -56535,7 +57103,7 @@
       <w:r>
         <w:t xml:space="preserve"> </w:t>
       </w:r>
-      <w:hyperlink r:id="rId149">
+      <w:hyperlink r:id="rId157">
         <w:r>
           <w:rPr>
             <w:rStyle w:val="Hyperlink"/>
@@ -56755,7 +57323,7 @@
         <w:t xml:space="preserve">.</w:t>
       </w:r>
     </w:p>
-    <w:bookmarkEnd w:id="150"/>
+    <w:bookmarkEnd w:id="158"/>
     <w:p>
       <w:pPr>
         <w:pStyle w:val="BodyText"/>
@@ -57049,7 +57617,7 @@
       <w:r>
         <w:t xml:space="preserve"> </w:t>
       </w:r>
-      <w:hyperlink r:id="rId149">
+      <w:hyperlink r:id="rId157">
         <w:r>
           <w:rPr>
             <w:rStyle w:val="Hyperlink"/>
@@ -57096,7 +57664,7 @@
       <w:r>
         <w:t xml:space="preserve"> </w:t>
       </w:r>
-      <w:hyperlink r:id="rId151">
+      <w:hyperlink r:id="rId159">
         <w:r>
           <w:rPr>
             <w:rStyle w:val="Hyperlink"/>
@@ -57127,7 +57695,7 @@
       <w:r>
         <w:t xml:space="preserve"> </w:t>
       </w:r>
-      <w:hyperlink r:id="rId134">
+      <w:hyperlink r:id="rId142">
         <w:r>
           <w:rPr>
             <w:rStyle w:val="Hyperlink"/>
@@ -57284,7 +57852,7 @@
       <w:r>
         <w:t xml:space="preserve"> </w:t>
       </w:r>
-      <w:hyperlink r:id="rId147">
+      <w:hyperlink r:id="rId155">
         <w:r>
           <w:rPr>
             <w:rStyle w:val="Hyperlink"/>
@@ -57296,7 +57864,7 @@
         <w:t xml:space="preserve">.</w:t>
       </w:r>
     </w:p>
-    <w:bookmarkStart w:id="152" w:name="exm-hers-partial-f"/>
+    <w:bookmarkStart w:id="160" w:name="exm-hers-partial-f"/>
     <w:p>
       <w:pPr>
         <w:pStyle w:val="BodyText"/>
@@ -57794,7 +58362,7 @@
       <w:r>
         <w:t xml:space="preserve"> </w:t>
       </w:r>
-      <w:hyperlink r:id="rId145">
+      <w:hyperlink r:id="rId153">
         <w:r>
           <w:rPr>
             <w:rStyle w:val="Hyperlink"/>
@@ -58490,8 +59058,8 @@
         <w:t xml:space="preserve">at the 5% level.</w:t>
       </w:r>
     </w:p>
-    <w:bookmarkEnd w:id="152"/>
-    <w:bookmarkStart w:id="157" w:name="rem-partial-f-lrt"/>
+    <w:bookmarkEnd w:id="160"/>
+    <w:bookmarkStart w:id="165" w:name="rem-partial-f-lrt"/>
     <w:p>
       <w:pPr>
         <w:pStyle w:val="BodyText"/>
@@ -58518,7 +59086,7 @@
       <w:r>
         <w:t xml:space="preserve"> </w:t>
       </w:r>
-      <w:hyperlink r:id="rId153">
+      <w:hyperlink r:id="rId161">
         <w:r>
           <w:rPr>
             <w:rStyle w:val="Hyperlink"/>
@@ -58611,7 +59179,7 @@
       <w:r>
         <w:t xml:space="preserve"> </w:t>
       </w:r>
-      <w:hyperlink r:id="rId154">
+      <w:hyperlink r:id="rId162">
         <w:r>
           <w:rPr>
             <w:rStyle w:val="Hyperlink"/>
@@ -58727,7 +59295,7 @@
       <w:r>
         <w:t xml:space="preserve"> </w:t>
       </w:r>
-      <w:hyperlink r:id="rId155">
+      <w:hyperlink r:id="rId163">
         <w:r>
           <w:rPr>
             <w:rStyle w:val="Hyperlink"/>
@@ -58744,7 +59312,7 @@
       <w:r>
         <w:t xml:space="preserve"> </w:t>
       </w:r>
-      <w:hyperlink r:id="rId156">
+      <w:hyperlink r:id="rId164">
         <w:r>
           <w:rPr>
             <w:rStyle w:val="Hyperlink"/>
@@ -59658,7 +60226,7 @@
       <w:r>
         <w:t xml:space="preserve"> </w:t>
       </w:r>
-      <w:hyperlink r:id="rId155">
+      <w:hyperlink r:id="rId163">
         <w:r>
           <w:rPr>
             <w:rStyle w:val="Hyperlink"/>
@@ -59673,9 +60241,9 @@
         <w:t xml:space="preserve">holds only approximately.</w:t>
       </w:r>
     </w:p>
-    <w:bookmarkEnd w:id="157"/>
-    <w:bookmarkEnd w:id="158"/>
-    <w:bookmarkStart w:id="160" w:name="further-reading"/>
+    <w:bookmarkEnd w:id="165"/>
+    <w:bookmarkEnd w:id="166"/>
+    <w:bookmarkStart w:id="168" w:name="further-reading"/>
     <w:p>
       <w:pPr>
         <w:pStyle w:val="Heading3"/>
@@ -59688,7 +60256,7 @@
       <w:pPr>
         <w:pStyle w:val="FirstParagraph"/>
       </w:pPr>
-      <w:hyperlink r:id="rId159">
+      <w:hyperlink r:id="rId167">
         <w:r>
           <w:rPr>
             <w:rStyle w:val="Hyperlink"/>
@@ -59721,9 +60289,9 @@
         <w:t xml:space="preserve">cover linear regression in Chapter 4.</w:t>
       </w:r>
     </w:p>
-    <w:bookmarkEnd w:id="160"/>
-    <w:bookmarkEnd w:id="161"/>
-    <w:bookmarkStart w:id="191" w:name="references"/>
+    <w:bookmarkEnd w:id="168"/>
+    <w:bookmarkEnd w:id="169"/>
+    <w:bookmarkStart w:id="199" w:name="references"/>
     <w:p>
       <w:pPr>
         <w:pStyle w:val="Heading2"/>
@@ -59732,8 +60300,8 @@
         <w:t xml:space="preserve">References</w:t>
       </w:r>
     </w:p>
-    <w:bookmarkStart w:id="190" w:name="refs"/>
-    <w:bookmarkStart w:id="163" w:name="ref-vittinghoff2e"/>
+    <w:bookmarkStart w:id="198" w:name="refs"/>
+    <w:bookmarkStart w:id="171" w:name="ref-vittinghoff2e"/>
     <w:p>
       <w:pPr>
         <w:pStyle w:val="Bibliography"/>
@@ -59766,7 +60334,7 @@
       <w:r>
         <w:t xml:space="preserve"> </w:t>
       </w:r>
-      <w:hyperlink r:id="rId162">
+      <w:hyperlink r:id="rId170">
         <w:r>
           <w:rPr>
             <w:rStyle w:val="Hyperlink"/>
@@ -59778,8 +60346,8 @@
         <w:t xml:space="preserve">.</w:t>
       </w:r>
     </w:p>
-    <w:bookmarkEnd w:id="163"/>
-    <w:bookmarkStart w:id="165" w:name="X9c68751dcff429bb8eebfb08e71b6f746222990"/>
+    <w:bookmarkEnd w:id="171"/>
+    <w:bookmarkStart w:id="173" w:name="X9c68751dcff429bb8eebfb08e71b6f746222990"/>
     <w:p>
       <w:pPr>
         <w:pStyle w:val="Bibliography"/>
@@ -59826,7 +60394,7 @@
       <w:r>
         <w:t xml:space="preserve"> </w:t>
       </w:r>
-      <w:hyperlink r:id="rId164">
+      <w:hyperlink r:id="rId172">
         <w:r>
           <w:rPr>
             <w:rStyle w:val="Hyperlink"/>
@@ -59835,8 +60403,8 @@
         </w:r>
       </w:hyperlink>
     </w:p>
-    <w:bookmarkEnd w:id="165"/>
-    <w:bookmarkStart w:id="166" w:name="ref-hoggtanis2015"/>
+    <w:bookmarkEnd w:id="173"/>
+    <w:bookmarkStart w:id="174" w:name="ref-hoggtanis2015"/>
     <w:p>
       <w:pPr>
         <w:pStyle w:val="Bibliography"/>
@@ -59867,8 +60435,8 @@
         <w:t xml:space="preserve">, Tenth edition. Boston: Pearson, 2019.</w:t>
       </w:r>
     </w:p>
-    <w:bookmarkEnd w:id="166"/>
-    <w:bookmarkStart w:id="167" w:name="ref-rice2007mathematical"/>
+    <w:bookmarkEnd w:id="174"/>
+    <w:bookmarkStart w:id="175" w:name="ref-rice2007mathematical"/>
     <w:p>
       <w:pPr>
         <w:pStyle w:val="Bibliography"/>
@@ -59899,8 +60467,8 @@
         <w:t xml:space="preserve">, 3rd ed. Belmont, CA: Cengage Learning, 2007.</w:t>
       </w:r>
     </w:p>
-    <w:bookmarkEnd w:id="167"/>
-    <w:bookmarkStart w:id="169" w:name="Xa16f107eac264c6362bfc3672301bd764727388"/>
+    <w:bookmarkEnd w:id="175"/>
+    <w:bookmarkStart w:id="177" w:name="Xa16f107eac264c6362bfc3672301bd764727388"/>
     <w:p>
       <w:pPr>
         <w:pStyle w:val="Bibliography"/>
@@ -59947,7 +60515,7 @@
       <w:r>
         <w:t xml:space="preserve"> </w:t>
       </w:r>
-      <w:hyperlink r:id="rId168">
+      <w:hyperlink r:id="rId176">
         <w:r>
           <w:rPr>
             <w:rStyle w:val="Hyperlink"/>
@@ -59956,8 +60524,8 @@
         </w:r>
       </w:hyperlink>
     </w:p>
-    <w:bookmarkEnd w:id="169"/>
-    <w:bookmarkStart w:id="171" w:name="X77ec95df2e524293cd476e93fa6c354ef0dc636"/>
+    <w:bookmarkEnd w:id="177"/>
+    <w:bookmarkStart w:id="179" w:name="X77ec95df2e524293cd476e93fa6c354ef0dc636"/>
     <w:p>
       <w:pPr>
         <w:pStyle w:val="Bibliography"/>
@@ -60004,7 +60572,7 @@
       <w:r>
         <w:t xml:space="preserve"> </w:t>
       </w:r>
-      <w:hyperlink r:id="rId170">
+      <w:hyperlink r:id="rId178">
         <w:r>
           <w:rPr>
             <w:rStyle w:val="Hyperlink"/>
@@ -60013,8 +60581,8 @@
         </w:r>
       </w:hyperlink>
     </w:p>
-    <w:bookmarkEnd w:id="171"/>
-    <w:bookmarkStart w:id="173" w:name="ref-wikipedia_linear_regression"/>
+    <w:bookmarkEnd w:id="179"/>
+    <w:bookmarkStart w:id="181" w:name="ref-wikipedia_linear_regression"/>
     <w:p>
       <w:pPr>
         <w:pStyle w:val="Bibliography"/>
@@ -60061,7 +60629,7 @@
       <w:r>
         <w:t xml:space="preserve"> </w:t>
       </w:r>
-      <w:hyperlink r:id="rId172">
+      <w:hyperlink r:id="rId180">
         <w:r>
           <w:rPr>
             <w:rStyle w:val="Hyperlink"/>
@@ -60070,8 +60638,8 @@
         </w:r>
       </w:hyperlink>
     </w:p>
-    <w:bookmarkEnd w:id="173"/>
-    <w:bookmarkStart w:id="175" w:name="ref-wikipedia_simple_linear_regression"/>
+    <w:bookmarkEnd w:id="181"/>
+    <w:bookmarkStart w:id="183" w:name="ref-wikipedia_simple_linear_regression"/>
     <w:p>
       <w:pPr>
         <w:pStyle w:val="Bibliography"/>
@@ -60118,7 +60686,7 @@
       <w:r>
         <w:t xml:space="preserve"> </w:t>
       </w:r>
-      <w:hyperlink r:id="rId174">
+      <w:hyperlink r:id="rId182">
         <w:r>
           <w:rPr>
             <w:rStyle w:val="Hyperlink"/>
@@ -60127,8 +60695,8 @@
         </w:r>
       </w:hyperlink>
     </w:p>
-    <w:bookmarkEnd w:id="175"/>
-    <w:bookmarkStart w:id="177" w:name="ref-wikipedia_residual_sum_of_squares"/>
+    <w:bookmarkEnd w:id="183"/>
+    <w:bookmarkStart w:id="185" w:name="ref-wikipedia_residual_sum_of_squares"/>
     <w:p>
       <w:pPr>
         <w:pStyle w:val="Bibliography"/>
@@ -60175,7 +60743,7 @@
       <w:r>
         <w:t xml:space="preserve"> </w:t>
       </w:r>
-      <w:hyperlink r:id="rId176">
+      <w:hyperlink r:id="rId184">
         <w:r>
           <w:rPr>
             <w:rStyle w:val="Hyperlink"/>
@@ -60184,8 +60752,8 @@
         </w:r>
       </w:hyperlink>
     </w:p>
-    <w:bookmarkEnd w:id="177"/>
-    <w:bookmarkStart w:id="179" w:name="ref-wikipedia_ordinary_least_squares"/>
+    <w:bookmarkEnd w:id="185"/>
+    <w:bookmarkStart w:id="187" w:name="ref-wikipedia_ordinary_least_squares"/>
     <w:p>
       <w:pPr>
         <w:pStyle w:val="Bibliography"/>
@@ -60232,7 +60800,7 @@
       <w:r>
         <w:t xml:space="preserve"> </w:t>
       </w:r>
-      <w:hyperlink r:id="rId178">
+      <w:hyperlink r:id="rId186">
         <w:r>
           <w:rPr>
             <w:rStyle w:val="Hyperlink"/>
@@ -60241,8 +60809,8 @@
         </w:r>
       </w:hyperlink>
     </w:p>
-    <w:bookmarkEnd w:id="179"/>
-    <w:bookmarkStart w:id="181" w:name="ref-hutchinson_wwu_ml_videos"/>
+    <w:bookmarkEnd w:id="187"/>
+    <w:bookmarkStart w:id="189" w:name="ref-hutchinson_wwu_ml_videos"/>
     <w:p>
       <w:pPr>
         <w:pStyle w:val="Bibliography"/>
@@ -60295,7 +60863,7 @@
       <w:r>
         <w:t xml:space="preserve"> </w:t>
       </w:r>
-      <w:hyperlink r:id="rId180">
+      <w:hyperlink r:id="rId188">
         <w:r>
           <w:rPr>
             <w:rStyle w:val="Hyperlink"/>
@@ -60304,8 +60872,8 @@
         </w:r>
       </w:hyperlink>
     </w:p>
-    <w:bookmarkEnd w:id="181"/>
-    <w:bookmarkStart w:id="183" w:name="ref-CaseBerg01"/>
+    <w:bookmarkEnd w:id="189"/>
+    <w:bookmarkStart w:id="191" w:name="ref-CaseBerg01"/>
     <w:p>
       <w:pPr>
         <w:pStyle w:val="Bibliography"/>
@@ -60338,7 +60906,7 @@
       <w:r>
         <w:t xml:space="preserve"> </w:t>
       </w:r>
-      <w:hyperlink r:id="rId182">
+      <w:hyperlink r:id="rId190">
         <w:r>
           <w:rPr>
             <w:rStyle w:val="Hyperlink"/>
@@ -60347,8 +60915,8 @@
         </w:r>
       </w:hyperlink>
     </w:p>
-    <w:bookmarkEnd w:id="183"/>
-    <w:bookmarkStart w:id="185" w:name="ref-wikipedia_total_sum_of_squares"/>
+    <w:bookmarkEnd w:id="191"/>
+    <w:bookmarkStart w:id="193" w:name="ref-wikipedia_total_sum_of_squares"/>
     <w:p>
       <w:pPr>
         <w:pStyle w:val="Bibliography"/>
@@ -60395,7 +60963,7 @@
       <w:r>
         <w:t xml:space="preserve"> </w:t>
       </w:r>
-      <w:hyperlink r:id="rId184">
+      <w:hyperlink r:id="rId192">
         <w:r>
           <w:rPr>
             <w:rStyle w:val="Hyperlink"/>
@@ -60404,8 +60972,8 @@
         </w:r>
       </w:hyperlink>
     </w:p>
-    <w:bookmarkEnd w:id="185"/>
-    <w:bookmarkStart w:id="187" w:name="X0d0d355937664870ae38fa71453bbcd35dcecab"/>
+    <w:bookmarkEnd w:id="193"/>
+    <w:bookmarkStart w:id="195" w:name="X0d0d355937664870ae38fa71453bbcd35dcecab"/>
     <w:p>
       <w:pPr>
         <w:pStyle w:val="Bibliography"/>
@@ -60452,7 +61020,7 @@
       <w:r>
         <w:t xml:space="preserve"> </w:t>
       </w:r>
-      <w:hyperlink r:id="rId186">
+      <w:hyperlink r:id="rId194">
         <w:r>
           <w:rPr>
             <w:rStyle w:val="Hyperlink"/>
@@ -60461,8 +61029,8 @@
         </w:r>
       </w:hyperlink>
     </w:p>
-    <w:bookmarkEnd w:id="187"/>
-    <w:bookmarkStart w:id="189" w:name="ref-dobson4e"/>
+    <w:bookmarkEnd w:id="195"/>
+    <w:bookmarkStart w:id="197" w:name="ref-dobson4e"/>
     <w:p>
       <w:pPr>
         <w:pStyle w:val="Bibliography"/>
@@ -60495,7 +61063,7 @@
       <w:r>
         <w:t xml:space="preserve"> </w:t>
       </w:r>
-      <w:hyperlink r:id="rId188">
+      <w:hyperlink r:id="rId196">
         <w:r>
           <w:rPr>
             <w:rStyle w:val="Hyperlink"/>
@@ -60507,9 +61075,9 @@
         <w:t xml:space="preserve">.</w:t>
       </w:r>
     </w:p>
-    <w:bookmarkEnd w:id="189"/>
-    <w:bookmarkEnd w:id="190"/>
-    <w:bookmarkEnd w:id="191"/>
+    <w:bookmarkEnd w:id="197"/>
+    <w:bookmarkEnd w:id="198"/>
+    <w:bookmarkEnd w:id="199"/>
     <w:sectPr>
       <w:footnotePr>
         <w:numRestart w:val="eachSect"/>

</xml_diff>

<commit_message>
Deploying to gh-pages from @ Morrison-Lab/sds@657d4f5d39665b416b958b16db0f6649d3a940e0 🚀
</commit_message>
<xml_diff>
--- a/correlation-regression-handout.docx
+++ b/correlation-regression-handout.docx
@@ -15,7 +15,7 @@
         <w:pStyle w:val="Date"/>
       </w:pPr>
       <w:r>
-        <w:t xml:space="preserve">Last modified: 2026-10-27 16:11:29 (PDT)</w:t>
+        <w:t xml:space="preserve">Last modified: 2026-10-27 19:56:56 (PDT)</w:t>
       </w:r>
     </w:p>
     <w:p>
@@ -20842,7 +20842,7 @@
         <w:pStyle w:val="FirstParagraph"/>
       </w:pPr>
       <w:r>
-        <w:t xml:space="preserve">The inner derivative:</w:t>
+        <w:t xml:space="preserve">The inner derivative is:</w:t>
       </w:r>
     </w:p>
     <w:p>
@@ -21311,7 +21311,7 @@
         <w:pStyle w:val="FirstParagraph"/>
       </w:pPr>
       <w:r>
-        <w:t xml:space="preserve">Plugging the inner derivative back in:</w:t>
+        <w:t xml:space="preserve">Plugging the inner derivative back in gives:</w:t>
       </w:r>
     </w:p>
     <w:p>
@@ -42953,7 +42953,24 @@
         <w:t xml:space="preserve"> </w:t>
       </w:r>
       <w:r>
-        <w:t xml:space="preserve">So:</w:t>
+        <w:t xml:space="preserve">The</w:t>
+      </w:r>
+      <w:r>
+        <w:t xml:space="preserve"> </w:t>
+      </w:r>
+      <w:hyperlink r:id="rId114">
+        <w:r>
+          <w:rPr>
+            <w:rStyle w:val="Hyperlink"/>
+          </w:rPr>
+          <w:t xml:space="preserve">Hessian</w:t>
+        </w:r>
+      </w:hyperlink>
+      <w:r>
+        <w:t xml:space="preserve"> </w:t>
+      </w:r>
+      <w:r>
+        <w:t xml:space="preserve">is then:</w:t>
       </w:r>
     </w:p>
     <w:p>
@@ -43218,7 +43235,7 @@
         <w:pStyle w:val="FirstParagraph"/>
       </w:pPr>
       <w:r>
-        <w:t xml:space="preserve">Equality would need</w:t>
+        <w:t xml:space="preserve">Equality would need the condition</w:t>
       </w:r>
       <w:r>
         <w:t xml:space="preserve"> </w:t>

</xml_diff>

<commit_message>
Deploying to gh-pages from @ Morrison-Lab/sds@f75079adc713d2781584c2c826e10df1b9202396 🚀
</commit_message>
<xml_diff>
--- a/correlation-regression-handout.docx
+++ b/correlation-regression-handout.docx
@@ -15,7 +15,7 @@
         <w:pStyle w:val="Date"/>
       </w:pPr>
       <w:r>
-        <w:t xml:space="preserve">Last modified: 2026-10-27 19:56:56 (PDT)</w:t>
+        <w:t xml:space="preserve">Last modified: 2026-10-27 22:35:55 (PDT)</w:t>
       </w:r>
     </w:p>
     <w:p>
@@ -32252,9 +32252,6 @@
                     </m:sub>
                   </m:sSub>
                   <m:r>
-                    <m:t> </m:t>
-                  </m:r>
-                  <m:r>
                     <m:rPr>
                       <m:sty m:val="p"/>
                     </m:rPr>
@@ -33235,9 +33232,6 @@
                       </m:r>
                     </m:sub>
                   </m:sSub>
-                  <m:r>
-                    <m:t> </m:t>
-                  </m:r>
                   <m:r>
                     <m:rPr>
                       <m:sty m:val="p"/>

</xml_diff>

<commit_message>
Deploying to gh-pages from @ Morrison-Lab/sds@8bbb50798317efc57e0c1777cf13a94a96f817d7 🚀
</commit_message>
<xml_diff>
--- a/correlation-regression-handout.docx
+++ b/correlation-regression-handout.docx
@@ -15,7 +15,7 @@
         <w:pStyle w:val="Date"/>
       </w:pPr>
       <w:r>
-        <w:t xml:space="preserve">Last modified: 2026-10-27 22:35:55 (PDT)</w:t>
+        <w:t xml:space="preserve">Last modified: 2026-10-27 23:24:14 (PDT)</w:t>
       </w:r>
     </w:p>
     <w:p>
@@ -3944,7 +3944,7 @@
     <w:bookmarkEnd w:id="29"/>
     <w:bookmarkEnd w:id="30"/>
     <w:bookmarkEnd w:id="31"/>
-    <w:bookmarkStart w:id="169" w:name="sec-simple-linear-regression"/>
+    <w:bookmarkStart w:id="170" w:name="sec-simple-linear-regression"/>
     <w:p>
       <w:pPr>
         <w:pStyle w:val="Heading2"/>
@@ -12175,7 +12175,7 @@
     </w:p>
     <w:bookmarkEnd w:id="49"/>
     <w:bookmarkEnd w:id="50"/>
-    <w:bookmarkStart w:id="130" w:name="sec-ols"/>
+    <w:bookmarkStart w:id="131" w:name="sec-ols"/>
     <w:p>
       <w:pPr>
         <w:pStyle w:val="Heading3"/>
@@ -23516,7 +23516,7 @@
         <w:t xml:space="preserve">.</w:t>
       </w:r>
     </w:p>
-    <w:bookmarkStart w:id="88" w:name="exr-rss-deriv-slope"/>
+    <w:bookmarkStart w:id="89" w:name="exr-rss-deriv-slope"/>
     <w:p>
       <w:pPr>
         <w:pStyle w:val="BodyText"/>
@@ -23615,7 +23615,21 @@
         <w:t xml:space="preserve"> </w:t>
       </w:r>
       <w:r>
-        <w:t xml:space="preserve">with respect to the slope,</w:t>
+        <w:t xml:space="preserve">with respect to the</w:t>
+      </w:r>
+      <w:r>
+        <w:t xml:space="preserve"> </w:t>
+      </w:r>
+      <w:hyperlink r:id="rId88">
+        <w:r>
+          <w:rPr>
+            <w:rStyle w:val="Hyperlink"/>
+          </w:rPr>
+          <w:t xml:space="preserve">slope</w:t>
+        </w:r>
+      </w:hyperlink>
+      <w:r>
+        <w:t xml:space="preserve">,</w:t>
       </w:r>
       <w:r>
         <w:t xml:space="preserve"> </w:t>
@@ -23663,8 +23677,8 @@
         <w:t xml:space="preserve">.</w:t>
       </w:r>
     </w:p>
-    <w:bookmarkEnd w:id="88"/>
-    <w:bookmarkStart w:id="89" w:name="sol-rss-deriv-slope"/>
+    <w:bookmarkEnd w:id="89"/>
+    <w:bookmarkStart w:id="90" w:name="sol-rss-deriv-slope"/>
     <w:p>
       <w:pPr>
         <w:pStyle w:val="BodyText"/>
@@ -25333,8 +25347,8 @@
         </m:oMath>
       </m:oMathPara>
     </w:p>
-    <w:bookmarkEnd w:id="89"/>
-    <w:bookmarkStart w:id="90" w:name="lem-rss-deriv-slope"/>
+    <w:bookmarkEnd w:id="90"/>
+    <w:bookmarkStart w:id="91" w:name="lem-rss-deriv-slope"/>
     <w:p>
       <w:pPr>
         <w:pStyle w:val="FirstParagraph"/>
@@ -25622,7 +25636,7 @@
         </m:oMath>
       </m:oMathPara>
     </w:p>
-    <w:bookmarkEnd w:id="90"/>
+    <w:bookmarkEnd w:id="91"/>
     <w:p>
       <w:pPr>
         <w:pStyle w:val="FirstParagraph"/>
@@ -25655,7 +25669,7 @@
         <w:t xml:space="preserve">.</w:t>
       </w:r>
     </w:p>
-    <w:bookmarkStart w:id="91" w:name="exr-solve-normal-equations"/>
+    <w:bookmarkStart w:id="92" w:name="exr-solve-normal-equations"/>
     <w:p>
       <w:pPr>
         <w:pStyle w:val="BodyText"/>
@@ -25823,8 +25837,8 @@
         <w:t xml:space="preserve">).</w:t>
       </w:r>
     </w:p>
-    <w:bookmarkEnd w:id="91"/>
-    <w:bookmarkStart w:id="92" w:name="sol-solve-normal-equations"/>
+    <w:bookmarkEnd w:id="92"/>
+    <w:bookmarkStart w:id="93" w:name="sol-solve-normal-equations"/>
     <w:p>
       <w:pPr>
         <w:pStyle w:val="BodyText"/>
@@ -30878,8 +30892,8 @@
         <w:t xml:space="preserve">.</w:t>
       </w:r>
     </w:p>
-    <w:bookmarkEnd w:id="92"/>
-    <w:bookmarkStart w:id="93" w:name="lem-solve-normal-equations"/>
+    <w:bookmarkEnd w:id="93"/>
+    <w:bookmarkStart w:id="94" w:name="lem-solve-normal-equations"/>
     <w:p>
       <w:pPr>
         <w:pStyle w:val="BodyText"/>
@@ -31107,7 +31121,7 @@
         </m:oMath>
       </m:oMathPara>
     </w:p>
-    <w:bookmarkEnd w:id="93"/>
+    <w:bookmarkEnd w:id="94"/>
     <w:p>
       <w:pPr>
         <w:pStyle w:val="FirstParagraph"/>
@@ -31140,7 +31154,7 @@
         <w:t xml:space="preserve">.</w:t>
       </w:r>
     </w:p>
-    <w:bookmarkStart w:id="94" w:name="exr-rss-hessian"/>
+    <w:bookmarkStart w:id="95" w:name="exr-rss-hessian"/>
     <w:p>
       <w:pPr>
         <w:pStyle w:val="BodyText"/>
@@ -31279,8 +31293,8 @@
         <w:t xml:space="preserve">.</w:t>
       </w:r>
     </w:p>
-    <w:bookmarkEnd w:id="94"/>
-    <w:bookmarkStart w:id="95" w:name="sol-rss-hessian"/>
+    <w:bookmarkEnd w:id="95"/>
+    <w:bookmarkStart w:id="96" w:name="sol-rss-hessian"/>
     <w:p>
       <w:pPr>
         <w:pStyle w:val="BodyText"/>
@@ -35625,8 +35639,8 @@
         </m:oMath>
       </m:oMathPara>
     </w:p>
-    <w:bookmarkEnd w:id="95"/>
-    <w:bookmarkStart w:id="96" w:name="exr-rss-hessian-positive-definite"/>
+    <w:bookmarkEnd w:id="96"/>
+    <w:bookmarkStart w:id="97" w:name="exr-rss-hessian-positive-definite"/>
     <w:p>
       <w:pPr>
         <w:pStyle w:val="FirstParagraph"/>
@@ -35705,8 +35719,8 @@
         <w:t xml:space="preserve">).</w:t>
       </w:r>
     </w:p>
-    <w:bookmarkEnd w:id="96"/>
-    <w:bookmarkStart w:id="97" w:name="sol-rss-hessian-positive-definite"/>
+    <w:bookmarkEnd w:id="97"/>
+    <w:bookmarkStart w:id="98" w:name="sol-rss-hessian-positive-definite"/>
     <w:p>
       <w:pPr>
         <w:pStyle w:val="BodyText"/>
@@ -36533,8 +36547,8 @@
         <w:t xml:space="preserve">and a positive determinant is positive definite.</w:t>
       </w:r>
     </w:p>
-    <w:bookmarkEnd w:id="97"/>
-    <w:bookmarkStart w:id="98" w:name="lem-rss-hessian"/>
+    <w:bookmarkEnd w:id="98"/>
+    <w:bookmarkStart w:id="99" w:name="lem-rss-hessian"/>
     <w:p>
       <w:pPr>
         <w:pStyle w:val="BodyText"/>
@@ -36934,7 +36948,7 @@
         </m:oMath>
       </m:oMathPara>
     </w:p>
-    <w:bookmarkEnd w:id="98"/>
+    <w:bookmarkEnd w:id="99"/>
     <w:p>
       <w:pPr>
         <w:pStyle w:val="FirstParagraph"/>
@@ -36987,7 +37001,7 @@
         <w:t xml:space="preserve">.</w:t>
       </w:r>
     </w:p>
-    <w:bookmarkStart w:id="99" w:name="thm-ols-slr"/>
+    <w:bookmarkStart w:id="100" w:name="thm-ols-slr"/>
     <w:p>
       <w:pPr>
         <w:pStyle w:val="BodyText"/>
@@ -37259,7 +37273,7 @@
         </m:oMath>
       </m:oMathPara>
     </w:p>
-    <w:bookmarkEnd w:id="99"/>
+    <w:bookmarkEnd w:id="100"/>
     <w:p>
       <w:pPr>
         <w:pStyle w:val="FirstParagraph"/>
@@ -37624,7 +37638,7 @@
         <w:t xml:space="preserve">instead of differentiating with respect to each component separately.</w:t>
       </w:r>
     </w:p>
-    <w:bookmarkStart w:id="100" w:name="def-slr-covariate-vector"/>
+    <w:bookmarkStart w:id="101" w:name="def-slr-covariate-vector"/>
     <w:p>
       <w:pPr>
         <w:pStyle w:val="BodyText"/>
@@ -37726,8 +37740,8 @@
     $$</w:t>
       </w:r>
     </w:p>
-    <w:bookmarkEnd w:id="100"/>
-    <w:bookmarkStart w:id="101" w:name="exr-slr-mean-dot-product"/>
+    <w:bookmarkEnd w:id="101"/>
+    <w:bookmarkStart w:id="102" w:name="exr-slr-mean-dot-product"/>
     <w:p>
       <w:pPr>
         <w:pStyle w:val="FirstParagraph"/>
@@ -37859,8 +37873,8 @@
         <w:t xml:space="preserve">).</w:t>
       </w:r>
     </w:p>
-    <w:bookmarkEnd w:id="101"/>
-    <w:bookmarkStart w:id="102" w:name="sol-slr-mean-dot-product"/>
+    <w:bookmarkEnd w:id="102"/>
+    <w:bookmarkStart w:id="103" w:name="sol-slr-mean-dot-product"/>
     <w:p>
       <w:pPr>
         <w:pStyle w:val="BodyText"/>
@@ -37920,8 +37934,8 @@
         <w:t xml:space="preserve">.</w:t>
       </w:r>
     </w:p>
-    <w:bookmarkEnd w:id="102"/>
-    <w:bookmarkStart w:id="103" w:name="lem-slr-mean-dot-product"/>
+    <w:bookmarkEnd w:id="103"/>
+    <w:bookmarkStart w:id="104" w:name="lem-slr-mean-dot-product"/>
     <w:p>
       <w:pPr>
         <w:pStyle w:val="BodyText"/>
@@ -38025,7 +38039,7 @@
         <w:t xml:space="preserve">$$\mu(x_i) = \mathord{\smash[b]{\underset{\raise.3ex\hbox{$\scriptstyle\sim$}}{x}}\vphantom{x}}_i \cdot \mathord{\smash[b]{\underset{\raise.3ex\hbox{$\scriptstyle\sim$}}{\beta}}\vphantom{\beta}}.$$</w:t>
       </w:r>
     </w:p>
-    <w:bookmarkEnd w:id="103"/>
+    <w:bookmarkEnd w:id="104"/>
     <w:p>
       <w:pPr>
         <w:pStyle w:val="FirstParagraph"/>
@@ -38058,7 +38072,7 @@
         <w:t xml:space="preserve">.</w:t>
       </w:r>
     </w:p>
-    <w:bookmarkStart w:id="104" w:name="exm-rss-vector"/>
+    <w:bookmarkStart w:id="105" w:name="exm-rss-vector"/>
     <w:p>
       <w:pPr>
         <w:pStyle w:val="BodyText"/>
@@ -38234,8 +38248,8 @@
     $$</w:t>
       </w:r>
     </w:p>
-    <w:bookmarkEnd w:id="104"/>
-    <w:bookmarkStart w:id="105" w:name="exr-rss-gradient-vector"/>
+    <w:bookmarkEnd w:id="105"/>
+    <w:bookmarkStart w:id="106" w:name="exr-rss-gradient-vector"/>
     <w:p>
       <w:pPr>
         <w:pStyle w:val="FirstParagraph"/>
@@ -38298,8 +38312,8 @@
         <w:t xml:space="preserve">rather than one component at a time.</w:t>
       </w:r>
     </w:p>
-    <w:bookmarkEnd w:id="105"/>
-    <w:bookmarkStart w:id="106" w:name="sol-rss-gradient-vector"/>
+    <w:bookmarkEnd w:id="106"/>
+    <w:bookmarkStart w:id="107" w:name="sol-rss-gradient-vector"/>
     <w:p>
       <w:pPr>
         <w:pStyle w:val="BodyText"/>
@@ -38479,8 +38493,8 @@
     $$</w:t>
       </w:r>
     </w:p>
-    <w:bookmarkEnd w:id="106"/>
-    <w:bookmarkStart w:id="107" w:name="lem-rss-gradient-vector"/>
+    <w:bookmarkEnd w:id="107"/>
+    <w:bookmarkStart w:id="108" w:name="lem-rss-gradient-vector"/>
     <w:p>
       <w:pPr>
         <w:pStyle w:val="FirstParagraph"/>
@@ -38519,7 +38533,7 @@
     = -2 \sum_{i=1}^n\mathord{\smash[b]{\underset{\raise.3ex\hbox{$\scriptstyle\sim$}}{x}}\vphantom{x}}_i\mathopen{}\left(y_i- \mathord{\smash[b]{\underset{\raise.3ex\hbox{$\scriptstyle\sim$}}{x}}\vphantom{x}}_i \cdot \mathord{\smash[b]{\underset{\raise.3ex\hbox{$\scriptstyle\sim$}}{\beta}}\vphantom{\beta}}\right)\mathclose{}.$$</w:t>
       </w:r>
     </w:p>
-    <w:bookmarkEnd w:id="107"/>
+    <w:bookmarkEnd w:id="108"/>
     <w:p>
       <w:pPr>
         <w:pStyle w:val="FirstParagraph"/>
@@ -38552,7 +38566,7 @@
         <w:t xml:space="preserve">.</w:t>
       </w:r>
     </w:p>
-    <w:bookmarkStart w:id="108" w:name="exr-normal-equations-vector"/>
+    <w:bookmarkStart w:id="109" w:name="exr-normal-equations-vector"/>
     <w:p>
       <w:pPr>
         <w:pStyle w:val="BodyText"/>
@@ -38637,8 +38651,8 @@
         <w:t xml:space="preserve">.</w:t>
       </w:r>
     </w:p>
-    <w:bookmarkEnd w:id="108"/>
-    <w:bookmarkStart w:id="109" w:name="sol-normal-equations-vector"/>
+    <w:bookmarkEnd w:id="109"/>
+    <w:bookmarkStart w:id="110" w:name="sol-normal-equations-vector"/>
     <w:p>
       <w:pPr>
         <w:pStyle w:val="BodyText"/>
@@ -38804,8 +38818,8 @@
     $$</w:t>
       </w:r>
     </w:p>
-    <w:bookmarkEnd w:id="109"/>
-    <w:bookmarkStart w:id="110" w:name="lem-normal-equations-vector"/>
+    <w:bookmarkEnd w:id="110"/>
+    <w:bookmarkStart w:id="111" w:name="lem-normal-equations-vector"/>
     <w:p>
       <w:pPr>
         <w:pStyle w:val="FirstParagraph"/>
@@ -38875,7 +38889,7 @@
         <w:t xml:space="preserve">$$A \mathord{\smash[b]{\underset{\raise.3ex\hbox{$\scriptstyle\sim$}}{\beta}}\vphantom{\beta}}= \mathord{\smash[b]{\underset{\raise.3ex\hbox{$\scriptstyle\sim$}}{c}}\vphantom{c}}.$$</w:t>
       </w:r>
     </w:p>
-    <w:bookmarkEnd w:id="110"/>
+    <w:bookmarkEnd w:id="111"/>
     <w:p>
       <w:pPr>
         <w:pStyle w:val="FirstParagraph"/>
@@ -38908,7 +38922,7 @@
         <w:t xml:space="preserve">.</w:t>
       </w:r>
     </w:p>
-    <w:bookmarkStart w:id="111" w:name="exr-solve-normal-equations-vector"/>
+    <w:bookmarkStart w:id="112" w:name="exr-solve-normal-equations-vector"/>
     <w:p>
       <w:pPr>
         <w:pStyle w:val="BodyText"/>
@@ -39057,8 +39071,8 @@
         <w:t xml:space="preserve">.</w:t>
       </w:r>
     </w:p>
-    <w:bookmarkEnd w:id="111"/>
-    <w:bookmarkStart w:id="112" w:name="sol-solve-normal-equations-vector"/>
+    <w:bookmarkEnd w:id="112"/>
+    <w:bookmarkStart w:id="113" w:name="sol-solve-normal-equations-vector"/>
     <w:p>
       <w:pPr>
         <w:pStyle w:val="BodyText"/>
@@ -42529,8 +42543,8 @@
         <w:t xml:space="preserve">.</w:t>
       </w:r>
     </w:p>
-    <w:bookmarkEnd w:id="112"/>
-    <w:bookmarkStart w:id="113" w:name="lem-solve-normal-equations-vector"/>
+    <w:bookmarkEnd w:id="113"/>
+    <w:bookmarkStart w:id="114" w:name="lem-solve-normal-equations-vector"/>
     <w:p>
       <w:pPr>
         <w:pStyle w:val="BodyText"/>
@@ -42688,7 +42702,7 @@
         <w:t xml:space="preserve">.</w:t>
       </w:r>
     </w:p>
-    <w:bookmarkEnd w:id="113"/>
+    <w:bookmarkEnd w:id="114"/>
     <w:p>
       <w:pPr>
         <w:pStyle w:val="BodyText"/>
@@ -42721,7 +42735,7 @@
         <w:t xml:space="preserve">.</w:t>
       </w:r>
     </w:p>
-    <w:bookmarkStart w:id="115" w:name="exr-rss-hessian-vector"/>
+    <w:bookmarkStart w:id="116" w:name="exr-rss-hessian-vector"/>
     <w:p>
       <w:pPr>
         <w:pStyle w:val="BodyText"/>
@@ -42742,7 +42756,7 @@
       <w:r>
         <w:t xml:space="preserve"> </w:t>
       </w:r>
-      <w:hyperlink r:id="rId114">
+      <w:hyperlink r:id="rId115">
         <w:r>
           <w:rPr>
             <w:rStyle w:val="Hyperlink"/>
@@ -42760,8 +42774,8 @@
         <w:t xml:space="preserve">.</w:t>
       </w:r>
     </w:p>
-    <w:bookmarkEnd w:id="115"/>
-    <w:bookmarkStart w:id="116" w:name="sol-rss-hessian-vector"/>
+    <w:bookmarkEnd w:id="116"/>
+    <w:bookmarkStart w:id="117" w:name="sol-rss-hessian-vector"/>
     <w:p>
       <w:pPr>
         <w:pStyle w:val="BodyText"/>
@@ -42952,7 +42966,7 @@
       <w:r>
         <w:t xml:space="preserve"> </w:t>
       </w:r>
-      <w:hyperlink r:id="rId114">
+      <w:hyperlink r:id="rId115">
         <w:r>
           <w:rPr>
             <w:rStyle w:val="Hyperlink"/>
@@ -42995,8 +43009,8 @@
     $$</w:t>
       </w:r>
     </w:p>
-    <w:bookmarkEnd w:id="116"/>
-    <w:bookmarkStart w:id="117" w:name="exr-rss-hessian-vector-positive-definite"/>
+    <w:bookmarkEnd w:id="117"/>
+    <w:bookmarkStart w:id="118" w:name="exr-rss-hessian-vector-positive-definite"/>
     <w:p>
       <w:pPr>
         <w:pStyle w:val="FirstParagraph"/>
@@ -43031,7 +43045,7 @@
       <w:r>
         <w:t xml:space="preserve"> </w:t>
       </w:r>
-      <w:hyperlink r:id="rId114">
+      <w:hyperlink r:id="rId115">
         <w:r>
           <w:rPr>
             <w:rStyle w:val="Hyperlink"/>
@@ -43092,8 +43106,8 @@
         <w:t xml:space="preserve">).</w:t>
       </w:r>
     </w:p>
-    <w:bookmarkEnd w:id="117"/>
-    <w:bookmarkStart w:id="118" w:name="sol-rss-hessian-vector-positive-definite"/>
+    <w:bookmarkEnd w:id="118"/>
+    <w:bookmarkStart w:id="119" w:name="sol-rss-hessian-vector-positive-definite"/>
     <w:p>
       <w:pPr>
         <w:pStyle w:val="BodyText"/>
@@ -43134,7 +43148,7 @@
       <w:r>
         <w:t xml:space="preserve"> </w:t>
       </w:r>
-      <w:hyperlink r:id="rId114">
+      <w:hyperlink r:id="rId115">
         <w:r>
           <w:rPr>
             <w:rStyle w:val="Hyperlink"/>
@@ -43540,8 +43554,8 @@
         <w:t xml:space="preserve">.</w:t>
       </w:r>
     </w:p>
-    <w:bookmarkEnd w:id="118"/>
-    <w:bookmarkStart w:id="119" w:name="lem-rss-hessian-vector"/>
+    <w:bookmarkEnd w:id="119"/>
+    <w:bookmarkStart w:id="120" w:name="lem-rss-hessian-vector"/>
     <w:p>
       <w:pPr>
         <w:pStyle w:val="BodyText"/>
@@ -43562,7 +43576,7 @@
       <w:r>
         <w:t xml:space="preserve"> </w:t>
       </w:r>
-      <w:hyperlink r:id="rId114">
+      <w:hyperlink r:id="rId115">
         <w:r>
           <w:rPr>
             <w:rStyle w:val="Hyperlink"/>
@@ -43654,7 +43668,7 @@
         <w:t xml:space="preserve">).</w:t>
       </w:r>
     </w:p>
-    <w:bookmarkEnd w:id="119"/>
+    <w:bookmarkEnd w:id="120"/>
     <w:p>
       <w:pPr>
         <w:pStyle w:val="BodyText"/>
@@ -43675,7 +43689,7 @@
       <w:r>
         <w:t xml:space="preserve"> </w:t>
       </w:r>
-      <w:hyperlink r:id="rId114">
+      <w:hyperlink r:id="rId115">
         <w:r>
           <w:rPr>
             <w:rStyle w:val="Hyperlink"/>
@@ -43724,7 +43738,7 @@
         <w:t xml:space="preserve">.</w:t>
       </w:r>
     </w:p>
-    <w:bookmarkStart w:id="120" w:name="thm-ols-slr-vector"/>
+    <w:bookmarkStart w:id="121" w:name="thm-ols-slr-vector"/>
     <w:p>
       <w:pPr>
         <w:pStyle w:val="BodyText"/>
@@ -43858,7 +43872,7 @@
         <w:t xml:space="preserve">.</w:t>
       </w:r>
     </w:p>
-    <w:bookmarkEnd w:id="120"/>
+    <w:bookmarkEnd w:id="121"/>
     <w:p>
       <w:pPr>
         <w:pStyle w:val="BodyText"/>
@@ -44108,7 +44122,7 @@
         <w:t xml:space="preserve">is its unique global minimum.</w:t>
       </w:r>
     </w:p>
-    <w:bookmarkStart w:id="122" w:name="exr-ols-slope-r"/>
+    <w:bookmarkStart w:id="123" w:name="exr-ols-slope-r"/>
     <w:p>
       <w:pPr>
         <w:pStyle w:val="BodyText"/>
@@ -44288,7 +44302,7 @@
       <w:r>
         <w:t xml:space="preserve"> </w:t>
       </w:r>
-      <w:hyperlink r:id="rId121">
+      <w:hyperlink r:id="rId122">
         <w:r>
           <w:rPr>
             <w:rStyle w:val="Hyperlink"/>
@@ -44386,8 +44400,8 @@
         <w:t xml:space="preserve">.</w:t>
       </w:r>
     </w:p>
-    <w:bookmarkEnd w:id="122"/>
-    <w:bookmarkStart w:id="123" w:name="sol-ols-slope-r"/>
+    <w:bookmarkEnd w:id="123"/>
+    <w:bookmarkStart w:id="124" w:name="sol-ols-slope-r"/>
     <w:p>
       <w:pPr>
         <w:pStyle w:val="BodyText"/>
@@ -46026,8 +46040,8 @@
         </m:oMath>
       </m:oMathPara>
     </w:p>
-    <w:bookmarkEnd w:id="123"/>
-    <w:bookmarkStart w:id="124" w:name="cor-ols-slope-r"/>
+    <w:bookmarkEnd w:id="124"/>
+    <w:bookmarkStart w:id="125" w:name="cor-ols-slope-r"/>
     <w:p>
       <w:pPr>
         <w:pStyle w:val="FirstParagraph"/>
@@ -46296,7 +46310,7 @@
       <w:r>
         <w:t xml:space="preserve"> </w:t>
       </w:r>
-      <w:hyperlink r:id="rId121">
+      <w:hyperlink r:id="rId122">
         <w:r>
           <w:rPr>
             <w:rStyle w:val="Hyperlink"/>
@@ -46354,7 +46368,7 @@
         <w:t xml:space="preserve">.</w:t>
       </w:r>
     </w:p>
-    <w:bookmarkEnd w:id="124"/>
+    <w:bookmarkEnd w:id="125"/>
     <w:p>
       <w:pPr>
         <w:pStyle w:val="BodyText"/>
@@ -46428,18 +46442,18 @@
                 <wp:inline>
                   <wp:extent cx="152400" cy="152400"/>
                   <wp:effectExtent b="0" l="0" r="0" t="0"/>
-                  <wp:docPr descr="" title="" id="126" name="Picture"/>
+                  <wp:docPr descr="" title="" id="127" name="Picture"/>
                   <a:graphic>
                     <a:graphicData uri="http://schemas.openxmlformats.org/drawingml/2006/picture">
                       <pic:pic>
                         <pic:nvPicPr>
-                          <pic:cNvPr descr="/opt/quarto/share/formats/docx/tip.png" id="127" name="Picture"/>
+                          <pic:cNvPr descr="/opt/quarto/share/formats/docx/tip.png" id="128" name="Picture"/>
                           <pic:cNvPicPr>
                             <a:picLocks noChangeArrowheads="1" noChangeAspect="1"/>
                           </pic:cNvPicPr>
                         </pic:nvPicPr>
                         <pic:blipFill>
-                          <a:blip r:embed="rId125"/>
+                          <a:blip r:embed="rId126"/>
                           <a:stretch>
                             <a:fillRect/>
                           </a:stretch>
@@ -46501,7 +46515,7 @@
             <w:r>
               <w:t xml:space="preserve"> </w:t>
             </w:r>
-            <w:hyperlink r:id="rId128">
+            <w:hyperlink r:id="rId129">
               <w:r>
                 <w:rPr>
                   <w:rStyle w:val="Hyperlink"/>
@@ -46545,7 +46559,7 @@
             <w:r>
               <w:t xml:space="preserve"> </w:t>
             </w:r>
-            <w:hyperlink r:id="rId129">
+            <w:hyperlink r:id="rId130">
               <w:r>
                 <w:rPr>
                   <w:rStyle w:val="Hyperlink"/>
@@ -46615,8 +46629,8 @@
         <w:t xml:space="preserve">covers slope and intercept properties.</w:t>
       </w:r>
     </w:p>
-    <w:bookmarkEnd w:id="130"/>
-    <w:bookmarkStart w:id="136" w:name="sec-slr-R"/>
+    <w:bookmarkEnd w:id="131"/>
+    <w:bookmarkStart w:id="137" w:name="sec-slr-R"/>
     <w:p>
       <w:pPr>
         <w:pStyle w:val="Heading3"/>
@@ -46625,7 +46639,7 @@
         <w:t xml:space="preserve">3.3 Fitting a simple linear regression in R</w:t>
       </w:r>
     </w:p>
-    <w:bookmarkStart w:id="135" w:name="exm-hers-slr"/>
+    <w:bookmarkStart w:id="136" w:name="exm-hers-slr"/>
     <w:p>
       <w:pPr>
         <w:pStyle w:val="FirstParagraph"/>
@@ -47912,7 +47926,7 @@
       <w:tr>
         <w:tc>
           <w:tcPr/>
-          <w:bookmarkStart w:id="134" w:name="fig-hers-slr"/>
+          <w:bookmarkStart w:id="135" w:name="fig-hers-slr"/>
           <w:p>
             <w:pPr>
               <w:pStyle w:val="SourceCode"/>
@@ -48291,18 +48305,18 @@
                 <wp:inline>
                   <wp:extent cx="4620126" cy="3696101"/>
                   <wp:effectExtent b="0" l="0" r="0" t="0"/>
-                  <wp:docPr descr="" title="" id="132" name="Picture"/>
+                  <wp:docPr descr="" title="" id="133" name="Picture"/>
                   <a:graphic>
                     <a:graphicData uri="http://schemas.openxmlformats.org/drawingml/2006/picture">
                       <pic:pic>
                         <pic:nvPicPr>
-                          <pic:cNvPr descr="correlation-regression_files/figure-docx/unnamed-chunk-9-1.png" id="133" name="Picture"/>
+                          <pic:cNvPr descr="correlation-regression_files/figure-docx/unnamed-chunk-9-1.png" id="134" name="Picture"/>
                           <pic:cNvPicPr>
                             <a:picLocks noChangeArrowheads="1" noChangeAspect="1"/>
                           </pic:cNvPicPr>
                         </pic:nvPicPr>
                         <pic:blipFill>
-                          <a:blip r:embed="rId131"/>
+                          <a:blip r:embed="rId132"/>
                           <a:stretch>
                             <a:fillRect/>
                           </a:stretch>
@@ -48342,7 +48356,7 @@
               <w:t xml:space="preserve">Figure 4: Fasting glucose against BMI in HERS, with the OLS line</w:t>
             </w:r>
           </w:p>
-          <w:bookmarkEnd w:id="134"/>
+          <w:bookmarkEnd w:id="135"/>
         </w:tc>
       </w:tr>
     </w:tbl>
@@ -48456,9 +48470,9 @@
         <w:t xml:space="preserve">.</w:t>
       </w:r>
     </w:p>
-    <w:bookmarkEnd w:id="135"/>
     <w:bookmarkEnd w:id="136"/>
-    <w:bookmarkStart w:id="150" w:name="sec-r-squared"/>
+    <w:bookmarkEnd w:id="137"/>
+    <w:bookmarkStart w:id="151" w:name="sec-r-squared"/>
     <w:p>
       <w:pPr>
         <w:pStyle w:val="Heading3"/>
@@ -48467,7 +48481,7 @@
         <w:t xml:space="preserve">3.4 The coefficient of determination</w:t>
       </w:r>
     </w:p>
-    <w:bookmarkStart w:id="137" w:name="def-tss"/>
+    <w:bookmarkStart w:id="138" w:name="def-tss"/>
     <w:p>
       <w:pPr>
         <w:pStyle w:val="FirstParagraph"/>
@@ -48694,8 +48708,8 @@
         <w:t xml:space="preserve">.</w:t>
       </w:r>
     </w:p>
-    <w:bookmarkEnd w:id="137"/>
-    <w:bookmarkStart w:id="138" w:name="exm-tss"/>
+    <w:bookmarkEnd w:id="138"/>
+    <w:bookmarkStart w:id="139" w:name="exm-tss"/>
     <w:p>
       <w:pPr>
         <w:pStyle w:val="BodyText"/>
@@ -49039,8 +49053,8 @@
         </m:oMath>
       </m:oMathPara>
     </w:p>
-    <w:bookmarkEnd w:id="138"/>
-    <w:bookmarkStart w:id="139" w:name="def-r-squared"/>
+    <w:bookmarkEnd w:id="139"/>
+    <w:bookmarkStart w:id="140" w:name="def-r-squared"/>
     <w:p>
       <w:pPr>
         <w:pStyle w:val="FirstParagraph"/>
@@ -49158,8 +49172,8 @@
         <w:t xml:space="preserve">.</w:t>
       </w:r>
     </w:p>
-    <w:bookmarkEnd w:id="139"/>
-    <w:bookmarkStart w:id="140" w:name="rem-r-squared-interpretation"/>
+    <w:bookmarkEnd w:id="140"/>
+    <w:bookmarkStart w:id="141" w:name="rem-r-squared-interpretation"/>
     <w:p>
       <w:pPr>
         <w:pStyle w:val="BodyText"/>
@@ -49220,8 +49234,8 @@
         <w:t xml:space="preserve">.</w:t>
       </w:r>
     </w:p>
-    <w:bookmarkEnd w:id="140"/>
-    <w:bookmarkStart w:id="141" w:name="exr-rss-ols-fit"/>
+    <w:bookmarkEnd w:id="141"/>
+    <w:bookmarkStart w:id="142" w:name="exr-rss-ols-fit"/>
     <w:p>
       <w:pPr>
         <w:pStyle w:val="BodyText"/>
@@ -49528,8 +49542,8 @@
         <w:t xml:space="preserve">.</w:t>
       </w:r>
     </w:p>
-    <w:bookmarkEnd w:id="141"/>
-    <w:bookmarkStart w:id="143" w:name="sol-rss-ols-fit"/>
+    <w:bookmarkEnd w:id="142"/>
+    <w:bookmarkStart w:id="144" w:name="sol-rss-ols-fit"/>
     <w:p>
       <w:pPr>
         <w:pStyle w:val="BodyText"/>
@@ -49550,7 +49564,7 @@
       <w:r>
         <w:t xml:space="preserve"> </w:t>
       </w:r>
-      <w:hyperlink r:id="rId142">
+      <w:hyperlink r:id="rId143">
         <w:r>
           <w:rPr>
             <w:rStyle w:val="Hyperlink"/>
@@ -53652,8 +53666,8 @@
         </m:oMath>
       </m:oMathPara>
     </w:p>
-    <w:bookmarkEnd w:id="143"/>
-    <w:bookmarkStart w:id="144" w:name="lem-rss-ols-fit"/>
+    <w:bookmarkEnd w:id="144"/>
+    <w:bookmarkStart w:id="145" w:name="lem-rss-ols-fit"/>
     <w:p>
       <w:pPr>
         <w:pStyle w:val="FirstParagraph"/>
@@ -53963,7 +53977,7 @@
         </m:oMath>
       </m:oMathPara>
     </w:p>
-    <w:bookmarkEnd w:id="144"/>
+    <w:bookmarkEnd w:id="145"/>
     <w:p>
       <w:pPr>
         <w:pStyle w:val="FirstParagraph"/>
@@ -53996,7 +54010,7 @@
         <w:t xml:space="preserve">.</w:t>
       </w:r>
     </w:p>
-    <w:bookmarkStart w:id="145" w:name="exr-r-squared-slr"/>
+    <w:bookmarkStart w:id="146" w:name="exr-r-squared-slr"/>
     <w:p>
       <w:pPr>
         <w:pStyle w:val="BodyText"/>
@@ -54253,8 +54267,8 @@
         <w:t xml:space="preserve">.</w:t>
       </w:r>
     </w:p>
-    <w:bookmarkEnd w:id="145"/>
-    <w:bookmarkStart w:id="147" w:name="sol-r-squared-slr"/>
+    <w:bookmarkEnd w:id="146"/>
+    <w:bookmarkStart w:id="148" w:name="sol-r-squared-slr"/>
     <w:p>
       <w:pPr>
         <w:pStyle w:val="BodyText"/>
@@ -54429,7 +54443,7 @@
       <w:r>
         <w:t xml:space="preserve">(</w:t>
       </w:r>
-      <w:hyperlink r:id="rId146">
+      <w:hyperlink r:id="rId147">
         <w:r>
           <w:rPr>
             <w:rStyle w:val="Hyperlink"/>
@@ -54479,8 +54493,8 @@
         <w:t xml:space="preserve">.</w:t>
       </w:r>
     </w:p>
-    <w:bookmarkEnd w:id="147"/>
-    <w:bookmarkStart w:id="148" w:name="thm-r-squared-slr"/>
+    <w:bookmarkEnd w:id="148"/>
+    <w:bookmarkStart w:id="149" w:name="thm-r-squared-slr"/>
     <w:p>
       <w:pPr>
         <w:pStyle w:val="BodyText"/>
@@ -54808,7 +54822,7 @@
         </m:oMath>
       </m:oMathPara>
     </w:p>
-    <w:bookmarkEnd w:id="148"/>
+    <w:bookmarkEnd w:id="149"/>
     <w:p>
       <w:pPr>
         <w:pStyle w:val="FirstParagraph"/>
@@ -54861,7 +54875,7 @@
         <w:t xml:space="preserve">.</w:t>
       </w:r>
     </w:p>
-    <w:bookmarkStart w:id="149" w:name="exm-hers-r-squared"/>
+    <w:bookmarkStart w:id="150" w:name="exm-hers-r-squared"/>
     <w:p>
       <w:pPr>
         <w:pStyle w:val="BodyText"/>
@@ -55416,7 +55430,7 @@
         <w:t xml:space="preserve">variation in baseline fasting glucose.</w:t>
       </w:r>
     </w:p>
-    <w:bookmarkEnd w:id="149"/>
+    <w:bookmarkEnd w:id="150"/>
     <w:p>
       <w:pPr>
         <w:pStyle w:val="Compact"/>
@@ -55453,8 +55467,8 @@
         <w:t xml:space="preserve">covers assessing the fit of a regression line.</w:t>
       </w:r>
     </w:p>
-    <w:bookmarkEnd w:id="150"/>
-    <w:bookmarkStart w:id="166" w:name="sec-partial-f"/>
+    <w:bookmarkEnd w:id="151"/>
+    <w:bookmarkStart w:id="167" w:name="sec-partial-f"/>
     <w:p>
       <w:pPr>
         <w:pStyle w:val="Heading3"/>
@@ -55463,7 +55477,7 @@
         <w:t xml:space="preserve">3.5 Comparing nested regression models</w:t>
       </w:r>
     </w:p>
-    <w:bookmarkStart w:id="151" w:name="def-nested-regression-models"/>
+    <w:bookmarkStart w:id="152" w:name="def-nested-regression-models"/>
     <w:p>
       <w:pPr>
         <w:pStyle w:val="FirstParagraph"/>
@@ -55690,8 +55704,8 @@
         <w:t xml:space="preserve">.</w:t>
       </w:r>
     </w:p>
-    <w:bookmarkEnd w:id="151"/>
-    <w:bookmarkStart w:id="152" w:name="exm-hers-nested-models"/>
+    <w:bookmarkEnd w:id="152"/>
+    <w:bookmarkStart w:id="153" w:name="exm-hers-nested-models"/>
     <w:p>
       <w:pPr>
         <w:pStyle w:val="BodyText"/>
@@ -56384,8 +56398,8 @@
         <w:t xml:space="preserve">in the larger one.</w:t>
       </w:r>
     </w:p>
-    <w:bookmarkEnd w:id="152"/>
-    <w:bookmarkStart w:id="156" w:name="def-partial-f-test"/>
+    <w:bookmarkEnd w:id="153"/>
+    <w:bookmarkStart w:id="157" w:name="def-partial-f-test"/>
     <w:p>
       <w:pPr>
         <w:pStyle w:val="BodyText"/>
@@ -56703,7 +56717,7 @@
       <w:r>
         <w:t xml:space="preserve"> </w:t>
       </w:r>
-      <w:hyperlink r:id="rId153">
+      <w:hyperlink r:id="rId154">
         <w:r>
           <w:rPr>
             <w:rStyle w:val="Hyperlink"/>
@@ -56885,7 +56899,7 @@
       <w:r>
         <w:t xml:space="preserve"> </w:t>
       </w:r>
-      <w:hyperlink r:id="rId154">
+      <w:hyperlink r:id="rId155">
         <w:r>
           <w:rPr>
             <w:rStyle w:val="Hyperlink"/>
@@ -57034,7 +57048,7 @@
       <w:r>
         <w:t xml:space="preserve">distribution (</w:t>
       </w:r>
-      <w:hyperlink r:id="rId155">
+      <w:hyperlink r:id="rId156">
         <w:r>
           <w:rPr>
             <w:rStyle w:val="Hyperlink"/>
@@ -57075,8 +57089,8 @@
         <w:t xml:space="preserve">.</w:t>
       </w:r>
     </w:p>
-    <w:bookmarkEnd w:id="156"/>
-    <w:bookmarkStart w:id="158" w:name="thm-partial-f-null"/>
+    <w:bookmarkEnd w:id="157"/>
+    <w:bookmarkStart w:id="159" w:name="thm-partial-f-null"/>
     <w:p>
       <w:pPr>
         <w:pStyle w:val="BodyText"/>
@@ -57114,7 +57128,7 @@
       <w:r>
         <w:t xml:space="preserve"> </w:t>
       </w:r>
-      <w:hyperlink r:id="rId157">
+      <w:hyperlink r:id="rId158">
         <w:r>
           <w:rPr>
             <w:rStyle w:val="Hyperlink"/>
@@ -57334,7 +57348,7 @@
         <w:t xml:space="preserve">.</w:t>
       </w:r>
     </w:p>
-    <w:bookmarkEnd w:id="158"/>
+    <w:bookmarkEnd w:id="159"/>
     <w:p>
       <w:pPr>
         <w:pStyle w:val="BodyText"/>
@@ -57628,7 +57642,7 @@
       <w:r>
         <w:t xml:space="preserve"> </w:t>
       </w:r>
-      <w:hyperlink r:id="rId157">
+      <w:hyperlink r:id="rId158">
         <w:r>
           <w:rPr>
             <w:rStyle w:val="Hyperlink"/>
@@ -57675,7 +57689,7 @@
       <w:r>
         <w:t xml:space="preserve"> </w:t>
       </w:r>
-      <w:hyperlink r:id="rId159">
+      <w:hyperlink r:id="rId160">
         <w:r>
           <w:rPr>
             <w:rStyle w:val="Hyperlink"/>
@@ -57706,7 +57720,7 @@
       <w:r>
         <w:t xml:space="preserve"> </w:t>
       </w:r>
-      <w:hyperlink r:id="rId142">
+      <w:hyperlink r:id="rId143">
         <w:r>
           <w:rPr>
             <w:rStyle w:val="Hyperlink"/>
@@ -57863,7 +57877,7 @@
       <w:r>
         <w:t xml:space="preserve"> </w:t>
       </w:r>
-      <w:hyperlink r:id="rId155">
+      <w:hyperlink r:id="rId156">
         <w:r>
           <w:rPr>
             <w:rStyle w:val="Hyperlink"/>
@@ -57875,7 +57889,7 @@
         <w:t xml:space="preserve">.</w:t>
       </w:r>
     </w:p>
-    <w:bookmarkStart w:id="160" w:name="exm-hers-partial-f"/>
+    <w:bookmarkStart w:id="161" w:name="exm-hers-partial-f"/>
     <w:p>
       <w:pPr>
         <w:pStyle w:val="BodyText"/>
@@ -58373,7 +58387,7 @@
       <w:r>
         <w:t xml:space="preserve"> </w:t>
       </w:r>
-      <w:hyperlink r:id="rId153">
+      <w:hyperlink r:id="rId154">
         <w:r>
           <w:rPr>
             <w:rStyle w:val="Hyperlink"/>
@@ -59069,8 +59083,8 @@
         <w:t xml:space="preserve">at the 5% level.</w:t>
       </w:r>
     </w:p>
-    <w:bookmarkEnd w:id="160"/>
-    <w:bookmarkStart w:id="165" w:name="rem-partial-f-lrt"/>
+    <w:bookmarkEnd w:id="161"/>
+    <w:bookmarkStart w:id="166" w:name="rem-partial-f-lrt"/>
     <w:p>
       <w:pPr>
         <w:pStyle w:val="BodyText"/>
@@ -59097,7 +59111,7 @@
       <w:r>
         <w:t xml:space="preserve"> </w:t>
       </w:r>
-      <w:hyperlink r:id="rId161">
+      <w:hyperlink r:id="rId162">
         <w:r>
           <w:rPr>
             <w:rStyle w:val="Hyperlink"/>
@@ -59190,7 +59204,7 @@
       <w:r>
         <w:t xml:space="preserve"> </w:t>
       </w:r>
-      <w:hyperlink r:id="rId162">
+      <w:hyperlink r:id="rId163">
         <w:r>
           <w:rPr>
             <w:rStyle w:val="Hyperlink"/>
@@ -59306,7 +59320,7 @@
       <w:r>
         <w:t xml:space="preserve"> </w:t>
       </w:r>
-      <w:hyperlink r:id="rId163">
+      <w:hyperlink r:id="rId164">
         <w:r>
           <w:rPr>
             <w:rStyle w:val="Hyperlink"/>
@@ -59323,7 +59337,7 @@
       <w:r>
         <w:t xml:space="preserve"> </w:t>
       </w:r>
-      <w:hyperlink r:id="rId164">
+      <w:hyperlink r:id="rId165">
         <w:r>
           <w:rPr>
             <w:rStyle w:val="Hyperlink"/>
@@ -60237,7 +60251,7 @@
       <w:r>
         <w:t xml:space="preserve"> </w:t>
       </w:r>
-      <w:hyperlink r:id="rId163">
+      <w:hyperlink r:id="rId164">
         <w:r>
           <w:rPr>
             <w:rStyle w:val="Hyperlink"/>
@@ -60252,9 +60266,9 @@
         <w:t xml:space="preserve">holds only approximately.</w:t>
       </w:r>
     </w:p>
-    <w:bookmarkEnd w:id="165"/>
     <w:bookmarkEnd w:id="166"/>
-    <w:bookmarkStart w:id="168" w:name="further-reading"/>
+    <w:bookmarkEnd w:id="167"/>
+    <w:bookmarkStart w:id="169" w:name="further-reading"/>
     <w:p>
       <w:pPr>
         <w:pStyle w:val="Heading3"/>
@@ -60267,7 +60281,7 @@
       <w:pPr>
         <w:pStyle w:val="FirstParagraph"/>
       </w:pPr>
-      <w:hyperlink r:id="rId167">
+      <w:hyperlink r:id="rId168">
         <w:r>
           <w:rPr>
             <w:rStyle w:val="Hyperlink"/>
@@ -60300,9 +60314,9 @@
         <w:t xml:space="preserve">cover linear regression in Chapter 4.</w:t>
       </w:r>
     </w:p>
-    <w:bookmarkEnd w:id="168"/>
     <w:bookmarkEnd w:id="169"/>
-    <w:bookmarkStart w:id="199" w:name="references"/>
+    <w:bookmarkEnd w:id="170"/>
+    <w:bookmarkStart w:id="200" w:name="references"/>
     <w:p>
       <w:pPr>
         <w:pStyle w:val="Heading2"/>
@@ -60311,8 +60325,8 @@
         <w:t xml:space="preserve">References</w:t>
       </w:r>
     </w:p>
-    <w:bookmarkStart w:id="198" w:name="refs"/>
-    <w:bookmarkStart w:id="171" w:name="ref-vittinghoff2e"/>
+    <w:bookmarkStart w:id="199" w:name="refs"/>
+    <w:bookmarkStart w:id="172" w:name="ref-vittinghoff2e"/>
     <w:p>
       <w:pPr>
         <w:pStyle w:val="Bibliography"/>
@@ -60345,7 +60359,7 @@
       <w:r>
         <w:t xml:space="preserve"> </w:t>
       </w:r>
-      <w:hyperlink r:id="rId170">
+      <w:hyperlink r:id="rId171">
         <w:r>
           <w:rPr>
             <w:rStyle w:val="Hyperlink"/>
@@ -60357,8 +60371,8 @@
         <w:t xml:space="preserve">.</w:t>
       </w:r>
     </w:p>
-    <w:bookmarkEnd w:id="171"/>
-    <w:bookmarkStart w:id="173" w:name="X9c68751dcff429bb8eebfb08e71b6f746222990"/>
+    <w:bookmarkEnd w:id="172"/>
+    <w:bookmarkStart w:id="174" w:name="X9c68751dcff429bb8eebfb08e71b6f746222990"/>
     <w:p>
       <w:pPr>
         <w:pStyle w:val="Bibliography"/>
@@ -60405,7 +60419,7 @@
       <w:r>
         <w:t xml:space="preserve"> </w:t>
       </w:r>
-      <w:hyperlink r:id="rId172">
+      <w:hyperlink r:id="rId173">
         <w:r>
           <w:rPr>
             <w:rStyle w:val="Hyperlink"/>
@@ -60414,8 +60428,8 @@
         </w:r>
       </w:hyperlink>
     </w:p>
-    <w:bookmarkEnd w:id="173"/>
-    <w:bookmarkStart w:id="174" w:name="ref-hoggtanis2015"/>
+    <w:bookmarkEnd w:id="174"/>
+    <w:bookmarkStart w:id="175" w:name="ref-hoggtanis2015"/>
     <w:p>
       <w:pPr>
         <w:pStyle w:val="Bibliography"/>
@@ -60446,8 +60460,8 @@
         <w:t xml:space="preserve">, Tenth edition. Boston: Pearson, 2019.</w:t>
       </w:r>
     </w:p>
-    <w:bookmarkEnd w:id="174"/>
-    <w:bookmarkStart w:id="175" w:name="ref-rice2007mathematical"/>
+    <w:bookmarkEnd w:id="175"/>
+    <w:bookmarkStart w:id="176" w:name="ref-rice2007mathematical"/>
     <w:p>
       <w:pPr>
         <w:pStyle w:val="Bibliography"/>
@@ -60478,8 +60492,8 @@
         <w:t xml:space="preserve">, 3rd ed. Belmont, CA: Cengage Learning, 2007.</w:t>
       </w:r>
     </w:p>
-    <w:bookmarkEnd w:id="175"/>
-    <w:bookmarkStart w:id="177" w:name="Xa16f107eac264c6362bfc3672301bd764727388"/>
+    <w:bookmarkEnd w:id="176"/>
+    <w:bookmarkStart w:id="178" w:name="Xa16f107eac264c6362bfc3672301bd764727388"/>
     <w:p>
       <w:pPr>
         <w:pStyle w:val="Bibliography"/>
@@ -60526,7 +60540,7 @@
       <w:r>
         <w:t xml:space="preserve"> </w:t>
       </w:r>
-      <w:hyperlink r:id="rId176">
+      <w:hyperlink r:id="rId177">
         <w:r>
           <w:rPr>
             <w:rStyle w:val="Hyperlink"/>
@@ -60535,8 +60549,8 @@
         </w:r>
       </w:hyperlink>
     </w:p>
-    <w:bookmarkEnd w:id="177"/>
-    <w:bookmarkStart w:id="179" w:name="X77ec95df2e524293cd476e93fa6c354ef0dc636"/>
+    <w:bookmarkEnd w:id="178"/>
+    <w:bookmarkStart w:id="180" w:name="X77ec95df2e524293cd476e93fa6c354ef0dc636"/>
     <w:p>
       <w:pPr>
         <w:pStyle w:val="Bibliography"/>
@@ -60583,7 +60597,7 @@
       <w:r>
         <w:t xml:space="preserve"> </w:t>
       </w:r>
-      <w:hyperlink r:id="rId178">
+      <w:hyperlink r:id="rId179">
         <w:r>
           <w:rPr>
             <w:rStyle w:val="Hyperlink"/>
@@ -60592,8 +60606,8 @@
         </w:r>
       </w:hyperlink>
     </w:p>
-    <w:bookmarkEnd w:id="179"/>
-    <w:bookmarkStart w:id="181" w:name="ref-wikipedia_linear_regression"/>
+    <w:bookmarkEnd w:id="180"/>
+    <w:bookmarkStart w:id="182" w:name="ref-wikipedia_linear_regression"/>
     <w:p>
       <w:pPr>
         <w:pStyle w:val="Bibliography"/>
@@ -60640,7 +60654,7 @@
       <w:r>
         <w:t xml:space="preserve"> </w:t>
       </w:r>
-      <w:hyperlink r:id="rId180">
+      <w:hyperlink r:id="rId181">
         <w:r>
           <w:rPr>
             <w:rStyle w:val="Hyperlink"/>
@@ -60649,8 +60663,8 @@
         </w:r>
       </w:hyperlink>
     </w:p>
-    <w:bookmarkEnd w:id="181"/>
-    <w:bookmarkStart w:id="183" w:name="ref-wikipedia_simple_linear_regression"/>
+    <w:bookmarkEnd w:id="182"/>
+    <w:bookmarkStart w:id="184" w:name="ref-wikipedia_simple_linear_regression"/>
     <w:p>
       <w:pPr>
         <w:pStyle w:val="Bibliography"/>
@@ -60697,7 +60711,7 @@
       <w:r>
         <w:t xml:space="preserve"> </w:t>
       </w:r>
-      <w:hyperlink r:id="rId182">
+      <w:hyperlink r:id="rId183">
         <w:r>
           <w:rPr>
             <w:rStyle w:val="Hyperlink"/>
@@ -60706,8 +60720,8 @@
         </w:r>
       </w:hyperlink>
     </w:p>
-    <w:bookmarkEnd w:id="183"/>
-    <w:bookmarkStart w:id="185" w:name="ref-wikipedia_residual_sum_of_squares"/>
+    <w:bookmarkEnd w:id="184"/>
+    <w:bookmarkStart w:id="186" w:name="ref-wikipedia_residual_sum_of_squares"/>
     <w:p>
       <w:pPr>
         <w:pStyle w:val="Bibliography"/>
@@ -60754,7 +60768,7 @@
       <w:r>
         <w:t xml:space="preserve"> </w:t>
       </w:r>
-      <w:hyperlink r:id="rId184">
+      <w:hyperlink r:id="rId185">
         <w:r>
           <w:rPr>
             <w:rStyle w:val="Hyperlink"/>
@@ -60763,8 +60777,8 @@
         </w:r>
       </w:hyperlink>
     </w:p>
-    <w:bookmarkEnd w:id="185"/>
-    <w:bookmarkStart w:id="187" w:name="ref-wikipedia_ordinary_least_squares"/>
+    <w:bookmarkEnd w:id="186"/>
+    <w:bookmarkStart w:id="188" w:name="ref-wikipedia_ordinary_least_squares"/>
     <w:p>
       <w:pPr>
         <w:pStyle w:val="Bibliography"/>
@@ -60811,7 +60825,7 @@
       <w:r>
         <w:t xml:space="preserve"> </w:t>
       </w:r>
-      <w:hyperlink r:id="rId186">
+      <w:hyperlink r:id="rId187">
         <w:r>
           <w:rPr>
             <w:rStyle w:val="Hyperlink"/>
@@ -60820,8 +60834,8 @@
         </w:r>
       </w:hyperlink>
     </w:p>
-    <w:bookmarkEnd w:id="187"/>
-    <w:bookmarkStart w:id="189" w:name="ref-hutchinson_wwu_ml_videos"/>
+    <w:bookmarkEnd w:id="188"/>
+    <w:bookmarkStart w:id="190" w:name="ref-hutchinson_wwu_ml_videos"/>
     <w:p>
       <w:pPr>
         <w:pStyle w:val="Bibliography"/>
@@ -60874,7 +60888,7 @@
       <w:r>
         <w:t xml:space="preserve"> </w:t>
       </w:r>
-      <w:hyperlink r:id="rId188">
+      <w:hyperlink r:id="rId189">
         <w:r>
           <w:rPr>
             <w:rStyle w:val="Hyperlink"/>
@@ -60883,8 +60897,8 @@
         </w:r>
       </w:hyperlink>
     </w:p>
-    <w:bookmarkEnd w:id="189"/>
-    <w:bookmarkStart w:id="191" w:name="ref-CaseBerg01"/>
+    <w:bookmarkEnd w:id="190"/>
+    <w:bookmarkStart w:id="192" w:name="ref-CaseBerg01"/>
     <w:p>
       <w:pPr>
         <w:pStyle w:val="Bibliography"/>
@@ -60917,7 +60931,7 @@
       <w:r>
         <w:t xml:space="preserve"> </w:t>
       </w:r>
-      <w:hyperlink r:id="rId190">
+      <w:hyperlink r:id="rId191">
         <w:r>
           <w:rPr>
             <w:rStyle w:val="Hyperlink"/>
@@ -60926,8 +60940,8 @@
         </w:r>
       </w:hyperlink>
     </w:p>
-    <w:bookmarkEnd w:id="191"/>
-    <w:bookmarkStart w:id="193" w:name="ref-wikipedia_total_sum_of_squares"/>
+    <w:bookmarkEnd w:id="192"/>
+    <w:bookmarkStart w:id="194" w:name="ref-wikipedia_total_sum_of_squares"/>
     <w:p>
       <w:pPr>
         <w:pStyle w:val="Bibliography"/>
@@ -60974,7 +60988,7 @@
       <w:r>
         <w:t xml:space="preserve"> </w:t>
       </w:r>
-      <w:hyperlink r:id="rId192">
+      <w:hyperlink r:id="rId193">
         <w:r>
           <w:rPr>
             <w:rStyle w:val="Hyperlink"/>
@@ -60983,8 +60997,8 @@
         </w:r>
       </w:hyperlink>
     </w:p>
-    <w:bookmarkEnd w:id="193"/>
-    <w:bookmarkStart w:id="195" w:name="X0d0d355937664870ae38fa71453bbcd35dcecab"/>
+    <w:bookmarkEnd w:id="194"/>
+    <w:bookmarkStart w:id="196" w:name="X0d0d355937664870ae38fa71453bbcd35dcecab"/>
     <w:p>
       <w:pPr>
         <w:pStyle w:val="Bibliography"/>
@@ -61031,7 +61045,7 @@
       <w:r>
         <w:t xml:space="preserve"> </w:t>
       </w:r>
-      <w:hyperlink r:id="rId194">
+      <w:hyperlink r:id="rId195">
         <w:r>
           <w:rPr>
             <w:rStyle w:val="Hyperlink"/>
@@ -61040,8 +61054,8 @@
         </w:r>
       </w:hyperlink>
     </w:p>
-    <w:bookmarkEnd w:id="195"/>
-    <w:bookmarkStart w:id="197" w:name="ref-dobson4e"/>
+    <w:bookmarkEnd w:id="196"/>
+    <w:bookmarkStart w:id="198" w:name="ref-dobson4e"/>
     <w:p>
       <w:pPr>
         <w:pStyle w:val="Bibliography"/>
@@ -61074,7 +61088,7 @@
       <w:r>
         <w:t xml:space="preserve"> </w:t>
       </w:r>
-      <w:hyperlink r:id="rId196">
+      <w:hyperlink r:id="rId197">
         <w:r>
           <w:rPr>
             <w:rStyle w:val="Hyperlink"/>
@@ -61086,9 +61100,9 @@
         <w:t xml:space="preserve">.</w:t>
       </w:r>
     </w:p>
-    <w:bookmarkEnd w:id="197"/>
     <w:bookmarkEnd w:id="198"/>
     <w:bookmarkEnd w:id="199"/>
+    <w:bookmarkEnd w:id="200"/>
     <w:sectPr>
       <w:footnotePr>
         <w:numRestart w:val="eachSect"/>

</xml_diff>